<commit_message>
modif variable parents2ndvie in templates
</commit_message>
<xml_diff>
--- a/documents/Avenant2ndeVie-Foyer-template.docx
+++ b/documents/Avenant2ndeVie-Foyer-template.docx
@@ -21,16 +21,15 @@
           <w:szCs w:val="22"/>
           <w:lang w:eastAsia="fr-FR"/>
         </w:rPr>
-        <w:t>Avenant aux conventions n</w:t>
-      </w:r>
-      <w:proofErr w:type="gramStart"/>
+        <w:t>Avenant aux conventions n°</w:t>
+      </w:r>
       <w:r>
         <w:rPr>
           <w:color w:val="000000"/>
           <w:szCs w:val="22"/>
           <w:lang w:eastAsia="fr-FR"/>
         </w:rPr>
-        <w:t>°</w:t>
+        <w:t xml:space="preserve">{% </w:t>
       </w:r>
       <w:r>
         <w:rPr>
@@ -38,16 +37,15 @@
           <w:szCs w:val="22"/>
           <w:lang w:eastAsia="fr-FR"/>
         </w:rPr>
-        <w:t>{</w:t>
-      </w:r>
-      <w:proofErr w:type="gramEnd"/>
+        <w:t xml:space="preserve">for parent in </w:t>
+      </w:r>
       <w:r>
         <w:rPr>
           <w:color w:val="000000"/>
           <w:szCs w:val="22"/>
           <w:lang w:eastAsia="fr-FR"/>
         </w:rPr>
-        <w:t xml:space="preserve">% </w:t>
+        <w:t>convention.parents_2nd_vie.all()</w:t>
       </w:r>
       <w:r>
         <w:rPr>
@@ -55,157 +53,87 @@
           <w:szCs w:val="22"/>
           <w:lang w:eastAsia="fr-FR"/>
         </w:rPr>
-        <w:t xml:space="preserve">for parent in </w:t>
-      </w:r>
-      <w:proofErr w:type="spellStart"/>
-      <w:proofErr w:type="gramStart"/>
+        <w:t xml:space="preserve"> %}{{</w:t>
+      </w:r>
       <w:r>
         <w:rPr>
           <w:color w:val="000000"/>
           <w:szCs w:val="22"/>
           <w:lang w:eastAsia="fr-FR"/>
         </w:rPr>
-        <w:t>convention.parents.all</w:t>
-      </w:r>
-      <w:proofErr w:type="spellEnd"/>
+        <w:t xml:space="preserve"> </w:t>
+      </w:r>
+      <w:proofErr w:type="spellStart"/>
       <w:r>
         <w:rPr>
           <w:color w:val="000000"/>
           <w:szCs w:val="22"/>
           <w:lang w:eastAsia="fr-FR"/>
         </w:rPr>
-        <w:t>(</w:t>
-      </w:r>
-      <w:proofErr w:type="gramEnd"/>
+        <w:t>parent</w:t>
+      </w:r>
       <w:r>
         <w:rPr>
           <w:color w:val="000000"/>
           <w:szCs w:val="22"/>
           <w:lang w:eastAsia="fr-FR"/>
         </w:rPr>
-        <w:t>)</w:t>
-      </w:r>
+        <w:t>.numero</w:t>
+      </w:r>
+      <w:proofErr w:type="spellEnd"/>
       <w:r>
         <w:rPr>
           <w:color w:val="000000"/>
           <w:szCs w:val="22"/>
           <w:lang w:eastAsia="fr-FR"/>
         </w:rPr>
+        <w:t>}}</w:t>
+      </w:r>
+      <w:r>
+        <w:rPr>
+          <w:rFonts w:cs="TimesNewRomanPSMT"/>
+        </w:rPr>
+        <w:t xml:space="preserve">{% if not </w:t>
+      </w:r>
+      <w:proofErr w:type="spellStart"/>
+      <w:r>
+        <w:rPr>
+          <w:rFonts w:cs="TimesNewRomanPSMT"/>
+        </w:rPr>
+        <w:t>loop.last</w:t>
+      </w:r>
+      <w:proofErr w:type="spellEnd"/>
+      <w:r>
+        <w:rPr>
+          <w:rFonts w:cs="TimesNewRomanPSMT"/>
+        </w:rPr>
+        <w:t xml:space="preserve"> %},</w:t>
+      </w:r>
+      <w:r>
+        <w:rPr>
+          <w:rFonts w:cs="TimesNewRomanPSMT"/>
+        </w:rPr>
         <w:t xml:space="preserve"> </w:t>
       </w:r>
-      <w:proofErr w:type="gramStart"/>
-      <w:r>
-        <w:rPr>
-          <w:color w:val="000000"/>
-          <w:szCs w:val="22"/>
-          <w:lang w:eastAsia="fr-FR"/>
-        </w:rPr>
-        <w:t>%}{{</w:t>
-      </w:r>
-      <w:r>
-        <w:rPr>
-          <w:color w:val="000000"/>
-          <w:szCs w:val="22"/>
-          <w:lang w:eastAsia="fr-FR"/>
-        </w:rPr>
-        <w:t xml:space="preserve"> </w:t>
+      <w:r>
+        <w:rPr>
+          <w:rFonts w:cs="TimesNewRomanPSMT"/>
+        </w:rPr>
+        <w:t xml:space="preserve">{% </w:t>
       </w:r>
       <w:proofErr w:type="spellStart"/>
       <w:r>
         <w:rPr>
-          <w:color w:val="000000"/>
-          <w:szCs w:val="22"/>
-          <w:lang w:eastAsia="fr-FR"/>
-        </w:rPr>
-        <w:t>parent</w:t>
-      </w:r>
-      <w:proofErr w:type="gramEnd"/>
-      <w:r>
-        <w:rPr>
-          <w:color w:val="000000"/>
-          <w:szCs w:val="22"/>
-          <w:lang w:eastAsia="fr-FR"/>
-        </w:rPr>
-        <w:t>.numero</w:t>
+          <w:rFonts w:cs="TimesNewRomanPSMT"/>
+        </w:rPr>
+        <w:t>endif</w:t>
       </w:r>
       <w:proofErr w:type="spellEnd"/>
-      <w:proofErr w:type="gramStart"/>
-      <w:r>
-        <w:rPr>
-          <w:color w:val="000000"/>
-          <w:szCs w:val="22"/>
-          <w:lang w:eastAsia="fr-FR"/>
-        </w:rPr>
-        <w:t>}}</w:t>
-      </w:r>
       <w:r>
         <w:rPr>
           <w:rFonts w:cs="TimesNewRomanPSMT"/>
         </w:rPr>
-        <w:t>{</w:t>
-      </w:r>
-      <w:proofErr w:type="gramEnd"/>
-      <w:r>
-        <w:rPr>
-          <w:rFonts w:cs="TimesNewRomanPSMT"/>
-        </w:rPr>
-        <w:t xml:space="preserve">% if not </w:t>
-      </w:r>
-      <w:proofErr w:type="spellStart"/>
-      <w:proofErr w:type="gramStart"/>
-      <w:r>
-        <w:rPr>
-          <w:rFonts w:cs="TimesNewRomanPSMT"/>
-        </w:rPr>
-        <w:t>loop.last</w:t>
-      </w:r>
-      <w:proofErr w:type="spellEnd"/>
-      <w:proofErr w:type="gramEnd"/>
-      <w:r>
-        <w:rPr>
-          <w:rFonts w:cs="TimesNewRomanPSMT"/>
-        </w:rPr>
-        <w:t xml:space="preserve"> %},</w:t>
-      </w:r>
-      <w:r>
-        <w:rPr>
-          <w:rFonts w:cs="TimesNewRomanPSMT"/>
-        </w:rPr>
-        <w:t xml:space="preserve"> </w:t>
-      </w:r>
-      <w:r>
-        <w:rPr>
-          <w:rFonts w:cs="TimesNewRomanPSMT"/>
-        </w:rPr>
-        <w:t xml:space="preserve">{% </w:t>
-      </w:r>
-      <w:proofErr w:type="spellStart"/>
-      <w:r>
-        <w:rPr>
-          <w:rFonts w:cs="TimesNewRomanPSMT"/>
-        </w:rPr>
-        <w:t>endif</w:t>
-      </w:r>
-      <w:proofErr w:type="spellEnd"/>
-      <w:r>
-        <w:rPr>
-          <w:rFonts w:cs="TimesNewRomanPSMT"/>
-        </w:rPr>
-        <w:t xml:space="preserve"> </w:t>
-      </w:r>
-      <w:proofErr w:type="gramStart"/>
-      <w:r>
-        <w:rPr>
-          <w:rFonts w:cs="TimesNewRomanPSMT"/>
-        </w:rPr>
-        <w:t>%}{</w:t>
-      </w:r>
-      <w:proofErr w:type="gramEnd"/>
-      <w:r>
-        <w:rPr>
-          <w:rFonts w:cs="TimesNewRomanPSMT"/>
-        </w:rPr>
-        <w:t xml:space="preserve">% </w:t>
+        <w:t xml:space="preserve"> %}{% </w:t>
       </w:r>
       <w:proofErr w:type="spellStart"/>
       <w:r>
@@ -287,16 +215,15 @@
           <w:szCs w:val="22"/>
           <w:lang w:eastAsia="fr-FR"/>
         </w:rPr>
-        <w:t>Les conventions n</w:t>
-      </w:r>
-      <w:proofErr w:type="gramStart"/>
+        <w:t>Les conventions n°</w:t>
+      </w:r>
       <w:r>
         <w:rPr>
           <w:color w:val="000000"/>
           <w:szCs w:val="22"/>
           <w:lang w:eastAsia="fr-FR"/>
         </w:rPr>
-        <w:t>°</w:t>
+        <w:t xml:space="preserve">{% </w:t>
       </w:r>
       <w:r>
         <w:rPr>
@@ -304,16 +231,15 @@
           <w:szCs w:val="22"/>
           <w:lang w:eastAsia="fr-FR"/>
         </w:rPr>
-        <w:t>{</w:t>
-      </w:r>
-      <w:proofErr w:type="gramEnd"/>
+        <w:t xml:space="preserve">for parent in </w:t>
+      </w:r>
       <w:r>
         <w:rPr>
           <w:color w:val="000000"/>
           <w:szCs w:val="22"/>
           <w:lang w:eastAsia="fr-FR"/>
         </w:rPr>
-        <w:t xml:space="preserve">% </w:t>
+        <w:t>convention.parents_2nd_vie.all()</w:t>
       </w:r>
       <w:r>
         <w:rPr>
@@ -321,52 +247,109 @@
           <w:szCs w:val="22"/>
           <w:lang w:eastAsia="fr-FR"/>
         </w:rPr>
-        <w:t xml:space="preserve">for parent in </w:t>
-      </w:r>
-      <w:proofErr w:type="spellStart"/>
-      <w:proofErr w:type="gramStart"/>
+        <w:t xml:space="preserve"> %}{{</w:t>
+      </w:r>
       <w:r>
         <w:rPr>
           <w:color w:val="000000"/>
           <w:szCs w:val="22"/>
           <w:lang w:eastAsia="fr-FR"/>
         </w:rPr>
-        <w:t>convention.parents.all</w:t>
-      </w:r>
-      <w:proofErr w:type="spellEnd"/>
+        <w:t xml:space="preserve"> </w:t>
+      </w:r>
+      <w:proofErr w:type="spellStart"/>
       <w:r>
         <w:rPr>
           <w:color w:val="000000"/>
           <w:szCs w:val="22"/>
           <w:lang w:eastAsia="fr-FR"/>
         </w:rPr>
-        <w:t>(</w:t>
-      </w:r>
-      <w:proofErr w:type="gramEnd"/>
+        <w:t>parent</w:t>
+      </w:r>
       <w:r>
         <w:rPr>
           <w:color w:val="000000"/>
           <w:szCs w:val="22"/>
           <w:lang w:eastAsia="fr-FR"/>
         </w:rPr>
-        <w:t>)</w:t>
-      </w:r>
+        <w:t>.numero</w:t>
+      </w:r>
+      <w:proofErr w:type="spellEnd"/>
       <w:r>
         <w:rPr>
           <w:color w:val="000000"/>
           <w:szCs w:val="22"/>
           <w:lang w:eastAsia="fr-FR"/>
         </w:rPr>
+        <w:t>}}</w:t>
+      </w:r>
+      <w:r>
+        <w:rPr>
+          <w:rFonts w:cs="TimesNewRomanPSMT"/>
+        </w:rPr>
+        <w:t xml:space="preserve">{% if not </w:t>
+      </w:r>
+      <w:proofErr w:type="spellStart"/>
+      <w:r>
+        <w:rPr>
+          <w:rFonts w:cs="TimesNewRomanPSMT"/>
+        </w:rPr>
+        <w:t>loop.last</w:t>
+      </w:r>
+      <w:proofErr w:type="spellEnd"/>
+      <w:r>
+        <w:rPr>
+          <w:rFonts w:cs="TimesNewRomanPSMT"/>
+        </w:rPr>
+        <w:t xml:space="preserve"> %},</w:t>
+      </w:r>
+      <w:r>
+        <w:rPr>
+          <w:rFonts w:cs="TimesNewRomanPSMT"/>
+        </w:rPr>
         <w:t xml:space="preserve"> </w:t>
       </w:r>
-      <w:proofErr w:type="gramStart"/>
+      <w:r>
+        <w:rPr>
+          <w:rFonts w:cs="TimesNewRomanPSMT"/>
+        </w:rPr>
+        <w:t xml:space="preserve">{% </w:t>
+      </w:r>
+      <w:proofErr w:type="spellStart"/>
+      <w:r>
+        <w:rPr>
+          <w:rFonts w:cs="TimesNewRomanPSMT"/>
+        </w:rPr>
+        <w:t>endif</w:t>
+      </w:r>
+      <w:proofErr w:type="spellEnd"/>
+      <w:r>
+        <w:rPr>
+          <w:rFonts w:cs="TimesNewRomanPSMT"/>
+        </w:rPr>
+        <w:t xml:space="preserve"> %}{% </w:t>
+      </w:r>
+      <w:proofErr w:type="spellStart"/>
+      <w:r>
+        <w:rPr>
+          <w:rFonts w:cs="TimesNewRomanPSMT"/>
+        </w:rPr>
+        <w:t>endfor</w:t>
+      </w:r>
+      <w:proofErr w:type="spellEnd"/>
+      <w:r>
+        <w:rPr>
+          <w:rFonts w:cs="TimesNewRomanPSMT"/>
+        </w:rPr>
+        <w:t xml:space="preserve"> %}</w:t>
+      </w:r>
       <w:r>
         <w:rPr>
           <w:color w:val="000000"/>
           <w:szCs w:val="22"/>
           <w:lang w:eastAsia="fr-FR"/>
         </w:rPr>
-        <w:t>%}{{</w:t>
+        <w:t xml:space="preserve"> sont modifiées à l'issue des travaux réalisés dans le cadre de l'opération de réhabilitation "seconde vie" n°</w:t>
       </w:r>
       <w:r>
         <w:rPr>
@@ -374,7 +357,7 @@
           <w:szCs w:val="22"/>
           <w:lang w:eastAsia="fr-FR"/>
         </w:rPr>
-        <w:t xml:space="preserve"> </w:t>
+        <w:t>{{</w:t>
       </w:r>
       <w:proofErr w:type="spellStart"/>
       <w:r>
@@ -383,171 +366,24 @@
           <w:szCs w:val="22"/>
           <w:lang w:eastAsia="fr-FR"/>
         </w:rPr>
-        <w:t>parent</w:t>
-      </w:r>
-      <w:proofErr w:type="gramEnd"/>
+        <w:t>convention.programme.numero_operation</w:t>
+      </w:r>
+      <w:proofErr w:type="spellEnd"/>
       <w:r>
         <w:rPr>
           <w:color w:val="000000"/>
           <w:szCs w:val="22"/>
           <w:lang w:eastAsia="fr-FR"/>
         </w:rPr>
-        <w:t>.numero</w:t>
-      </w:r>
-      <w:proofErr w:type="spellEnd"/>
-      <w:proofErr w:type="gramStart"/>
+        <w:t>}}</w:t>
+      </w:r>
       <w:r>
         <w:rPr>
           <w:color w:val="000000"/>
           <w:szCs w:val="22"/>
           <w:lang w:eastAsia="fr-FR"/>
         </w:rPr>
-        <w:t>}}</w:t>
-      </w:r>
-      <w:r>
-        <w:rPr>
-          <w:rFonts w:cs="TimesNewRomanPSMT"/>
-        </w:rPr>
-        <w:t>{</w:t>
-      </w:r>
-      <w:proofErr w:type="gramEnd"/>
-      <w:r>
-        <w:rPr>
-          <w:rFonts w:cs="TimesNewRomanPSMT"/>
-        </w:rPr>
-        <w:t xml:space="preserve">% if not </w:t>
-      </w:r>
-      <w:proofErr w:type="spellStart"/>
-      <w:proofErr w:type="gramStart"/>
-      <w:r>
-        <w:rPr>
-          <w:rFonts w:cs="TimesNewRomanPSMT"/>
-        </w:rPr>
-        <w:t>loop.last</w:t>
-      </w:r>
-      <w:proofErr w:type="spellEnd"/>
-      <w:proofErr w:type="gramEnd"/>
-      <w:r>
-        <w:rPr>
-          <w:rFonts w:cs="TimesNewRomanPSMT"/>
-        </w:rPr>
-        <w:t xml:space="preserve"> %},</w:t>
-      </w:r>
-      <w:r>
-        <w:rPr>
-          <w:rFonts w:cs="TimesNewRomanPSMT"/>
-        </w:rPr>
-        <w:t xml:space="preserve"> </w:t>
-      </w:r>
-      <w:r>
-        <w:rPr>
-          <w:rFonts w:cs="TimesNewRomanPSMT"/>
-        </w:rPr>
-        <w:t xml:space="preserve">{% </w:t>
-      </w:r>
-      <w:proofErr w:type="spellStart"/>
-      <w:r>
-        <w:rPr>
-          <w:rFonts w:cs="TimesNewRomanPSMT"/>
-        </w:rPr>
-        <w:t>endif</w:t>
-      </w:r>
-      <w:proofErr w:type="spellEnd"/>
-      <w:r>
-        <w:rPr>
-          <w:rFonts w:cs="TimesNewRomanPSMT"/>
-        </w:rPr>
-        <w:t xml:space="preserve"> </w:t>
-      </w:r>
-      <w:proofErr w:type="gramStart"/>
-      <w:r>
-        <w:rPr>
-          <w:rFonts w:cs="TimesNewRomanPSMT"/>
-        </w:rPr>
-        <w:t>%}{</w:t>
-      </w:r>
-      <w:proofErr w:type="gramEnd"/>
-      <w:r>
-        <w:rPr>
-          <w:rFonts w:cs="TimesNewRomanPSMT"/>
-        </w:rPr>
-        <w:t xml:space="preserve">% </w:t>
-      </w:r>
-      <w:proofErr w:type="spellStart"/>
-      <w:r>
-        <w:rPr>
-          <w:rFonts w:cs="TimesNewRomanPSMT"/>
-        </w:rPr>
-        <w:t>endfor</w:t>
-      </w:r>
-      <w:proofErr w:type="spellEnd"/>
-      <w:r>
-        <w:rPr>
-          <w:rFonts w:cs="TimesNewRomanPSMT"/>
-        </w:rPr>
-        <w:t xml:space="preserve"> %}</w:t>
-      </w:r>
-      <w:r>
-        <w:rPr>
-          <w:color w:val="000000"/>
-          <w:szCs w:val="22"/>
-          <w:lang w:eastAsia="fr-FR"/>
-        </w:rPr>
-        <w:t xml:space="preserve"> sont modifiées à l'issue des travaux réalisés dans le cadre de l'opération de réhabilitation "seconde vie" n°</w:t>
-      </w:r>
-      <w:r>
-        <w:rPr>
-          <w:color w:val="000000"/>
-          <w:szCs w:val="22"/>
-          <w:lang w:eastAsia="fr-FR"/>
-        </w:rPr>
-        <w:t>{{</w:t>
-      </w:r>
-      <w:proofErr w:type="spellStart"/>
-      <w:proofErr w:type="gramStart"/>
-      <w:r>
-        <w:rPr>
-          <w:color w:val="000000"/>
-          <w:szCs w:val="22"/>
-          <w:lang w:eastAsia="fr-FR"/>
-        </w:rPr>
-        <w:t>convention.programme</w:t>
-      </w:r>
-      <w:proofErr w:type="gramEnd"/>
-      <w:r>
-        <w:rPr>
-          <w:color w:val="000000"/>
-          <w:szCs w:val="22"/>
-          <w:lang w:eastAsia="fr-FR"/>
-        </w:rPr>
-        <w:t>.numero_operation</w:t>
-      </w:r>
-      <w:proofErr w:type="spellEnd"/>
-      <w:proofErr w:type="gramStart"/>
-      <w:r>
-        <w:rPr>
-          <w:color w:val="000000"/>
-          <w:szCs w:val="22"/>
-          <w:lang w:eastAsia="fr-FR"/>
-        </w:rPr>
-        <w:t>}}</w:t>
-      </w:r>
-      <w:r>
-        <w:rPr>
-          <w:color w:val="000000"/>
-          <w:szCs w:val="22"/>
-          <w:lang w:eastAsia="fr-FR"/>
-        </w:rPr>
-        <w:t xml:space="preserve">  par</w:t>
-      </w:r>
-      <w:proofErr w:type="gramEnd"/>
-      <w:r>
-        <w:rPr>
-          <w:color w:val="000000"/>
-          <w:szCs w:val="22"/>
-          <w:lang w:eastAsia="fr-FR"/>
-        </w:rPr>
-        <w:t xml:space="preserve"> les dispositions de ce présent avenant et de ses annexes</w:t>
+        <w:t xml:space="preserve">  par les dispositions de ce présent avenant et de ses annexes</w:t>
       </w:r>
     </w:p>
     <w:p>
@@ -654,7 +490,6 @@
         </w:rPr>
         <w:t xml:space="preserve">Les conventions expirent le </w:t>
       </w:r>
-      <w:proofErr w:type="gramStart"/>
       <w:r>
         <w:rPr>
           <w:rFonts w:cs="TimesNewRomanPSMT"/>
@@ -666,35 +501,14 @@
         <w:rPr>
           <w:rFonts w:cs="TimesNewRomanPSMT"/>
         </w:rPr>
-        <w:t>convention</w:t>
-      </w:r>
-      <w:proofErr w:type="gramEnd"/>
+        <w:t>convention.date_fin_conventionnement|d</w:t>
+      </w:r>
+      <w:proofErr w:type="spellEnd"/>
       <w:r>
         <w:rPr>
           <w:rFonts w:cs="TimesNewRomanPSMT"/>
         </w:rPr>
-        <w:t>.date_fin_conventionnement|</w:t>
-      </w:r>
-      <w:proofErr w:type="gramStart"/>
-      <w:r>
-        <w:rPr>
-          <w:rFonts w:cs="TimesNewRomanPSMT"/>
-        </w:rPr>
-        <w:t>d</w:t>
-      </w:r>
-      <w:proofErr w:type="spellEnd"/>
-      <w:r>
-        <w:rPr>
-          <w:rFonts w:cs="TimesNewRomanPSMT"/>
-        </w:rPr>
-        <w:t xml:space="preserve"> }</w:t>
-      </w:r>
-      <w:proofErr w:type="gramEnd"/>
-      <w:r>
-        <w:rPr>
-          <w:rFonts w:cs="TimesNewRomanPSMT"/>
-        </w:rPr>
-        <w:t>}</w:t>
+        <w:t xml:space="preserve"> }}</w:t>
       </w:r>
     </w:p>
     <w:p>
@@ -723,7 +537,6 @@
           <w:bCs/>
         </w:rPr>
       </w:pPr>
-      <w:proofErr w:type="gramStart"/>
       <w:r>
         <w:rPr>
           <w:b/>
@@ -736,15 +549,7 @@
           <w:b/>
           <w:bCs/>
         </w:rPr>
-        <w:t>axima applicables</w:t>
-      </w:r>
-      <w:proofErr w:type="gramEnd"/>
-      <w:r>
-        <w:rPr>
-          <w:b/>
-          <w:bCs/>
-        </w:rPr>
-        <w:t xml:space="preserve"> à la part de la redevance assimilable au loyer et aux charges locatives récupérables</w:t>
+        <w:t>axima applicables à la part de la redevance assimilable au loyer et aux charges locatives récupérables</w:t>
       </w:r>
       <w:r>
         <w:rPr>
@@ -1164,28 +969,14 @@
         <w:rPr>
           <w:color w:val="000000"/>
         </w:rPr>
-        <w:t>administration.get_ville_signature_or_</w:t>
-      </w:r>
-      <w:proofErr w:type="gramStart"/>
-      <w:r>
-        <w:rPr>
-          <w:color w:val="000000"/>
-        </w:rPr>
-        <w:t>empty</w:t>
+        <w:t>administration.get_ville_signature_or_empty</w:t>
       </w:r>
       <w:proofErr w:type="spellEnd"/>
       <w:r>
         <w:rPr>
           <w:color w:val="000000"/>
         </w:rPr>
-        <w:t>() }</w:t>
-      </w:r>
-      <w:proofErr w:type="gramEnd"/>
-      <w:r>
-        <w:rPr>
-          <w:color w:val="000000"/>
-        </w:rPr>
-        <w:t>}, le</w:t>
+        <w:t>() }}, le</w:t>
       </w:r>
     </w:p>
     <w:p>
@@ -1209,85 +1000,35 @@
         <w:rPr>
           <w:color w:val="000000"/>
         </w:rPr>
-        <w:t>Le propriétaire (6), {</w:t>
-      </w:r>
-      <w:proofErr w:type="gramStart"/>
-      <w:r>
-        <w:rPr>
-          <w:color w:val="000000"/>
-        </w:rPr>
-        <w:t>%  if</w:t>
-      </w:r>
-      <w:proofErr w:type="gramEnd"/>
-      <w:r>
-        <w:rPr>
-          <w:color w:val="000000"/>
-        </w:rPr>
-        <w:t xml:space="preserve"> </w:t>
+        <w:t xml:space="preserve">Le propriétaire (6), {%  if </w:t>
       </w:r>
       <w:proofErr w:type="spellStart"/>
-      <w:proofErr w:type="gramStart"/>
-      <w:r>
-        <w:rPr>
-          <w:color w:val="000000"/>
-        </w:rPr>
-        <w:t>convention.signataire</w:t>
-      </w:r>
-      <w:proofErr w:type="gramEnd"/>
-      <w:r>
-        <w:rPr>
-          <w:color w:val="000000"/>
-        </w:rPr>
-        <w:t>_bloc_signature</w:t>
+      <w:r>
+        <w:rPr>
+          <w:color w:val="000000"/>
+        </w:rPr>
+        <w:t>convention.signataire_bloc_signature</w:t>
       </w:r>
       <w:proofErr w:type="spellEnd"/>
       <w:r>
         <w:rPr>
           <w:color w:val="000000"/>
         </w:rPr>
-        <w:t xml:space="preserve"> </w:t>
-      </w:r>
-      <w:proofErr w:type="gramStart"/>
-      <w:r>
-        <w:rPr>
-          <w:color w:val="000000"/>
-        </w:rPr>
-        <w:t xml:space="preserve">%}{{ </w:t>
+        <w:t xml:space="preserve"> %}{{ </w:t>
       </w:r>
       <w:proofErr w:type="spellStart"/>
       <w:r>
         <w:rPr>
           <w:color w:val="000000"/>
         </w:rPr>
-        <w:t>convention</w:t>
-      </w:r>
-      <w:proofErr w:type="gramEnd"/>
-      <w:r>
-        <w:rPr>
-          <w:color w:val="000000"/>
-        </w:rPr>
-        <w:t>.signataire_bloc_signature|default_empty_if_</w:t>
-      </w:r>
-      <w:proofErr w:type="gramStart"/>
-      <w:r>
-        <w:rPr>
-          <w:color w:val="000000"/>
-        </w:rPr>
-        <w:t>none</w:t>
+        <w:t>convention.signataire_bloc_signature|default_empty_if_none</w:t>
       </w:r>
       <w:proofErr w:type="spellEnd"/>
       <w:r>
         <w:rPr>
           <w:color w:val="000000"/>
         </w:rPr>
-        <w:t xml:space="preserve"> }}{</w:t>
-      </w:r>
-      <w:proofErr w:type="gramEnd"/>
-      <w:r>
-        <w:rPr>
-          <w:color w:val="000000"/>
-        </w:rPr>
-        <w:t xml:space="preserve">% </w:t>
+        <w:t xml:space="preserve"> }}{% </w:t>
       </w:r>
       <w:proofErr w:type="spellStart"/>
       <w:r>
@@ -1301,49 +1042,21 @@
         <w:rPr>
           <w:color w:val="000000"/>
         </w:rPr>
-        <w:t xml:space="preserve"> %} </w:t>
-      </w:r>
-      <w:proofErr w:type="gramStart"/>
-      <w:r>
-        <w:rPr>
-          <w:color w:val="000000"/>
-        </w:rPr>
-        <w:t xml:space="preserve">{{ </w:t>
+        <w:t xml:space="preserve"> %} {{ </w:t>
       </w:r>
       <w:proofErr w:type="spellStart"/>
       <w:r>
         <w:rPr>
           <w:color w:val="000000"/>
         </w:rPr>
-        <w:t>bailleur</w:t>
-      </w:r>
-      <w:proofErr w:type="gramEnd"/>
-      <w:r>
-        <w:rPr>
-          <w:color w:val="000000"/>
-        </w:rPr>
-        <w:t>.signataire_bloc_signature|default_empty_if_</w:t>
-      </w:r>
-      <w:proofErr w:type="gramStart"/>
-      <w:r>
-        <w:rPr>
-          <w:color w:val="000000"/>
-        </w:rPr>
-        <w:t>none</w:t>
+        <w:t>bailleur.signataire_bloc_signature|default_empty_if_none</w:t>
       </w:r>
       <w:proofErr w:type="spellEnd"/>
       <w:r>
         <w:rPr>
           <w:color w:val="000000"/>
         </w:rPr>
-        <w:t xml:space="preserve"> }}{</w:t>
-      </w:r>
-      <w:proofErr w:type="gramEnd"/>
-      <w:r>
-        <w:rPr>
-          <w:color w:val="000000"/>
-        </w:rPr>
-        <w:t xml:space="preserve">% </w:t>
+        <w:t xml:space="preserve"> }}{% </w:t>
       </w:r>
       <w:proofErr w:type="spellStart"/>
       <w:r>
@@ -1408,35 +1121,7 @@
         <w:rPr>
           <w:color w:val="000000"/>
         </w:rPr>
-        <w:t xml:space="preserve">Le gestionnaire (6), </w:t>
-      </w:r>
-      <w:proofErr w:type="gramStart"/>
-      <w:r>
-        <w:rPr>
-          <w:color w:val="000000"/>
-        </w:rPr>
-        <w:t>{{ convention</w:t>
-      </w:r>
-      <w:proofErr w:type="gramEnd"/>
-      <w:r>
-        <w:rPr>
-          <w:color w:val="000000"/>
-        </w:rPr>
-        <w:t>.gestionnaire_signataire_bloc_signature|default_empty_if_</w:t>
-      </w:r>
-      <w:proofErr w:type="gramStart"/>
-      <w:r>
-        <w:rPr>
-          <w:color w:val="000000"/>
-        </w:rPr>
-        <w:t>none }</w:t>
-      </w:r>
-      <w:proofErr w:type="gramEnd"/>
-      <w:r>
-        <w:rPr>
-          <w:color w:val="000000"/>
-        </w:rPr>
-        <w:t>}</w:t>
+        <w:t>Le gestionnaire (6), {{ convention.gestionnaire_signataire_bloc_signature|default_empty_if_none }}</w:t>
       </w:r>
     </w:p>
     <w:p>
@@ -1507,147 +1192,55 @@
         <w:rPr>
           <w:shd w:val="clear" w:color="auto" w:fill="FFFFFF"/>
         </w:rPr>
-        <w:t xml:space="preserve"> </w:t>
-      </w:r>
-      <w:proofErr w:type="gramStart"/>
+        <w:t xml:space="preserve"> %}le président du conseil départemental de Guadeloupe, de La Réunion, de Mayotte, de l'assemblée de Guyane, du conseil exécutif de Martinique{% </w:t>
+      </w:r>
+      <w:proofErr w:type="spellStart"/>
       <w:r>
         <w:rPr>
           <w:shd w:val="clear" w:color="auto" w:fill="FFFFFF"/>
         </w:rPr>
-        <w:t>%}le</w:t>
-      </w:r>
-      <w:proofErr w:type="gramEnd"/>
+        <w:t>else</w:t>
+      </w:r>
+      <w:proofErr w:type="spellEnd"/>
       <w:r>
         <w:rPr>
           <w:shd w:val="clear" w:color="auto" w:fill="FFFFFF"/>
         </w:rPr>
-        <w:t xml:space="preserve"> président du conseil départemental de Guadeloupe, de La Réunion, de Mayotte, de l'assemblée de Guyane, du conseil exécutif de </w:t>
-      </w:r>
-      <w:proofErr w:type="gramStart"/>
+        <w:t xml:space="preserve"> %}du conseil départemental, de la métropole de Lyon, de la métropole du Grand Paris, de la métropole d’Aix-Marseille-Provence, ou du conseil exécutif de Corse,{% </w:t>
+      </w:r>
+      <w:proofErr w:type="spellStart"/>
       <w:r>
         <w:rPr>
           <w:shd w:val="clear" w:color="auto" w:fill="FFFFFF"/>
         </w:rPr>
-        <w:t>Martinique{</w:t>
-      </w:r>
-      <w:proofErr w:type="gramEnd"/>
+        <w:t>endif</w:t>
+      </w:r>
+      <w:proofErr w:type="spellEnd"/>
       <w:r>
         <w:rPr>
           <w:shd w:val="clear" w:color="auto" w:fill="FFFFFF"/>
         </w:rPr>
-        <w:t xml:space="preserve">% </w:t>
+        <w:t xml:space="preserve">  %}</w:t>
+      </w:r>
+      <w:r>
+        <w:rPr>
+          <w:color w:val="000000"/>
+        </w:rPr>
+        <w:t xml:space="preserve"> {{ </w:t>
       </w:r>
       <w:proofErr w:type="spellStart"/>
       <w:r>
         <w:rPr>
-          <w:shd w:val="clear" w:color="auto" w:fill="FFFFFF"/>
-        </w:rPr>
-        <w:t>else</w:t>
+          <w:color w:val="000000"/>
+        </w:rPr>
+        <w:t>administration.signataire_bloc_signature|default_empty_if_none</w:t>
       </w:r>
       <w:proofErr w:type="spellEnd"/>
       <w:r>
         <w:rPr>
-          <w:shd w:val="clear" w:color="auto" w:fill="FFFFFF"/>
-        </w:rPr>
-        <w:t xml:space="preserve"> </w:t>
-      </w:r>
-      <w:proofErr w:type="gramStart"/>
-      <w:r>
-        <w:rPr>
-          <w:shd w:val="clear" w:color="auto" w:fill="FFFFFF"/>
-        </w:rPr>
-        <w:t>%}du</w:t>
-      </w:r>
-      <w:proofErr w:type="gramEnd"/>
-      <w:r>
-        <w:rPr>
-          <w:shd w:val="clear" w:color="auto" w:fill="FFFFFF"/>
-        </w:rPr>
-        <w:t xml:space="preserve"> conseil départemental, de la métropole de Lyon, de la métropole du Grand Paris, de la métropole d’Aix-Marseille-Provence, ou du conseil exécutif de </w:t>
-      </w:r>
-      <w:proofErr w:type="gramStart"/>
-      <w:r>
-        <w:rPr>
-          <w:shd w:val="clear" w:color="auto" w:fill="FFFFFF"/>
-        </w:rPr>
-        <w:t>Corse,{</w:t>
-      </w:r>
-      <w:proofErr w:type="gramEnd"/>
-      <w:r>
-        <w:rPr>
-          <w:shd w:val="clear" w:color="auto" w:fill="FFFFFF"/>
-        </w:rPr>
-        <w:t xml:space="preserve">% </w:t>
-      </w:r>
-      <w:proofErr w:type="spellStart"/>
-      <w:proofErr w:type="gramStart"/>
-      <w:r>
-        <w:rPr>
-          <w:shd w:val="clear" w:color="auto" w:fill="FFFFFF"/>
-        </w:rPr>
-        <w:t>endif</w:t>
-      </w:r>
-      <w:proofErr w:type="spellEnd"/>
-      <w:r>
-        <w:rPr>
-          <w:shd w:val="clear" w:color="auto" w:fill="FFFFFF"/>
-        </w:rPr>
-        <w:t xml:space="preserve">  %</w:t>
-      </w:r>
-      <w:proofErr w:type="gramEnd"/>
-      <w:r>
-        <w:rPr>
-          <w:shd w:val="clear" w:color="auto" w:fill="FFFFFF"/>
-        </w:rPr>
-        <w:t>}</w:t>
-      </w:r>
-      <w:r>
-        <w:rPr>
-          <w:color w:val="000000"/>
-        </w:rPr>
-        <w:t xml:space="preserve"> </w:t>
-      </w:r>
-      <w:proofErr w:type="gramStart"/>
-      <w:r>
-        <w:rPr>
-          <w:color w:val="000000"/>
-        </w:rPr>
-        <w:t xml:space="preserve">{{ </w:t>
-      </w:r>
-      <w:proofErr w:type="spellStart"/>
-      <w:r>
-        <w:rPr>
-          <w:color w:val="000000"/>
-        </w:rPr>
-        <w:t>administration</w:t>
-      </w:r>
-      <w:proofErr w:type="gramEnd"/>
-      <w:r>
-        <w:rPr>
-          <w:color w:val="000000"/>
-        </w:rPr>
-        <w:t>.signataire_bloc_signature|default_empty_if_</w:t>
-      </w:r>
-      <w:proofErr w:type="gramStart"/>
-      <w:r>
-        <w:rPr>
-          <w:color w:val="000000"/>
-        </w:rPr>
-        <w:t>none</w:t>
-      </w:r>
-      <w:proofErr w:type="spellEnd"/>
-      <w:r>
-        <w:rPr>
-          <w:color w:val="000000"/>
-        </w:rPr>
-        <w:t xml:space="preserve"> }</w:t>
-      </w:r>
-      <w:proofErr w:type="gramEnd"/>
-      <w:r>
-        <w:rPr>
-          <w:color w:val="000000"/>
-        </w:rPr>
-        <w:t>}</w:t>
+          <w:color w:val="000000"/>
+        </w:rPr>
+        <w:t xml:space="preserve"> }}</w:t>
       </w:r>
     </w:p>
     <w:p>
@@ -1697,8 +1290,6 @@
         </w:rPr>
         <w:t xml:space="preserve">{% for parent in </w:t>
       </w:r>
-      <w:proofErr w:type="spellStart"/>
-      <w:proofErr w:type="gramStart"/>
       <w:r>
         <w:rPr>
           <w:b/>
@@ -1707,9 +1298,8 @@
           <w:szCs w:val="22"/>
           <w:lang w:eastAsia="fr-FR"/>
         </w:rPr>
-        <w:t>convention.parents.all</w:t>
-      </w:r>
-      <w:proofErr w:type="spellEnd"/>
+        <w:t>convention.parents_2nd_vie.all()</w:t>
+      </w:r>
       <w:r>
         <w:rPr>
           <w:b/>
@@ -1718,9 +1308,9 @@
           <w:szCs w:val="22"/>
           <w:lang w:eastAsia="fr-FR"/>
         </w:rPr>
-        <w:t>(</w:t>
-      </w:r>
-      <w:proofErr w:type="gramEnd"/>
+        <w:t xml:space="preserve"> %}{{ </w:t>
+      </w:r>
+      <w:proofErr w:type="spellStart"/>
       <w:r>
         <w:rPr>
           <w:b/>
@@ -1729,43 +1319,9 @@
           <w:szCs w:val="22"/>
           <w:lang w:eastAsia="fr-FR"/>
         </w:rPr>
-        <w:t xml:space="preserve">) </w:t>
-      </w:r>
-      <w:proofErr w:type="gramStart"/>
-      <w:r>
-        <w:rPr>
-          <w:b/>
-          <w:bCs/>
-          <w:color w:val="000000"/>
-          <w:szCs w:val="22"/>
-          <w:lang w:eastAsia="fr-FR"/>
-        </w:rPr>
-        <w:t xml:space="preserve">%}{{ </w:t>
-      </w:r>
-      <w:proofErr w:type="spellStart"/>
-      <w:r>
-        <w:rPr>
-          <w:b/>
-          <w:bCs/>
-          <w:color w:val="000000"/>
-          <w:szCs w:val="22"/>
-          <w:lang w:eastAsia="fr-FR"/>
-        </w:rPr>
-        <w:t>parent</w:t>
-      </w:r>
-      <w:proofErr w:type="gramEnd"/>
-      <w:r>
-        <w:rPr>
-          <w:b/>
-          <w:bCs/>
-          <w:color w:val="000000"/>
-          <w:szCs w:val="22"/>
-          <w:lang w:eastAsia="fr-FR"/>
-        </w:rPr>
-        <w:t>.numero</w:t>
+        <w:t>parent.numero</w:t>
       </w:r>
       <w:proofErr w:type="spellEnd"/>
-      <w:proofErr w:type="gramStart"/>
       <w:r>
         <w:rPr>
           <w:b/>
@@ -1782,72 +1338,43 @@
           <w:b/>
           <w:bCs/>
         </w:rPr>
-        <w:t>{</w:t>
-      </w:r>
-      <w:proofErr w:type="gramEnd"/>
+        <w:t xml:space="preserve">{% if not </w:t>
+      </w:r>
+      <w:proofErr w:type="spellStart"/>
       <w:r>
         <w:rPr>
           <w:rFonts w:cs="TimesNewRomanPSMT"/>
           <w:b/>
           <w:bCs/>
         </w:rPr>
-        <w:t xml:space="preserve">% if not </w:t>
-      </w:r>
-      <w:proofErr w:type="spellStart"/>
-      <w:proofErr w:type="gramStart"/>
+        <w:t>loop.last</w:t>
+      </w:r>
+      <w:proofErr w:type="spellEnd"/>
       <w:r>
         <w:rPr>
           <w:rFonts w:cs="TimesNewRomanPSMT"/>
           <w:b/>
           <w:bCs/>
         </w:rPr>
-        <w:t>loop.last</w:t>
-      </w:r>
-      <w:proofErr w:type="spellEnd"/>
-      <w:proofErr w:type="gramEnd"/>
+        <w:t xml:space="preserve"> %}, {% </w:t>
+      </w:r>
+      <w:proofErr w:type="spellStart"/>
       <w:r>
         <w:rPr>
           <w:rFonts w:cs="TimesNewRomanPSMT"/>
           <w:b/>
           <w:bCs/>
         </w:rPr>
-        <w:t xml:space="preserve"> %}, {% </w:t>
-      </w:r>
-      <w:proofErr w:type="spellStart"/>
+        <w:t>endif</w:t>
+      </w:r>
+      <w:proofErr w:type="spellEnd"/>
       <w:r>
         <w:rPr>
           <w:rFonts w:cs="TimesNewRomanPSMT"/>
           <w:b/>
           <w:bCs/>
         </w:rPr>
-        <w:t>endif</w:t>
-      </w:r>
-      <w:proofErr w:type="spellEnd"/>
-      <w:r>
-        <w:rPr>
-          <w:rFonts w:cs="TimesNewRomanPSMT"/>
-          <w:b/>
-          <w:bCs/>
-        </w:rPr>
-        <w:t xml:space="preserve"> </w:t>
-      </w:r>
-      <w:proofErr w:type="gramStart"/>
-      <w:r>
-        <w:rPr>
-          <w:rFonts w:cs="TimesNewRomanPSMT"/>
-          <w:b/>
-          <w:bCs/>
-        </w:rPr>
-        <w:t>%}{</w:t>
-      </w:r>
-      <w:proofErr w:type="gramEnd"/>
-      <w:r>
-        <w:rPr>
-          <w:rFonts w:cs="TimesNewRomanPSMT"/>
-          <w:b/>
-          <w:bCs/>
-        </w:rPr>
-        <w:t xml:space="preserve">% </w:t>
+        <w:t xml:space="preserve"> %}{% </w:t>
       </w:r>
       <w:proofErr w:type="spellStart"/>
       <w:r>
@@ -1990,14 +1517,7 @@
         <w:rPr>
           <w:color w:val="000000"/>
         </w:rPr>
-        <w:t xml:space="preserve">Surface habitable totale </w:t>
-      </w:r>
-      <w:proofErr w:type="gramStart"/>
-      <w:r>
-        <w:rPr>
-          <w:color w:val="000000"/>
-        </w:rPr>
-        <w:t>:  {{</w:t>
+        <w:t>Surface habitable totale :  {{</w:t>
       </w:r>
       <w:r>
         <w:rPr>
@@ -2014,14 +1534,7 @@
         <w:rPr>
           <w:color w:val="000000"/>
         </w:rPr>
-        <w:t>surface</w:t>
-      </w:r>
-      <w:proofErr w:type="gramEnd"/>
-      <w:r>
-        <w:rPr>
-          <w:color w:val="000000"/>
-        </w:rPr>
-        <w:t>_habitable_totale</w:t>
+        <w:t>surface_habitable_totale</w:t>
       </w:r>
       <w:proofErr w:type="spellEnd"/>
     </w:p>
@@ -2032,24 +1545,13 @@
         </w:rPr>
       </w:pPr>
       <w:r>
-        <w:t>|</w:t>
-      </w:r>
-      <w:proofErr w:type="gramStart"/>
-      <w:r>
-        <w:t>f</w:t>
-      </w:r>
-      <w:r>
-        <w:rPr>
-          <w:color w:val="000000"/>
-        </w:rPr>
-        <w:t xml:space="preserve"> }</w:t>
-      </w:r>
-      <w:proofErr w:type="gramEnd"/>
-      <w:r>
-        <w:rPr>
-          <w:color w:val="000000"/>
-        </w:rPr>
-        <w:t>} mètres carrés, dont :</w:t>
+        <w:t>|f</w:t>
+      </w:r>
+      <w:r>
+        <w:rPr>
+          <w:color w:val="000000"/>
+        </w:rPr>
+        <w:t xml:space="preserve"> }} mètres carrés, dont :</w:t>
       </w:r>
     </w:p>
     <w:p>
@@ -2071,29 +1573,16 @@
         </w:rPr>
         <w:t xml:space="preserve">* Surface habitable totale des parties privatives : </w:t>
       </w:r>
-      <w:proofErr w:type="gramStart"/>
       <w:r>
         <w:t xml:space="preserve">{{ </w:t>
       </w:r>
       <w:proofErr w:type="spellStart"/>
       <w:r>
-        <w:t>sh</w:t>
-      </w:r>
-      <w:proofErr w:type="gramEnd"/>
-      <w:r>
-        <w:t>_totale|</w:t>
-      </w:r>
-      <w:proofErr w:type="gramStart"/>
-      <w:r>
-        <w:t>f</w:t>
+        <w:t>sh_totale|f</w:t>
       </w:r>
       <w:proofErr w:type="spellEnd"/>
       <w:r>
-        <w:t xml:space="preserve"> }</w:t>
-      </w:r>
-      <w:proofErr w:type="gramEnd"/>
-      <w:r>
-        <w:t xml:space="preserve">} </w:t>
+        <w:t xml:space="preserve"> }} </w:t>
       </w:r>
       <w:r>
         <w:rPr>
@@ -2132,49 +1621,21 @@
         <w:rPr>
           <w:color w:val="000000"/>
         </w:rPr>
-        <w:t xml:space="preserve">Nombre total de logements : </w:t>
-      </w:r>
-      <w:proofErr w:type="gramStart"/>
-      <w:r>
-        <w:rPr>
-          <w:color w:val="000000"/>
-        </w:rPr>
-        <w:t xml:space="preserve">{{ </w:t>
+        <w:t xml:space="preserve">Nombre total de logements : {{ </w:t>
       </w:r>
       <w:proofErr w:type="spellStart"/>
       <w:r>
         <w:rPr>
           <w:color w:val="000000"/>
         </w:rPr>
-        <w:t>convention</w:t>
-      </w:r>
-      <w:proofErr w:type="gramEnd"/>
-      <w:r>
-        <w:rPr>
-          <w:color w:val="000000"/>
-        </w:rPr>
-        <w:t>.nb_</w:t>
-      </w:r>
-      <w:proofErr w:type="gramStart"/>
-      <w:r>
-        <w:rPr>
-          <w:color w:val="000000"/>
-        </w:rPr>
-        <w:t>logements</w:t>
+        <w:t>convention.nb_logements</w:t>
       </w:r>
       <w:proofErr w:type="spellEnd"/>
       <w:r>
         <w:rPr>
           <w:color w:val="000000"/>
         </w:rPr>
-        <w:t xml:space="preserve"> }</w:t>
-      </w:r>
-      <w:proofErr w:type="gramEnd"/>
-      <w:r>
-        <w:rPr>
-          <w:color w:val="000000"/>
-        </w:rPr>
-        <w:t>}</w:t>
+        <w:t xml:space="preserve"> }}</w:t>
       </w:r>
     </w:p>
     <w:p>
@@ -2208,25 +1669,7 @@
           <w:sz w:val="20"/>
           <w:lang w:val="en-US"/>
         </w:rPr>
-        <w:t>(‘PLAI</w:t>
-      </w:r>
-      <w:proofErr w:type="gramStart"/>
-      <w:r>
-        <w:rPr>
-          <w:rFonts w:cs="TimesNewRomanPSMT"/>
-          <w:sz w:val="20"/>
-          <w:lang w:val="en-US"/>
-        </w:rPr>
-        <w:t>’)%</w:t>
-      </w:r>
-      <w:proofErr w:type="gramEnd"/>
-      <w:r>
-        <w:rPr>
-          <w:rFonts w:cs="TimesNewRomanPSMT"/>
-          <w:sz w:val="20"/>
-          <w:lang w:val="en-US"/>
-        </w:rPr>
-        <w:t>}</w:t>
+        <w:t>(‘PLAI’)%}</w:t>
       </w:r>
       <w:r>
         <w:rPr>
@@ -2332,25 +1775,7 @@
                 <w:sz w:val="16"/>
                 <w:szCs w:val="16"/>
               </w:rPr>
-              <w:t>(</w:t>
-            </w:r>
-            <w:proofErr w:type="gramStart"/>
-            <w:r>
-              <w:rPr>
-                <w:color w:val="000000"/>
-                <w:sz w:val="16"/>
-                <w:szCs w:val="16"/>
-              </w:rPr>
-              <w:t>une</w:t>
-            </w:r>
-            <w:proofErr w:type="gramEnd"/>
-            <w:r>
-              <w:rPr>
-                <w:color w:val="000000"/>
-                <w:sz w:val="16"/>
-                <w:szCs w:val="16"/>
-              </w:rPr>
-              <w:t xml:space="preserve"> ligne par logement)</w:t>
+              <w:t>(une ligne par logement)</w:t>
             </w:r>
           </w:p>
         </w:tc>
@@ -2389,23 +1814,13 @@
                 <w:color w:val="000000"/>
               </w:rPr>
             </w:pPr>
-            <w:proofErr w:type="gramStart"/>
             <w:r>
               <w:rPr>
                 <w:color w:val="000000"/>
                 <w:sz w:val="16"/>
                 <w:szCs w:val="16"/>
               </w:rPr>
-              <w:t>par</w:t>
-            </w:r>
-            <w:proofErr w:type="gramEnd"/>
-            <w:r>
-              <w:rPr>
-                <w:color w:val="000000"/>
-                <w:sz w:val="16"/>
-                <w:szCs w:val="16"/>
-              </w:rPr>
-              <w:t xml:space="preserve"> local</w:t>
+              <w:t>par local</w:t>
             </w:r>
           </w:p>
         </w:tc>
@@ -2444,23 +1859,13 @@
                 <w:color w:val="000000"/>
               </w:rPr>
             </w:pPr>
-            <w:proofErr w:type="gramStart"/>
             <w:r>
               <w:rPr>
                 <w:color w:val="000000"/>
                 <w:sz w:val="16"/>
                 <w:szCs w:val="16"/>
               </w:rPr>
-              <w:t>du</w:t>
-            </w:r>
-            <w:proofErr w:type="gramEnd"/>
-            <w:r>
-              <w:rPr>
-                <w:color w:val="000000"/>
-                <w:sz w:val="16"/>
-                <w:szCs w:val="16"/>
-              </w:rPr>
-              <w:t xml:space="preserve"> logement</w:t>
+              <w:t>du logement</w:t>
             </w:r>
           </w:p>
         </w:tc>
@@ -2499,23 +1904,13 @@
                 <w:color w:val="000000"/>
               </w:rPr>
             </w:pPr>
-            <w:proofErr w:type="gramStart"/>
             <w:r>
               <w:rPr>
                 <w:color w:val="000000"/>
                 <w:sz w:val="16"/>
                 <w:szCs w:val="16"/>
               </w:rPr>
-              <w:t>par</w:t>
-            </w:r>
-            <w:proofErr w:type="gramEnd"/>
-            <w:r>
-              <w:rPr>
-                <w:color w:val="000000"/>
-                <w:sz w:val="16"/>
-                <w:szCs w:val="16"/>
-              </w:rPr>
-              <w:t xml:space="preserve"> logement prise en compte pour le calcul de l'APL</w:t>
+              <w:t>par logement prise en compte pour le calcul de l'APL</w:t>
             </w:r>
           </w:p>
         </w:tc>
@@ -2550,25 +1945,7 @@
                 <w:szCs w:val="16"/>
                 <w:lang w:val="en-US"/>
               </w:rPr>
-              <w:t>{%tr for l in convention.get_lot_with_financement(‘PLAI’</w:t>
-            </w:r>
-            <w:proofErr w:type="gramStart"/>
-            <w:r>
-              <w:rPr>
-                <w:sz w:val="16"/>
-                <w:szCs w:val="16"/>
-                <w:lang w:val="en-US"/>
-              </w:rPr>
-              <w:t>).logements</w:t>
-            </w:r>
-            <w:proofErr w:type="gramEnd"/>
-            <w:r>
-              <w:rPr>
-                <w:sz w:val="16"/>
-                <w:szCs w:val="16"/>
-                <w:lang w:val="en-US"/>
-              </w:rPr>
-              <w:t>_import_ordered</w:t>
+              <w:t>{%tr for l in convention.get_lot_with_financement(‘PLAI’).logements_import_ordered</w:t>
             </w:r>
           </w:p>
           <w:p>
@@ -2635,35 +2012,34 @@
                 <w:sz w:val="20"/>
                 <w:szCs w:val="20"/>
               </w:rPr>
-              <w:t xml:space="preserve"> </w:t>
-            </w:r>
-            <w:proofErr w:type="gramStart"/>
+              <w:t xml:space="preserve"> %}%}{{</w:t>
+            </w:r>
+            <w:proofErr w:type="spellStart"/>
             <w:r>
               <w:rPr>
                 <w:color w:val="000000"/>
                 <w:sz w:val="20"/>
                 <w:szCs w:val="20"/>
               </w:rPr>
-              <w:t>%}%</w:t>
-            </w:r>
-            <w:proofErr w:type="gramEnd"/>
+              <w:t>l.typologie</w:t>
+            </w:r>
+            <w:proofErr w:type="spellEnd"/>
             <w:r>
               <w:rPr>
                 <w:color w:val="000000"/>
                 <w:sz w:val="20"/>
                 <w:szCs w:val="20"/>
               </w:rPr>
-              <w:t>}{{</w:t>
+              <w:t xml:space="preserve">}}{% </w:t>
             </w:r>
             <w:proofErr w:type="spellStart"/>
-            <w:proofErr w:type="gramStart"/>
             <w:r>
               <w:rPr>
                 <w:color w:val="000000"/>
                 <w:sz w:val="20"/>
                 <w:szCs w:val="20"/>
               </w:rPr>
-              <w:t>l.typologie</w:t>
+              <w:t>else</w:t>
             </w:r>
             <w:proofErr w:type="spellEnd"/>
             <w:r>
@@ -2672,90 +2048,25 @@
                 <w:sz w:val="20"/>
                 <w:szCs w:val="20"/>
               </w:rPr>
-              <w:t>}}{</w:t>
-            </w:r>
-            <w:proofErr w:type="gramEnd"/>
+              <w:t xml:space="preserve"> %}{{</w:t>
+            </w:r>
+            <w:proofErr w:type="spellStart"/>
             <w:r>
               <w:rPr>
                 <w:color w:val="000000"/>
                 <w:sz w:val="20"/>
                 <w:szCs w:val="20"/>
               </w:rPr>
-              <w:t xml:space="preserve">% </w:t>
-            </w:r>
-            <w:proofErr w:type="spellStart"/>
+              <w:t>l.typologie|tl</w:t>
+            </w:r>
+            <w:proofErr w:type="spellEnd"/>
             <w:r>
               <w:rPr>
                 <w:color w:val="000000"/>
                 <w:sz w:val="20"/>
                 <w:szCs w:val="20"/>
               </w:rPr>
-              <w:t>else</w:t>
-            </w:r>
-            <w:proofErr w:type="spellEnd"/>
-            <w:r>
-              <w:rPr>
-                <w:color w:val="000000"/>
-                <w:sz w:val="20"/>
-                <w:szCs w:val="20"/>
-              </w:rPr>
-              <w:t xml:space="preserve"> </w:t>
-            </w:r>
-            <w:proofErr w:type="gramStart"/>
-            <w:r>
-              <w:rPr>
-                <w:color w:val="000000"/>
-                <w:sz w:val="20"/>
-                <w:szCs w:val="20"/>
-              </w:rPr>
-              <w:t>%}{</w:t>
-            </w:r>
-            <w:proofErr w:type="gramEnd"/>
-            <w:r>
-              <w:rPr>
-                <w:color w:val="000000"/>
-                <w:sz w:val="20"/>
-                <w:szCs w:val="20"/>
-              </w:rPr>
-              <w:t>{</w:t>
-            </w:r>
-            <w:proofErr w:type="spellStart"/>
-            <w:proofErr w:type="gramStart"/>
-            <w:r>
-              <w:rPr>
-                <w:color w:val="000000"/>
-                <w:sz w:val="20"/>
-                <w:szCs w:val="20"/>
-              </w:rPr>
-              <w:t>l.typologie</w:t>
-            </w:r>
-            <w:proofErr w:type="gramEnd"/>
-            <w:r>
-              <w:rPr>
-                <w:color w:val="000000"/>
-                <w:sz w:val="20"/>
-                <w:szCs w:val="20"/>
-              </w:rPr>
-              <w:t>|tl</w:t>
-            </w:r>
-            <w:proofErr w:type="spellEnd"/>
-            <w:proofErr w:type="gramStart"/>
-            <w:r>
-              <w:rPr>
-                <w:color w:val="000000"/>
-                <w:sz w:val="20"/>
-                <w:szCs w:val="20"/>
-              </w:rPr>
-              <w:t>}}{</w:t>
-            </w:r>
-            <w:proofErr w:type="gramEnd"/>
-            <w:r>
-              <w:rPr>
-                <w:color w:val="000000"/>
-                <w:sz w:val="20"/>
-                <w:szCs w:val="20"/>
-              </w:rPr>
-              <w:t xml:space="preserve">% </w:t>
+              <w:t xml:space="preserve">}}{% </w:t>
             </w:r>
             <w:proofErr w:type="spellStart"/>
             <w:r>
@@ -2804,23 +2115,13 @@
               <w:t>{{</w:t>
             </w:r>
             <w:proofErr w:type="spellStart"/>
-            <w:proofErr w:type="gramStart"/>
             <w:r>
               <w:rPr>
                 <w:color w:val="000000"/>
                 <w:sz w:val="20"/>
                 <w:szCs w:val="20"/>
               </w:rPr>
-              <w:t>l.surface</w:t>
-            </w:r>
-            <w:proofErr w:type="gramEnd"/>
-            <w:r>
-              <w:rPr>
-                <w:color w:val="000000"/>
-                <w:sz w:val="20"/>
-                <w:szCs w:val="20"/>
-              </w:rPr>
-              <w:t>_habitable|f</w:t>
+              <w:t>l.surface_habitable|f</w:t>
             </w:r>
             <w:proofErr w:type="spellEnd"/>
             <w:r>
@@ -2860,7 +2161,6 @@
               <w:t>{{</w:t>
             </w:r>
             <w:proofErr w:type="spellStart"/>
-            <w:proofErr w:type="gramStart"/>
             <w:r>
               <w:rPr>
                 <w:color w:val="000000"/>
@@ -2870,7 +2170,6 @@
               <w:t>l.designation</w:t>
             </w:r>
             <w:proofErr w:type="spellEnd"/>
-            <w:proofErr w:type="gramEnd"/>
             <w:r>
               <w:rPr>
                 <w:color w:val="000000"/>
@@ -2908,23 +2207,13 @@
               <w:t>{{</w:t>
             </w:r>
             <w:proofErr w:type="spellStart"/>
-            <w:proofErr w:type="gramStart"/>
             <w:r>
               <w:rPr>
                 <w:color w:val="000000"/>
                 <w:sz w:val="20"/>
                 <w:szCs w:val="20"/>
               </w:rPr>
-              <w:t>l.loyer</w:t>
-            </w:r>
-            <w:proofErr w:type="gramEnd"/>
-            <w:r>
-              <w:rPr>
-                <w:color w:val="000000"/>
-                <w:sz w:val="20"/>
-                <w:szCs w:val="20"/>
-              </w:rPr>
-              <w:t>|f</w:t>
+              <w:t>l.loyer|f</w:t>
             </w:r>
             <w:proofErr w:type="spellEnd"/>
             <w:r>
@@ -3045,21 +2334,7 @@
               <w:rPr>
                 <w:color w:val="000000"/>
               </w:rPr>
-              <w:t xml:space="preserve">en Guyane, en Martinique, à La Réunion, à </w:t>
-            </w:r>
-            <w:proofErr w:type="gramStart"/>
-            <w:r>
-              <w:rPr>
-                <w:color w:val="000000"/>
-              </w:rPr>
-              <w:t>Mayotte{</w:t>
-            </w:r>
-            <w:proofErr w:type="gramEnd"/>
-            <w:r>
-              <w:rPr>
-                <w:color w:val="000000"/>
-              </w:rPr>
-              <w:t xml:space="preserve">% </w:t>
+              <w:t xml:space="preserve">en Guyane, en Martinique, à La Réunion, à Mayotte{% </w:t>
             </w:r>
             <w:proofErr w:type="spellStart"/>
             <w:r>
@@ -3073,21 +2348,7 @@
               <w:rPr>
                 <w:color w:val="000000"/>
               </w:rPr>
-              <w:t xml:space="preserve"> %}17 octobre 2011. A prendre en compte dans la liste </w:t>
-            </w:r>
-            <w:proofErr w:type="gramStart"/>
-            <w:r>
-              <w:rPr>
-                <w:color w:val="000000"/>
-              </w:rPr>
-              <w:t>déroulante{</w:t>
-            </w:r>
-            <w:proofErr w:type="gramEnd"/>
-            <w:r>
-              <w:rPr>
-                <w:color w:val="000000"/>
-              </w:rPr>
-              <w:t xml:space="preserve">% </w:t>
+              <w:t xml:space="preserve"> %}17 octobre 2011. A prendre en compte dans la liste déroulante{% </w:t>
             </w:r>
             <w:proofErr w:type="spellStart"/>
             <w:r>
@@ -3177,25 +2438,7 @@
           <w:sz w:val="20"/>
           <w:lang w:val="en-US"/>
         </w:rPr>
-        <w:t>(‘PLUS</w:t>
-      </w:r>
-      <w:proofErr w:type="gramStart"/>
-      <w:r>
-        <w:rPr>
-          <w:rFonts w:cs="TimesNewRomanPSMT"/>
-          <w:sz w:val="20"/>
-          <w:lang w:val="en-US"/>
-        </w:rPr>
-        <w:t>’)%</w:t>
-      </w:r>
-      <w:proofErr w:type="gramEnd"/>
-      <w:r>
-        <w:rPr>
-          <w:rFonts w:cs="TimesNewRomanPSMT"/>
-          <w:sz w:val="20"/>
-          <w:lang w:val="en-US"/>
-        </w:rPr>
-        <w:t>}</w:t>
+        <w:t>(‘PLUS’)%}</w:t>
       </w:r>
     </w:p>
     <w:p>
@@ -3292,25 +2535,7 @@
                 <w:sz w:val="16"/>
                 <w:szCs w:val="16"/>
               </w:rPr>
-              <w:t>(</w:t>
-            </w:r>
-            <w:proofErr w:type="gramStart"/>
-            <w:r>
-              <w:rPr>
-                <w:color w:val="000000"/>
-                <w:sz w:val="16"/>
-                <w:szCs w:val="16"/>
-              </w:rPr>
-              <w:t>une</w:t>
-            </w:r>
-            <w:proofErr w:type="gramEnd"/>
-            <w:r>
-              <w:rPr>
-                <w:color w:val="000000"/>
-                <w:sz w:val="16"/>
-                <w:szCs w:val="16"/>
-              </w:rPr>
-              <w:t xml:space="preserve"> ligne par logement)</w:t>
+              <w:t>(une ligne par logement)</w:t>
             </w:r>
           </w:p>
         </w:tc>
@@ -3349,23 +2574,13 @@
                 <w:color w:val="000000"/>
               </w:rPr>
             </w:pPr>
-            <w:proofErr w:type="gramStart"/>
             <w:r>
               <w:rPr>
                 <w:color w:val="000000"/>
                 <w:sz w:val="16"/>
                 <w:szCs w:val="16"/>
               </w:rPr>
-              <w:t>par</w:t>
-            </w:r>
-            <w:proofErr w:type="gramEnd"/>
-            <w:r>
-              <w:rPr>
-                <w:color w:val="000000"/>
-                <w:sz w:val="16"/>
-                <w:szCs w:val="16"/>
-              </w:rPr>
-              <w:t xml:space="preserve"> local</w:t>
+              <w:t>par local</w:t>
             </w:r>
           </w:p>
         </w:tc>
@@ -3404,23 +2619,13 @@
                 <w:color w:val="000000"/>
               </w:rPr>
             </w:pPr>
-            <w:proofErr w:type="gramStart"/>
             <w:r>
               <w:rPr>
                 <w:color w:val="000000"/>
                 <w:sz w:val="16"/>
                 <w:szCs w:val="16"/>
               </w:rPr>
-              <w:t>du</w:t>
-            </w:r>
-            <w:proofErr w:type="gramEnd"/>
-            <w:r>
-              <w:rPr>
-                <w:color w:val="000000"/>
-                <w:sz w:val="16"/>
-                <w:szCs w:val="16"/>
-              </w:rPr>
-              <w:t xml:space="preserve"> logement</w:t>
+              <w:t>du logement</w:t>
             </w:r>
           </w:p>
         </w:tc>
@@ -3459,23 +2664,13 @@
                 <w:color w:val="000000"/>
               </w:rPr>
             </w:pPr>
-            <w:proofErr w:type="gramStart"/>
             <w:r>
               <w:rPr>
                 <w:color w:val="000000"/>
                 <w:sz w:val="16"/>
                 <w:szCs w:val="16"/>
               </w:rPr>
-              <w:t>par</w:t>
-            </w:r>
-            <w:proofErr w:type="gramEnd"/>
-            <w:r>
-              <w:rPr>
-                <w:color w:val="000000"/>
-                <w:sz w:val="16"/>
-                <w:szCs w:val="16"/>
-              </w:rPr>
-              <w:t xml:space="preserve"> logement prise en compte pour le calcul de l'APL</w:t>
+              <w:t>par logement prise en compte pour le calcul de l'APL</w:t>
             </w:r>
           </w:p>
         </w:tc>
@@ -3510,25 +2705,7 @@
                 <w:szCs w:val="16"/>
                 <w:lang w:val="en-US"/>
               </w:rPr>
-              <w:t>{%tr for l in convention.get_lot_with_financement(‘PLUS’</w:t>
-            </w:r>
-            <w:proofErr w:type="gramStart"/>
-            <w:r>
-              <w:rPr>
-                <w:sz w:val="16"/>
-                <w:szCs w:val="16"/>
-                <w:lang w:val="en-US"/>
-              </w:rPr>
-              <w:t>).logements</w:t>
-            </w:r>
-            <w:proofErr w:type="gramEnd"/>
-            <w:r>
-              <w:rPr>
-                <w:sz w:val="16"/>
-                <w:szCs w:val="16"/>
-                <w:lang w:val="en-US"/>
-              </w:rPr>
-              <w:t>_import_ordered</w:t>
+              <w:t>{%tr for l in convention.get_lot_with_financement(‘PLUS’).logements_import_ordered</w:t>
             </w:r>
           </w:p>
           <w:p>
@@ -3595,35 +2772,34 @@
                 <w:sz w:val="20"/>
                 <w:szCs w:val="20"/>
               </w:rPr>
-              <w:t xml:space="preserve"> </w:t>
-            </w:r>
-            <w:proofErr w:type="gramStart"/>
+              <w:t xml:space="preserve"> %}%}{{</w:t>
+            </w:r>
+            <w:proofErr w:type="spellStart"/>
             <w:r>
               <w:rPr>
                 <w:color w:val="000000"/>
                 <w:sz w:val="20"/>
                 <w:szCs w:val="20"/>
               </w:rPr>
-              <w:t>%}%</w:t>
-            </w:r>
-            <w:proofErr w:type="gramEnd"/>
+              <w:t>l.typologie</w:t>
+            </w:r>
+            <w:proofErr w:type="spellEnd"/>
             <w:r>
               <w:rPr>
                 <w:color w:val="000000"/>
                 <w:sz w:val="20"/>
                 <w:szCs w:val="20"/>
               </w:rPr>
-              <w:t>}{{</w:t>
+              <w:t xml:space="preserve">}}{% </w:t>
             </w:r>
             <w:proofErr w:type="spellStart"/>
-            <w:proofErr w:type="gramStart"/>
             <w:r>
               <w:rPr>
                 <w:color w:val="000000"/>
                 <w:sz w:val="20"/>
                 <w:szCs w:val="20"/>
               </w:rPr>
-              <w:t>l.typologie</w:t>
+              <w:t>else</w:t>
             </w:r>
             <w:proofErr w:type="spellEnd"/>
             <w:r>
@@ -3632,90 +2808,25 @@
                 <w:sz w:val="20"/>
                 <w:szCs w:val="20"/>
               </w:rPr>
-              <w:t>}}{</w:t>
-            </w:r>
-            <w:proofErr w:type="gramEnd"/>
+              <w:t xml:space="preserve"> %}{{</w:t>
+            </w:r>
+            <w:proofErr w:type="spellStart"/>
             <w:r>
               <w:rPr>
                 <w:color w:val="000000"/>
                 <w:sz w:val="20"/>
                 <w:szCs w:val="20"/>
               </w:rPr>
-              <w:t xml:space="preserve">% </w:t>
-            </w:r>
-            <w:proofErr w:type="spellStart"/>
+              <w:t>l.typologie|tl</w:t>
+            </w:r>
+            <w:proofErr w:type="spellEnd"/>
             <w:r>
               <w:rPr>
                 <w:color w:val="000000"/>
                 <w:sz w:val="20"/>
                 <w:szCs w:val="20"/>
               </w:rPr>
-              <w:t>else</w:t>
-            </w:r>
-            <w:proofErr w:type="spellEnd"/>
-            <w:r>
-              <w:rPr>
-                <w:color w:val="000000"/>
-                <w:sz w:val="20"/>
-                <w:szCs w:val="20"/>
-              </w:rPr>
-              <w:t xml:space="preserve"> </w:t>
-            </w:r>
-            <w:proofErr w:type="gramStart"/>
-            <w:r>
-              <w:rPr>
-                <w:color w:val="000000"/>
-                <w:sz w:val="20"/>
-                <w:szCs w:val="20"/>
-              </w:rPr>
-              <w:t>%}{</w:t>
-            </w:r>
-            <w:proofErr w:type="gramEnd"/>
-            <w:r>
-              <w:rPr>
-                <w:color w:val="000000"/>
-                <w:sz w:val="20"/>
-                <w:szCs w:val="20"/>
-              </w:rPr>
-              <w:t>{</w:t>
-            </w:r>
-            <w:proofErr w:type="spellStart"/>
-            <w:proofErr w:type="gramStart"/>
-            <w:r>
-              <w:rPr>
-                <w:color w:val="000000"/>
-                <w:sz w:val="20"/>
-                <w:szCs w:val="20"/>
-              </w:rPr>
-              <w:t>l.typologie</w:t>
-            </w:r>
-            <w:proofErr w:type="gramEnd"/>
-            <w:r>
-              <w:rPr>
-                <w:color w:val="000000"/>
-                <w:sz w:val="20"/>
-                <w:szCs w:val="20"/>
-              </w:rPr>
-              <w:t>|tl</w:t>
-            </w:r>
-            <w:proofErr w:type="spellEnd"/>
-            <w:proofErr w:type="gramStart"/>
-            <w:r>
-              <w:rPr>
-                <w:color w:val="000000"/>
-                <w:sz w:val="20"/>
-                <w:szCs w:val="20"/>
-              </w:rPr>
-              <w:t>}}{</w:t>
-            </w:r>
-            <w:proofErr w:type="gramEnd"/>
-            <w:r>
-              <w:rPr>
-                <w:color w:val="000000"/>
-                <w:sz w:val="20"/>
-                <w:szCs w:val="20"/>
-              </w:rPr>
-              <w:t xml:space="preserve">% </w:t>
+              <w:t xml:space="preserve">}}{% </w:t>
             </w:r>
             <w:proofErr w:type="spellStart"/>
             <w:r>
@@ -3764,23 +2875,13 @@
               <w:t>{{</w:t>
             </w:r>
             <w:proofErr w:type="spellStart"/>
-            <w:proofErr w:type="gramStart"/>
             <w:r>
               <w:rPr>
                 <w:color w:val="000000"/>
                 <w:sz w:val="20"/>
                 <w:szCs w:val="20"/>
               </w:rPr>
-              <w:t>l.surface</w:t>
-            </w:r>
-            <w:proofErr w:type="gramEnd"/>
-            <w:r>
-              <w:rPr>
-                <w:color w:val="000000"/>
-                <w:sz w:val="20"/>
-                <w:szCs w:val="20"/>
-              </w:rPr>
-              <w:t>_habitable|f</w:t>
+              <w:t>l.surface_habitable|f</w:t>
             </w:r>
             <w:proofErr w:type="spellEnd"/>
             <w:r>
@@ -3820,7 +2921,6 @@
               <w:t>{{</w:t>
             </w:r>
             <w:proofErr w:type="spellStart"/>
-            <w:proofErr w:type="gramStart"/>
             <w:r>
               <w:rPr>
                 <w:color w:val="000000"/>
@@ -3830,7 +2930,6 @@
               <w:t>l.designation</w:t>
             </w:r>
             <w:proofErr w:type="spellEnd"/>
-            <w:proofErr w:type="gramEnd"/>
             <w:r>
               <w:rPr>
                 <w:color w:val="000000"/>
@@ -3868,23 +2967,13 @@
               <w:t>{{</w:t>
             </w:r>
             <w:proofErr w:type="spellStart"/>
-            <w:proofErr w:type="gramStart"/>
             <w:r>
               <w:rPr>
                 <w:color w:val="000000"/>
                 <w:sz w:val="20"/>
                 <w:szCs w:val="20"/>
               </w:rPr>
-              <w:t>l.loyer</w:t>
-            </w:r>
-            <w:proofErr w:type="gramEnd"/>
-            <w:r>
-              <w:rPr>
-                <w:color w:val="000000"/>
-                <w:sz w:val="20"/>
-                <w:szCs w:val="20"/>
-              </w:rPr>
-              <w:t>|f</w:t>
+              <w:t>l.loyer|f</w:t>
             </w:r>
             <w:proofErr w:type="spellEnd"/>
             <w:r>
@@ -4005,21 +3094,7 @@
               <w:rPr>
                 <w:color w:val="000000"/>
               </w:rPr>
-              <w:t xml:space="preserve">en Guyane, en Martinique, à La Réunion, à </w:t>
-            </w:r>
-            <w:proofErr w:type="gramStart"/>
-            <w:r>
-              <w:rPr>
-                <w:color w:val="000000"/>
-              </w:rPr>
-              <w:t>Mayotte{</w:t>
-            </w:r>
-            <w:proofErr w:type="gramEnd"/>
-            <w:r>
-              <w:rPr>
-                <w:color w:val="000000"/>
-              </w:rPr>
-              <w:t xml:space="preserve">% </w:t>
+              <w:t xml:space="preserve">en Guyane, en Martinique, à La Réunion, à Mayotte{% </w:t>
             </w:r>
             <w:proofErr w:type="spellStart"/>
             <w:r>
@@ -4033,21 +3108,7 @@
               <w:rPr>
                 <w:color w:val="000000"/>
               </w:rPr>
-              <w:t xml:space="preserve"> %}17 octobre 2011. A prendre en compte dans la liste </w:t>
-            </w:r>
-            <w:proofErr w:type="gramStart"/>
-            <w:r>
-              <w:rPr>
-                <w:color w:val="000000"/>
-              </w:rPr>
-              <w:t>déroulante{</w:t>
-            </w:r>
-            <w:proofErr w:type="gramEnd"/>
-            <w:r>
-              <w:rPr>
-                <w:color w:val="000000"/>
-              </w:rPr>
-              <w:t xml:space="preserve">% </w:t>
+              <w:t xml:space="preserve"> %}17 octobre 2011. A prendre en compte dans la liste déroulante{% </w:t>
             </w:r>
             <w:proofErr w:type="spellStart"/>
             <w:r>
@@ -4144,25 +3205,7 @@
           <w:sz w:val="20"/>
           <w:lang w:val="en-US"/>
         </w:rPr>
-        <w:t>(‘PLS</w:t>
-      </w:r>
-      <w:proofErr w:type="gramStart"/>
-      <w:r>
-        <w:rPr>
-          <w:rFonts w:cs="TimesNewRomanPSMT"/>
-          <w:sz w:val="20"/>
-          <w:lang w:val="en-US"/>
-        </w:rPr>
-        <w:t>’)%</w:t>
-      </w:r>
-      <w:proofErr w:type="gramEnd"/>
-      <w:r>
-        <w:rPr>
-          <w:rFonts w:cs="TimesNewRomanPSMT"/>
-          <w:sz w:val="20"/>
-          <w:lang w:val="en-US"/>
-        </w:rPr>
-        <w:t>}</w:t>
+        <w:t>(‘PLS’)%}</w:t>
       </w:r>
     </w:p>
     <w:p>
@@ -4253,25 +3296,7 @@
                 <w:sz w:val="16"/>
                 <w:szCs w:val="16"/>
               </w:rPr>
-              <w:t>(</w:t>
-            </w:r>
-            <w:proofErr w:type="gramStart"/>
-            <w:r>
-              <w:rPr>
-                <w:color w:val="000000"/>
-                <w:sz w:val="16"/>
-                <w:szCs w:val="16"/>
-              </w:rPr>
-              <w:t>une</w:t>
-            </w:r>
-            <w:proofErr w:type="gramEnd"/>
-            <w:r>
-              <w:rPr>
-                <w:color w:val="000000"/>
-                <w:sz w:val="16"/>
-                <w:szCs w:val="16"/>
-              </w:rPr>
-              <w:t xml:space="preserve"> ligne par logement)</w:t>
+              <w:t>(une ligne par logement)</w:t>
             </w:r>
           </w:p>
         </w:tc>
@@ -4310,23 +3335,13 @@
                 <w:color w:val="000000"/>
               </w:rPr>
             </w:pPr>
-            <w:proofErr w:type="gramStart"/>
             <w:r>
               <w:rPr>
                 <w:color w:val="000000"/>
                 <w:sz w:val="16"/>
                 <w:szCs w:val="16"/>
               </w:rPr>
-              <w:t>par</w:t>
-            </w:r>
-            <w:proofErr w:type="gramEnd"/>
-            <w:r>
-              <w:rPr>
-                <w:color w:val="000000"/>
-                <w:sz w:val="16"/>
-                <w:szCs w:val="16"/>
-              </w:rPr>
-              <w:t xml:space="preserve"> local</w:t>
+              <w:t>par local</w:t>
             </w:r>
           </w:p>
         </w:tc>
@@ -4365,23 +3380,13 @@
                 <w:color w:val="000000"/>
               </w:rPr>
             </w:pPr>
-            <w:proofErr w:type="gramStart"/>
             <w:r>
               <w:rPr>
                 <w:color w:val="000000"/>
                 <w:sz w:val="16"/>
                 <w:szCs w:val="16"/>
               </w:rPr>
-              <w:t>du</w:t>
-            </w:r>
-            <w:proofErr w:type="gramEnd"/>
-            <w:r>
-              <w:rPr>
-                <w:color w:val="000000"/>
-                <w:sz w:val="16"/>
-                <w:szCs w:val="16"/>
-              </w:rPr>
-              <w:t xml:space="preserve"> logement</w:t>
+              <w:t>du logement</w:t>
             </w:r>
           </w:p>
         </w:tc>
@@ -4420,23 +3425,13 @@
                 <w:color w:val="000000"/>
               </w:rPr>
             </w:pPr>
-            <w:proofErr w:type="gramStart"/>
             <w:r>
               <w:rPr>
                 <w:color w:val="000000"/>
                 <w:sz w:val="16"/>
                 <w:szCs w:val="16"/>
               </w:rPr>
-              <w:t>par</w:t>
-            </w:r>
-            <w:proofErr w:type="gramEnd"/>
-            <w:r>
-              <w:rPr>
-                <w:color w:val="000000"/>
-                <w:sz w:val="16"/>
-                <w:szCs w:val="16"/>
-              </w:rPr>
-              <w:t xml:space="preserve"> logement prise en compte pour le calcul de l'APL</w:t>
+              <w:t>par logement prise en compte pour le calcul de l'APL</w:t>
             </w:r>
           </w:p>
         </w:tc>
@@ -4488,34 +3483,16 @@
                 <w:szCs w:val="16"/>
                 <w:lang w:val="en-US"/>
               </w:rPr>
-              <w:t>(‘PLS’</w:t>
-            </w:r>
-            <w:proofErr w:type="gramStart"/>
+              <w:t>(‘PLS’) .</w:t>
+            </w:r>
+            <w:proofErr w:type="spellStart"/>
             <w:r>
               <w:rPr>
                 <w:sz w:val="16"/>
                 <w:szCs w:val="16"/>
                 <w:lang w:val="en-US"/>
               </w:rPr>
-              <w:t>) .</w:t>
-            </w:r>
-            <w:proofErr w:type="spellStart"/>
-            <w:r>
-              <w:rPr>
-                <w:sz w:val="16"/>
-                <w:szCs w:val="16"/>
-                <w:lang w:val="en-US"/>
-              </w:rPr>
-              <w:t>logements</w:t>
-            </w:r>
-            <w:proofErr w:type="gramEnd"/>
-            <w:r>
-              <w:rPr>
-                <w:sz w:val="16"/>
-                <w:szCs w:val="16"/>
-                <w:lang w:val="en-US"/>
-              </w:rPr>
-              <w:t>_import_ordered</w:t>
+              <w:t>logements_import_ordered</w:t>
             </w:r>
             <w:proofErr w:type="spellEnd"/>
             <w:r>
@@ -4580,9 +3557,9 @@
                 <w:szCs w:val="20"/>
                 <w:lang w:val="en-US"/>
               </w:rPr>
-              <w:t xml:space="preserve"> </w:t>
-            </w:r>
-            <w:proofErr w:type="gramStart"/>
+              <w:t xml:space="preserve"> %}%}{{</w:t>
+            </w:r>
+            <w:proofErr w:type="spellStart"/>
             <w:r>
               <w:rPr>
                 <w:color w:val="000000"/>
@@ -4590,9 +3567,9 @@
                 <w:szCs w:val="20"/>
                 <w:lang w:val="en-US"/>
               </w:rPr>
-              <w:t>%}%</w:t>
-            </w:r>
-            <w:proofErr w:type="gramEnd"/>
+              <w:t>l.typologie</w:t>
+            </w:r>
+            <w:proofErr w:type="spellEnd"/>
             <w:r>
               <w:rPr>
                 <w:color w:val="000000"/>
@@ -4600,10 +3577,9 @@
                 <w:szCs w:val="20"/>
                 <w:lang w:val="en-US"/>
               </w:rPr>
-              <w:t>}{{</w:t>
+              <w:t>}}{% else %}{{</w:t>
             </w:r>
             <w:proofErr w:type="spellStart"/>
-            <w:proofErr w:type="gramStart"/>
             <w:r>
               <w:rPr>
                 <w:color w:val="000000"/>
@@ -4611,7 +3587,7 @@
                 <w:szCs w:val="20"/>
                 <w:lang w:val="en-US"/>
               </w:rPr>
-              <w:t>l.typologie</w:t>
+              <w:t>l.typologie|tl</w:t>
             </w:r>
             <w:proofErr w:type="spellEnd"/>
             <w:r>
@@ -4621,79 +3597,7 @@
                 <w:szCs w:val="20"/>
                 <w:lang w:val="en-US"/>
               </w:rPr>
-              <w:t>}}{</w:t>
-            </w:r>
-            <w:proofErr w:type="gramEnd"/>
-            <w:r>
-              <w:rPr>
-                <w:color w:val="000000"/>
-                <w:sz w:val="20"/>
-                <w:szCs w:val="20"/>
-                <w:lang w:val="en-US"/>
-              </w:rPr>
-              <w:t xml:space="preserve">% else </w:t>
-            </w:r>
-            <w:proofErr w:type="gramStart"/>
-            <w:r>
-              <w:rPr>
-                <w:color w:val="000000"/>
-                <w:sz w:val="20"/>
-                <w:szCs w:val="20"/>
-                <w:lang w:val="en-US"/>
-              </w:rPr>
-              <w:t>%}{</w:t>
-            </w:r>
-            <w:proofErr w:type="gramEnd"/>
-            <w:r>
-              <w:rPr>
-                <w:color w:val="000000"/>
-                <w:sz w:val="20"/>
-                <w:szCs w:val="20"/>
-                <w:lang w:val="en-US"/>
-              </w:rPr>
-              <w:t>{</w:t>
-            </w:r>
-            <w:proofErr w:type="spellStart"/>
-            <w:proofErr w:type="gramStart"/>
-            <w:r>
-              <w:rPr>
-                <w:color w:val="000000"/>
-                <w:sz w:val="20"/>
-                <w:szCs w:val="20"/>
-                <w:lang w:val="en-US"/>
-              </w:rPr>
-              <w:t>l.typologie</w:t>
-            </w:r>
-            <w:proofErr w:type="gramEnd"/>
-            <w:r>
-              <w:rPr>
-                <w:color w:val="000000"/>
-                <w:sz w:val="20"/>
-                <w:szCs w:val="20"/>
-                <w:lang w:val="en-US"/>
-              </w:rPr>
-              <w:t>|tl</w:t>
-            </w:r>
-            <w:proofErr w:type="spellEnd"/>
-            <w:proofErr w:type="gramStart"/>
-            <w:r>
-              <w:rPr>
-                <w:color w:val="000000"/>
-                <w:sz w:val="20"/>
-                <w:szCs w:val="20"/>
-                <w:lang w:val="en-US"/>
-              </w:rPr>
-              <w:t>}}{</w:t>
-            </w:r>
-            <w:proofErr w:type="gramEnd"/>
-            <w:r>
-              <w:rPr>
-                <w:color w:val="000000"/>
-                <w:sz w:val="20"/>
-                <w:szCs w:val="20"/>
-                <w:lang w:val="en-US"/>
-              </w:rPr>
-              <w:t>% endif %}</w:t>
+              <w:t>}}{% endif %}</w:t>
             </w:r>
           </w:p>
         </w:tc>
@@ -4724,23 +3628,13 @@
               <w:t>{{</w:t>
             </w:r>
             <w:proofErr w:type="spellStart"/>
-            <w:proofErr w:type="gramStart"/>
             <w:r>
               <w:rPr>
                 <w:color w:val="000000"/>
                 <w:sz w:val="20"/>
                 <w:szCs w:val="20"/>
               </w:rPr>
-              <w:t>l.surface</w:t>
-            </w:r>
-            <w:proofErr w:type="gramEnd"/>
-            <w:r>
-              <w:rPr>
-                <w:color w:val="000000"/>
-                <w:sz w:val="20"/>
-                <w:szCs w:val="20"/>
-              </w:rPr>
-              <w:t>_habitable|f</w:t>
+              <w:t>l.surface_habitable|f</w:t>
             </w:r>
             <w:proofErr w:type="spellEnd"/>
             <w:r>
@@ -4780,7 +3674,6 @@
               <w:t>{{</w:t>
             </w:r>
             <w:proofErr w:type="spellStart"/>
-            <w:proofErr w:type="gramStart"/>
             <w:r>
               <w:rPr>
                 <w:color w:val="000000"/>
@@ -4790,7 +3683,6 @@
               <w:t>l.designation</w:t>
             </w:r>
             <w:proofErr w:type="spellEnd"/>
-            <w:proofErr w:type="gramEnd"/>
             <w:r>
               <w:rPr>
                 <w:color w:val="000000"/>
@@ -4828,23 +3720,13 @@
               <w:t>{{</w:t>
             </w:r>
             <w:proofErr w:type="spellStart"/>
-            <w:proofErr w:type="gramStart"/>
             <w:r>
               <w:rPr>
                 <w:color w:val="000000"/>
                 <w:sz w:val="20"/>
                 <w:szCs w:val="20"/>
               </w:rPr>
-              <w:t>l.loyer</w:t>
-            </w:r>
-            <w:proofErr w:type="gramEnd"/>
-            <w:r>
-              <w:rPr>
-                <w:color w:val="000000"/>
-                <w:sz w:val="20"/>
-                <w:szCs w:val="20"/>
-              </w:rPr>
-              <w:t>|f</w:t>
+              <w:t>l.loyer|f</w:t>
             </w:r>
             <w:proofErr w:type="spellEnd"/>
             <w:r>
@@ -4965,21 +3847,7 @@
               <w:rPr>
                 <w:color w:val="000000"/>
               </w:rPr>
-              <w:t xml:space="preserve">en Guyane, en Martinique, à La Réunion, à </w:t>
-            </w:r>
-            <w:proofErr w:type="gramStart"/>
-            <w:r>
-              <w:rPr>
-                <w:color w:val="000000"/>
-              </w:rPr>
-              <w:t>Mayotte{</w:t>
-            </w:r>
-            <w:proofErr w:type="gramEnd"/>
-            <w:r>
-              <w:rPr>
-                <w:color w:val="000000"/>
-              </w:rPr>
-              <w:t xml:space="preserve">% </w:t>
+              <w:t xml:space="preserve">en Guyane, en Martinique, à La Réunion, à Mayotte{% </w:t>
             </w:r>
             <w:proofErr w:type="spellStart"/>
             <w:r>
@@ -4993,21 +3861,7 @@
               <w:rPr>
                 <w:color w:val="000000"/>
               </w:rPr>
-              <w:t xml:space="preserve"> %}17 octobre 2011. A prendre en compte dans la liste </w:t>
-            </w:r>
-            <w:proofErr w:type="gramStart"/>
-            <w:r>
-              <w:rPr>
-                <w:color w:val="000000"/>
-              </w:rPr>
-              <w:t>déroulante{</w:t>
-            </w:r>
-            <w:proofErr w:type="gramEnd"/>
-            <w:r>
-              <w:rPr>
-                <w:color w:val="000000"/>
-              </w:rPr>
-              <w:t xml:space="preserve">% </w:t>
+              <w:t xml:space="preserve"> %}17 octobre 2011. A prendre en compte dans la liste déroulante{% </w:t>
             </w:r>
             <w:proofErr w:type="spellStart"/>
             <w:r>
@@ -5083,49 +3937,21 @@
         <w:rPr>
           <w:color w:val="000000"/>
         </w:rPr>
-        <w:t xml:space="preserve">* Surface totale des locaux à usage collectif : </w:t>
-      </w:r>
-      <w:proofErr w:type="gramStart"/>
-      <w:r>
-        <w:rPr>
-          <w:color w:val="000000"/>
-        </w:rPr>
-        <w:t xml:space="preserve">{{ </w:t>
+        <w:t xml:space="preserve">* Surface totale des locaux à usage collectif : {{ </w:t>
       </w:r>
       <w:proofErr w:type="spellStart"/>
       <w:r>
         <w:rPr>
           <w:color w:val="000000"/>
         </w:rPr>
-        <w:t>lc</w:t>
-      </w:r>
-      <w:proofErr w:type="gramEnd"/>
-      <w:r>
-        <w:rPr>
-          <w:color w:val="000000"/>
-        </w:rPr>
-        <w:t>_sh_totale|</w:t>
-      </w:r>
-      <w:proofErr w:type="gramStart"/>
-      <w:r>
-        <w:rPr>
-          <w:color w:val="000000"/>
-        </w:rPr>
-        <w:t>f</w:t>
+        <w:t>lc_sh_totale|f</w:t>
       </w:r>
       <w:proofErr w:type="spellEnd"/>
       <w:r>
         <w:rPr>
           <w:color w:val="000000"/>
         </w:rPr>
-        <w:t xml:space="preserve"> }</w:t>
-      </w:r>
-      <w:proofErr w:type="gramEnd"/>
-      <w:r>
-        <w:rPr>
-          <w:color w:val="000000"/>
-        </w:rPr>
-        <w:t xml:space="preserve">} mètres carrés de surface habitable : </w:t>
+        <w:t xml:space="preserve"> }} mètres carrés de surface habitable : </w:t>
       </w:r>
     </w:p>
     <w:p>
@@ -5337,7 +4163,6 @@
                 <w:szCs w:val="20"/>
               </w:rPr>
             </w:pPr>
-            <w:proofErr w:type="gramStart"/>
             <w:r>
               <w:rPr>
                 <w:color w:val="000000"/>
@@ -5353,16 +4178,7 @@
                 <w:sz w:val="20"/>
                 <w:szCs w:val="20"/>
               </w:rPr>
-              <w:t>lc</w:t>
-            </w:r>
-            <w:proofErr w:type="gramEnd"/>
-            <w:r>
-              <w:rPr>
-                <w:color w:val="000000"/>
-                <w:sz w:val="20"/>
-                <w:szCs w:val="20"/>
-              </w:rPr>
-              <w:t>.type_local</w:t>
+              <w:t>lc.type_local</w:t>
             </w:r>
             <w:proofErr w:type="spellEnd"/>
             <w:r>
@@ -5394,7 +4210,6 @@
                 <w:szCs w:val="20"/>
               </w:rPr>
             </w:pPr>
-            <w:proofErr w:type="gramStart"/>
             <w:r>
               <w:rPr>
                 <w:color w:val="000000"/>
@@ -5410,16 +4225,7 @@
                 <w:sz w:val="20"/>
                 <w:szCs w:val="20"/>
               </w:rPr>
-              <w:t>lc</w:t>
-            </w:r>
-            <w:proofErr w:type="gramEnd"/>
-            <w:r>
-              <w:rPr>
-                <w:color w:val="000000"/>
-                <w:sz w:val="20"/>
-                <w:szCs w:val="20"/>
-              </w:rPr>
-              <w:t>.surface_habitable</w:t>
+              <w:t>lc.surface_habitable</w:t>
             </w:r>
             <w:proofErr w:type="spellEnd"/>
             <w:r>
@@ -5451,7 +4257,6 @@
                 <w:szCs w:val="20"/>
               </w:rPr>
             </w:pPr>
-            <w:proofErr w:type="gramStart"/>
             <w:r>
               <w:rPr>
                 <w:color w:val="000000"/>
@@ -5467,16 +4272,7 @@
                 <w:sz w:val="20"/>
                 <w:szCs w:val="20"/>
               </w:rPr>
-              <w:t>lc</w:t>
-            </w:r>
-            <w:proofErr w:type="gramEnd"/>
-            <w:r>
-              <w:rPr>
-                <w:color w:val="000000"/>
-                <w:sz w:val="20"/>
-                <w:szCs w:val="20"/>
-              </w:rPr>
-              <w:t>.nombre</w:t>
+              <w:t>lc.nombre</w:t>
             </w:r>
             <w:proofErr w:type="spellEnd"/>
             <w:r>
@@ -5572,42 +4368,20 @@
         <w:rPr>
           <w:rFonts w:cs="TimesNewRomanPSMT"/>
         </w:rPr>
-        <w:t xml:space="preserve">{% for lot in lots </w:t>
-      </w:r>
-      <w:proofErr w:type="gramStart"/>
-      <w:r>
-        <w:rPr>
-          <w:rFonts w:cs="TimesNewRomanPSMT"/>
-        </w:rPr>
-        <w:t>%}</w:t>
-      </w:r>
-      <w:r>
-        <w:rPr>
-          <w:color w:val="000000"/>
-        </w:rPr>
-        <w:t>{</w:t>
-      </w:r>
-      <w:proofErr w:type="gramEnd"/>
-      <w:r>
-        <w:rPr>
-          <w:color w:val="000000"/>
-        </w:rPr>
-        <w:t xml:space="preserve">% if </w:t>
+        <w:t>{% for lot in lots %}</w:t>
+      </w:r>
+      <w:r>
+        <w:rPr>
+          <w:color w:val="000000"/>
+        </w:rPr>
+        <w:t xml:space="preserve">{% if </w:t>
       </w:r>
       <w:proofErr w:type="spellStart"/>
-      <w:proofErr w:type="gramStart"/>
-      <w:r>
-        <w:rPr>
-          <w:color w:val="000000"/>
-        </w:rPr>
-        <w:t>lot.foyer</w:t>
-      </w:r>
-      <w:proofErr w:type="gramEnd"/>
-      <w:r>
-        <w:rPr>
-          <w:color w:val="000000"/>
-        </w:rPr>
-        <w:t>_residence_dependance</w:t>
+      <w:r>
+        <w:rPr>
+          <w:color w:val="000000"/>
+        </w:rPr>
+        <w:t>lot.foyer_residence_dependance</w:t>
       </w:r>
       <w:proofErr w:type="spellEnd"/>
       <w:r>
@@ -5631,7 +4405,6 @@
           <w:color w:val="000000"/>
         </w:rPr>
       </w:pPr>
-      <w:proofErr w:type="gramStart"/>
       <w:r>
         <w:rPr>
           <w:color w:val="000000"/>
@@ -5643,35 +4416,14 @@
         <w:rPr>
           <w:color w:val="000000"/>
         </w:rPr>
-        <w:t>lot</w:t>
-      </w:r>
-      <w:proofErr w:type="gramEnd"/>
-      <w:r>
-        <w:rPr>
-          <w:color w:val="000000"/>
-        </w:rPr>
-        <w:t>.foyer_residence_</w:t>
-      </w:r>
-      <w:proofErr w:type="gramStart"/>
-      <w:r>
-        <w:rPr>
-          <w:color w:val="000000"/>
-        </w:rPr>
-        <w:t>dependance</w:t>
+        <w:t>lot.foyer_residence_dependance</w:t>
       </w:r>
       <w:proofErr w:type="spellEnd"/>
       <w:r>
         <w:rPr>
           <w:color w:val="000000"/>
         </w:rPr>
-        <w:t xml:space="preserve"> }</w:t>
-      </w:r>
-      <w:proofErr w:type="gramEnd"/>
-      <w:r>
-        <w:rPr>
-          <w:color w:val="000000"/>
-        </w:rPr>
-        <w:t>}</w:t>
+        <w:t xml:space="preserve"> }}</w:t>
       </w:r>
     </w:p>
     <w:p>
@@ -5698,27 +4450,13 @@
         <w:rPr>
           <w:color w:val="000000"/>
         </w:rPr>
-        <w:t xml:space="preserve"> </w:t>
-      </w:r>
-      <w:proofErr w:type="gramStart"/>
-      <w:r>
-        <w:rPr>
-          <w:color w:val="000000"/>
-        </w:rPr>
-        <w:t>%}</w:t>
+        <w:t xml:space="preserve"> %}</w:t>
       </w:r>
       <w:r>
         <w:rPr>
           <w:rFonts w:cs="TimesNewRomanPSMT"/>
         </w:rPr>
-        <w:t>{</w:t>
-      </w:r>
-      <w:proofErr w:type="gramEnd"/>
-      <w:r>
-        <w:rPr>
-          <w:rFonts w:cs="TimesNewRomanPSMT"/>
-        </w:rPr>
-        <w:t xml:space="preserve">% </w:t>
+        <w:t xml:space="preserve">{% </w:t>
       </w:r>
       <w:proofErr w:type="spellStart"/>
       <w:r>
@@ -5809,21 +4547,12 @@
         <w:t xml:space="preserve">{% for line in </w:t>
       </w:r>
       <w:proofErr w:type="spellStart"/>
-      <w:proofErr w:type="gramStart"/>
       <w:r>
         <w:rPr>
           <w:color w:val="000000"/>
           <w:lang w:val="en-US"/>
         </w:rPr>
-        <w:t>lot.foyer</w:t>
-      </w:r>
-      <w:proofErr w:type="gramEnd"/>
-      <w:r>
-        <w:rPr>
-          <w:color w:val="000000"/>
-          <w:lang w:val="en-US"/>
-        </w:rPr>
-        <w:t>_residence_locaux_hors_convention|get_text_as_list</w:t>
+        <w:t>lot.foyer_residence_locaux_hors_convention|get_text_as_list</w:t>
       </w:r>
       <w:proofErr w:type="spellEnd"/>
       <w:r>
@@ -5852,19 +4581,11 @@
           <w:color w:val="000000" w:themeColor="text1"/>
         </w:rPr>
       </w:pPr>
-      <w:proofErr w:type="gramStart"/>
       <w:r>
         <w:rPr>
           <w:color w:val="000000" w:themeColor="text1"/>
         </w:rPr>
-        <w:t>{{ line</w:t>
-      </w:r>
-      <w:proofErr w:type="gramEnd"/>
-      <w:r>
-        <w:rPr>
-          <w:color w:val="000000" w:themeColor="text1"/>
-        </w:rPr>
-        <w:t xml:space="preserve"> }}</w:t>
+        <w:t>{{ line }}</w:t>
       </w:r>
     </w:p>
     <w:p>
@@ -5892,21 +4613,7 @@
         <w:rPr>
           <w:color w:val="000000"/>
         </w:rPr>
-        <w:t xml:space="preserve"> </w:t>
-      </w:r>
-      <w:proofErr w:type="gramStart"/>
-      <w:r>
-        <w:rPr>
-          <w:color w:val="000000"/>
-        </w:rPr>
-        <w:t>%}{</w:t>
-      </w:r>
-      <w:proofErr w:type="gramEnd"/>
-      <w:r>
-        <w:rPr>
-          <w:color w:val="000000"/>
-        </w:rPr>
-        <w:t xml:space="preserve">%- </w:t>
+        <w:t xml:space="preserve"> %}{%- </w:t>
       </w:r>
       <w:proofErr w:type="spellStart"/>
       <w:r>
@@ -6896,15 +5603,7 @@
             <w:pStyle w:val="Form9"/>
           </w:pPr>
           <w:r>
-            <w:t>(</w:t>
-          </w:r>
-          <w:proofErr w:type="gramStart"/>
-          <w:r>
-            <w:t>pour</w:t>
-          </w:r>
-          <w:proofErr w:type="gramEnd"/>
-          <w:r>
-            <w:t xml:space="preserve"> l'établissement d'expéditions, copies, extraits d'actes ou décisions judiciaires à publier)</w:t>
+            <w:t>(pour l'établissement d'expéditions, copies, extraits d'actes ou décisions judiciaires à publier)</w:t>
           </w:r>
         </w:p>
         <w:p/>
@@ -7098,11 +5797,9 @@
             </w:rPr>
             <w:t xml:space="preserve"> </w:t>
           </w:r>
-          <w:proofErr w:type="gramStart"/>
           <w:r>
             <w:t>TAXES:</w:t>
           </w:r>
-          <w:proofErr w:type="gramEnd"/>
         </w:p>
         <w:p>
           <w:pPr>
@@ -7121,11 +5818,9 @@
           <w:pPr>
             <w:pStyle w:val="Form10J"/>
           </w:pPr>
-          <w:proofErr w:type="gramStart"/>
           <w:r>
             <w:t>CSI:</w:t>
           </w:r>
-          <w:proofErr w:type="gramEnd"/>
         </w:p>
         <w:p>
           <w:pPr>
@@ -9286,7 +7981,6 @@
   <w:style w:type="character" w:default="1" w:styleId="Policepardfaut">
     <w:name w:val="Default Paragraph Font"/>
     <w:uiPriority w:val="1"/>
-    <w:semiHidden/>
     <w:unhideWhenUsed/>
   </w:style>
   <w:style w:type="table" w:default="1" w:styleId="TableauNormal">

</xml_diff>

<commit_message>
gestion singulier/pluriel dans les avenants 2nd vie
</commit_message>
<xml_diff>
--- a/documents/Avenant2ndeVie-Foyer-template.docx
+++ b/documents/Avenant2ndeVie-Foyer-template.docx
@@ -21,7 +21,7 @@
           <w:szCs w:val="22"/>
           <w:lang w:eastAsia="fr-FR"/>
         </w:rPr>
-        <w:t>Avenant aux conventions n°</w:t>
+        <w:t>{% if</w:t>
       </w:r>
       <w:r>
         <w:rPr>
@@ -29,7 +29,7 @@
           <w:szCs w:val="22"/>
           <w:lang w:eastAsia="fr-FR"/>
         </w:rPr>
-        <w:t xml:space="preserve">{% </w:t>
+        <w:t xml:space="preserve"> convention.</w:t>
       </w:r>
       <w:r>
         <w:rPr>
@@ -37,7 +37,7 @@
           <w:szCs w:val="22"/>
           <w:lang w:eastAsia="fr-FR"/>
         </w:rPr>
-        <w:t xml:space="preserve">for parent in </w:t>
+        <w:t>parents_2nd_vie</w:t>
       </w:r>
       <w:r>
         <w:rPr>
@@ -45,7 +45,7 @@
           <w:szCs w:val="22"/>
           <w:lang w:eastAsia="fr-FR"/>
         </w:rPr>
-        <w:t>convention.parents_2nd_vie.all()</w:t>
+        <w:t>.all()</w:t>
       </w:r>
       <w:r>
         <w:rPr>
@@ -53,7 +53,14 @@
           <w:szCs w:val="22"/>
           <w:lang w:eastAsia="fr-FR"/>
         </w:rPr>
-        <w:t xml:space="preserve"> %}{{</w:t>
+        <w:t>|length == 1 %}Avenant à la convention</w:t>
+      </w:r>
+      <w:r>
+        <w:rPr>
+          <w:rFonts w:cs="TimesNewRomanPSMT"/>
+          <w:bCs/>
+        </w:rPr>
+        <w:t>{% else %}</w:t>
       </w:r>
       <w:r>
         <w:rPr>
@@ -61,16 +68,22 @@
           <w:szCs w:val="22"/>
           <w:lang w:eastAsia="fr-FR"/>
         </w:rPr>
-        <w:t xml:space="preserve"> </w:t>
-      </w:r>
-      <w:proofErr w:type="spellStart"/>
+        <w:t>Avenant aux conventions</w:t>
+      </w:r>
+      <w:r>
+        <w:rPr>
+          <w:rFonts w:cs="TimesNewRomanPSMT"/>
+          <w:bCs/>
+        </w:rPr>
+        <w:t>{% endif %}</w:t>
+      </w:r>
       <w:r>
         <w:rPr>
           <w:color w:val="000000"/>
           <w:szCs w:val="22"/>
           <w:lang w:eastAsia="fr-FR"/>
         </w:rPr>
-        <w:t>parent</w:t>
+        <w:t xml:space="preserve"> n°</w:t>
       </w:r>
       <w:r>
         <w:rPr>
@@ -78,76 +91,65 @@
           <w:szCs w:val="22"/>
           <w:lang w:eastAsia="fr-FR"/>
         </w:rPr>
-        <w:t>.numero</w:t>
-      </w:r>
-      <w:proofErr w:type="spellEnd"/>
+        <w:t xml:space="preserve">{% </w:t>
+      </w:r>
       <w:r>
         <w:rPr>
           <w:color w:val="000000"/>
           <w:szCs w:val="22"/>
           <w:lang w:eastAsia="fr-FR"/>
         </w:rPr>
-        <w:t>}}</w:t>
+        <w:t xml:space="preserve">for parent in </w:t>
+      </w:r>
+      <w:r>
+        <w:rPr>
+          <w:color w:val="000000"/>
+          <w:szCs w:val="22"/>
+          <w:lang w:eastAsia="fr-FR"/>
+        </w:rPr>
+        <w:t>convention.parents_2nd_vie.all()</w:t>
+      </w:r>
+      <w:r>
+        <w:rPr>
+          <w:color w:val="000000"/>
+          <w:szCs w:val="22"/>
+          <w:lang w:eastAsia="fr-FR"/>
+        </w:rPr>
+        <w:t xml:space="preserve"> %}{{</w:t>
+      </w:r>
+      <w:r>
+        <w:rPr>
+          <w:color w:val="000000"/>
+          <w:szCs w:val="22"/>
+          <w:lang w:eastAsia="fr-FR"/>
+        </w:rPr>
+        <w:t xml:space="preserve"> parent</w:t>
+      </w:r>
+      <w:r>
+        <w:rPr>
+          <w:color w:val="000000"/>
+          <w:szCs w:val="22"/>
+          <w:lang w:eastAsia="fr-FR"/>
+        </w:rPr>
+        <w:t>.numero}}</w:t>
       </w:r>
       <w:r>
         <w:rPr>
           <w:rFonts w:cs="TimesNewRomanPSMT"/>
         </w:rPr>
-        <w:t xml:space="preserve">{% if not </w:t>
-      </w:r>
-      <w:proofErr w:type="spellStart"/>
+        <w:t>{% if not loop.last %},</w:t>
+      </w:r>
       <w:r>
         <w:rPr>
           <w:rFonts w:cs="TimesNewRomanPSMT"/>
         </w:rPr>
-        <w:t>loop.last</w:t>
-      </w:r>
-      <w:proofErr w:type="spellEnd"/>
+        <w:t xml:space="preserve"> </w:t>
+      </w:r>
       <w:r>
         <w:rPr>
           <w:rFonts w:cs="TimesNewRomanPSMT"/>
         </w:rPr>
-        <w:t xml:space="preserve"> %},</w:t>
-      </w:r>
-      <w:r>
-        <w:rPr>
-          <w:rFonts w:cs="TimesNewRomanPSMT"/>
-        </w:rPr>
-        <w:t xml:space="preserve"> </w:t>
-      </w:r>
-      <w:r>
-        <w:rPr>
-          <w:rFonts w:cs="TimesNewRomanPSMT"/>
-        </w:rPr>
-        <w:t xml:space="preserve">{% </w:t>
-      </w:r>
-      <w:proofErr w:type="spellStart"/>
-      <w:r>
-        <w:rPr>
-          <w:rFonts w:cs="TimesNewRomanPSMT"/>
-        </w:rPr>
-        <w:t>endif</w:t>
-      </w:r>
-      <w:proofErr w:type="spellEnd"/>
-      <w:r>
-        <w:rPr>
-          <w:rFonts w:cs="TimesNewRomanPSMT"/>
-        </w:rPr>
-        <w:t xml:space="preserve"> %}{% </w:t>
-      </w:r>
-      <w:proofErr w:type="spellStart"/>
-      <w:r>
-        <w:rPr>
-          <w:rFonts w:cs="TimesNewRomanPSMT"/>
-        </w:rPr>
-        <w:t>endfor</w:t>
-      </w:r>
-      <w:proofErr w:type="spellEnd"/>
-      <w:r>
-        <w:rPr>
-          <w:rFonts w:cs="TimesNewRomanPSMT"/>
-        </w:rPr>
-        <w:t xml:space="preserve"> %}</w:t>
+        <w:t>{% endif %}{% endfor %}</w:t>
       </w:r>
     </w:p>
     <w:p>
@@ -215,7 +217,7 @@
           <w:szCs w:val="22"/>
           <w:lang w:eastAsia="fr-FR"/>
         </w:rPr>
-        <w:t>Les conventions n°</w:t>
+        <w:t>{% if</w:t>
       </w:r>
       <w:r>
         <w:rPr>
@@ -223,7 +225,7 @@
           <w:szCs w:val="22"/>
           <w:lang w:eastAsia="fr-FR"/>
         </w:rPr>
-        <w:t xml:space="preserve">{% </w:t>
+        <w:t xml:space="preserve"> convention.</w:t>
       </w:r>
       <w:r>
         <w:rPr>
@@ -231,7 +233,7 @@
           <w:szCs w:val="22"/>
           <w:lang w:eastAsia="fr-FR"/>
         </w:rPr>
-        <w:t xml:space="preserve">for parent in </w:t>
+        <w:t>parents_2nd_vie</w:t>
       </w:r>
       <w:r>
         <w:rPr>
@@ -239,7 +241,7 @@
           <w:szCs w:val="22"/>
           <w:lang w:eastAsia="fr-FR"/>
         </w:rPr>
-        <w:t>convention.parents_2nd_vie.all()</w:t>
+        <w:t>.all()</w:t>
       </w:r>
       <w:r>
         <w:rPr>
@@ -247,7 +249,14 @@
           <w:szCs w:val="22"/>
           <w:lang w:eastAsia="fr-FR"/>
         </w:rPr>
-        <w:t xml:space="preserve"> %}{{</w:t>
+        <w:t>|length == 1 %}La convention</w:t>
+      </w:r>
+      <w:r>
+        <w:rPr>
+          <w:rFonts w:cs="TimesNewRomanPSMT"/>
+          <w:bCs/>
+        </w:rPr>
+        <w:t>{% else %}</w:t>
       </w:r>
       <w:r>
         <w:rPr>
@@ -257,14 +266,20 @@
         </w:rPr>
         <w:t xml:space="preserve"> </w:t>
       </w:r>
-      <w:proofErr w:type="spellStart"/>
       <w:r>
         <w:rPr>
           <w:color w:val="000000"/>
           <w:szCs w:val="22"/>
           <w:lang w:eastAsia="fr-FR"/>
         </w:rPr>
-        <w:t>parent</w:t>
+        <w:t>Les conventions</w:t>
+      </w:r>
+      <w:r>
+        <w:rPr>
+          <w:rFonts w:cs="TimesNewRomanPSMT"/>
+          <w:bCs/>
+        </w:rPr>
+        <w:t xml:space="preserve"> {% endif %}</w:t>
       </w:r>
       <w:r>
         <w:rPr>
@@ -272,76 +287,15 @@
           <w:szCs w:val="22"/>
           <w:lang w:eastAsia="fr-FR"/>
         </w:rPr>
-        <w:t>.numero</w:t>
-      </w:r>
-      <w:proofErr w:type="spellEnd"/>
+        <w:t xml:space="preserve"> n°</w:t>
+      </w:r>
       <w:r>
         <w:rPr>
           <w:color w:val="000000"/>
           <w:szCs w:val="22"/>
           <w:lang w:eastAsia="fr-FR"/>
         </w:rPr>
-        <w:t>}}</w:t>
-      </w:r>
-      <w:r>
-        <w:rPr>
-          <w:rFonts w:cs="TimesNewRomanPSMT"/>
-        </w:rPr>
-        <w:t xml:space="preserve">{% if not </w:t>
-      </w:r>
-      <w:proofErr w:type="spellStart"/>
-      <w:r>
-        <w:rPr>
-          <w:rFonts w:cs="TimesNewRomanPSMT"/>
-        </w:rPr>
-        <w:t>loop.last</w:t>
-      </w:r>
-      <w:proofErr w:type="spellEnd"/>
-      <w:r>
-        <w:rPr>
-          <w:rFonts w:cs="TimesNewRomanPSMT"/>
-        </w:rPr>
-        <w:t xml:space="preserve"> %},</w:t>
-      </w:r>
-      <w:r>
-        <w:rPr>
-          <w:rFonts w:cs="TimesNewRomanPSMT"/>
-        </w:rPr>
-        <w:t xml:space="preserve"> </w:t>
-      </w:r>
-      <w:r>
-        <w:rPr>
-          <w:rFonts w:cs="TimesNewRomanPSMT"/>
-        </w:rPr>
         <w:t xml:space="preserve">{% </w:t>
-      </w:r>
-      <w:proofErr w:type="spellStart"/>
-      <w:r>
-        <w:rPr>
-          <w:rFonts w:cs="TimesNewRomanPSMT"/>
-        </w:rPr>
-        <w:t>endif</w:t>
-      </w:r>
-      <w:proofErr w:type="spellEnd"/>
-      <w:r>
-        <w:rPr>
-          <w:rFonts w:cs="TimesNewRomanPSMT"/>
-        </w:rPr>
-        <w:t xml:space="preserve"> %}{% </w:t>
-      </w:r>
-      <w:proofErr w:type="spellStart"/>
-      <w:r>
-        <w:rPr>
-          <w:rFonts w:cs="TimesNewRomanPSMT"/>
-        </w:rPr>
-        <w:t>endfor</w:t>
-      </w:r>
-      <w:proofErr w:type="spellEnd"/>
-      <w:r>
-        <w:rPr>
-          <w:rFonts w:cs="TimesNewRomanPSMT"/>
-        </w:rPr>
-        <w:t xml:space="preserve"> %}</w:t>
       </w:r>
       <w:r>
         <w:rPr>
@@ -349,7 +303,7 @@
           <w:szCs w:val="22"/>
           <w:lang w:eastAsia="fr-FR"/>
         </w:rPr>
-        <w:t xml:space="preserve"> sont modifiées à l'issue des travaux réalisés dans le cadre de l'opération de réhabilitation "seconde vie" n°</w:t>
+        <w:t xml:space="preserve">for parent in </w:t>
       </w:r>
       <w:r>
         <w:rPr>
@@ -357,25 +311,143 @@
           <w:szCs w:val="22"/>
           <w:lang w:eastAsia="fr-FR"/>
         </w:rPr>
-        <w:t>{{</w:t>
-      </w:r>
-      <w:proofErr w:type="spellStart"/>
+        <w:t>convention.parents_2nd_vie.all()</w:t>
+      </w:r>
       <w:r>
         <w:rPr>
           <w:color w:val="000000"/>
           <w:szCs w:val="22"/>
           <w:lang w:eastAsia="fr-FR"/>
         </w:rPr>
-        <w:t>convention.programme.numero_operation</w:t>
-      </w:r>
-      <w:proofErr w:type="spellEnd"/>
+        <w:t xml:space="preserve"> %}{{</w:t>
+      </w:r>
       <w:r>
         <w:rPr>
           <w:color w:val="000000"/>
           <w:szCs w:val="22"/>
           <w:lang w:eastAsia="fr-FR"/>
         </w:rPr>
-        <w:t>}}</w:t>
+        <w:t xml:space="preserve"> parent</w:t>
+      </w:r>
+      <w:r>
+        <w:rPr>
+          <w:color w:val="000000"/>
+          <w:szCs w:val="22"/>
+          <w:lang w:eastAsia="fr-FR"/>
+        </w:rPr>
+        <w:t>.numero}}</w:t>
+      </w:r>
+      <w:r>
+        <w:rPr>
+          <w:rFonts w:cs="TimesNewRomanPSMT"/>
+        </w:rPr>
+        <w:t>{% if not loop.last %},</w:t>
+      </w:r>
+      <w:r>
+        <w:rPr>
+          <w:rFonts w:cs="TimesNewRomanPSMT"/>
+        </w:rPr>
+        <w:t xml:space="preserve"> </w:t>
+      </w:r>
+      <w:r>
+        <w:rPr>
+          <w:rFonts w:cs="TimesNewRomanPSMT"/>
+        </w:rPr>
+        <w:t>{% endif %}{% endfor %}</w:t>
+      </w:r>
+      <w:r>
+        <w:rPr>
+          <w:color w:val="000000"/>
+          <w:szCs w:val="22"/>
+          <w:lang w:eastAsia="fr-FR"/>
+        </w:rPr>
+        <w:t xml:space="preserve"> </w:t>
+      </w:r>
+      <w:r>
+        <w:rPr>
+          <w:color w:val="000000"/>
+          <w:szCs w:val="22"/>
+          <w:lang w:eastAsia="fr-FR"/>
+        </w:rPr>
+        <w:t>{% if</w:t>
+      </w:r>
+      <w:r>
+        <w:rPr>
+          <w:color w:val="000000"/>
+          <w:szCs w:val="22"/>
+          <w:lang w:eastAsia="fr-FR"/>
+        </w:rPr>
+        <w:t xml:space="preserve"> convention.</w:t>
+      </w:r>
+      <w:r>
+        <w:rPr>
+          <w:color w:val="000000"/>
+          <w:szCs w:val="22"/>
+          <w:lang w:eastAsia="fr-FR"/>
+        </w:rPr>
+        <w:t>parents_2nd_vie</w:t>
+      </w:r>
+      <w:r>
+        <w:rPr>
+          <w:color w:val="000000"/>
+          <w:szCs w:val="22"/>
+          <w:lang w:eastAsia="fr-FR"/>
+        </w:rPr>
+        <w:t>.all()</w:t>
+      </w:r>
+      <w:r>
+        <w:rPr>
+          <w:color w:val="000000"/>
+          <w:szCs w:val="22"/>
+          <w:lang w:eastAsia="fr-FR"/>
+        </w:rPr>
+        <w:t>|length == 1 %}</w:t>
+      </w:r>
+      <w:r>
+        <w:rPr>
+          <w:color w:val="000000"/>
+          <w:szCs w:val="22"/>
+          <w:lang w:eastAsia="fr-FR"/>
+        </w:rPr>
+        <w:t>est modifiée</w:t>
+      </w:r>
+      <w:r>
+        <w:rPr>
+          <w:rFonts w:cs="TimesNewRomanPSMT"/>
+          <w:bCs/>
+        </w:rPr>
+        <w:t>{% else %}</w:t>
+      </w:r>
+      <w:r>
+        <w:rPr>
+          <w:color w:val="000000"/>
+          <w:szCs w:val="22"/>
+          <w:lang w:eastAsia="fr-FR"/>
+        </w:rPr>
+        <w:t>sont modifiées</w:t>
+      </w:r>
+      <w:r>
+        <w:rPr>
+          <w:rFonts w:cs="TimesNewRomanPSMT"/>
+          <w:bCs/>
+        </w:rPr>
+        <w:t>{% endif %}</w:t>
+      </w:r>
+      <w:r>
+        <w:rPr>
+          <w:color w:val="000000"/>
+          <w:szCs w:val="22"/>
+          <w:lang w:eastAsia="fr-FR"/>
+        </w:rPr>
+        <w:t xml:space="preserve"> à l'issue des travaux réalisés dans le cadre de l'opération de réhabilitation "seconde vie" n°</w:t>
+      </w:r>
+      <w:r>
+        <w:rPr>
+          <w:color w:val="000000"/>
+          <w:szCs w:val="22"/>
+          <w:lang w:eastAsia="fr-FR"/>
+        </w:rPr>
+        <w:t>{{convention.programme.numero_operation}}</w:t>
       </w:r>
       <w:r>
         <w:rPr>
@@ -451,7 +523,101 @@
           <w:szCs w:val="22"/>
           <w:lang w:eastAsia="fr-FR"/>
         </w:rPr>
-        <w:t>La date d’expiration des conventions mentionnées à l’article 1</w:t>
+        <w:t xml:space="preserve">La date d’expiration </w:t>
+      </w:r>
+      <w:r>
+        <w:rPr>
+          <w:color w:val="000000"/>
+          <w:szCs w:val="22"/>
+          <w:lang w:eastAsia="fr-FR"/>
+        </w:rPr>
+        <w:t>{% if</w:t>
+      </w:r>
+      <w:r>
+        <w:rPr>
+          <w:color w:val="000000"/>
+          <w:szCs w:val="22"/>
+          <w:lang w:eastAsia="fr-FR"/>
+        </w:rPr>
+        <w:t xml:space="preserve"> convention.</w:t>
+      </w:r>
+      <w:r>
+        <w:rPr>
+          <w:color w:val="000000"/>
+          <w:szCs w:val="22"/>
+          <w:lang w:eastAsia="fr-FR"/>
+        </w:rPr>
+        <w:t>parents_2nd_vie</w:t>
+      </w:r>
+      <w:r>
+        <w:rPr>
+          <w:color w:val="000000"/>
+          <w:szCs w:val="22"/>
+          <w:lang w:eastAsia="fr-FR"/>
+        </w:rPr>
+        <w:t>.all()</w:t>
+      </w:r>
+      <w:r>
+        <w:rPr>
+          <w:color w:val="000000"/>
+          <w:szCs w:val="22"/>
+          <w:lang w:eastAsia="fr-FR"/>
+        </w:rPr>
+        <w:t>|length == 1 %}</w:t>
+      </w:r>
+      <w:r>
+        <w:rPr>
+          <w:color w:val="000000"/>
+          <w:szCs w:val="22"/>
+          <w:lang w:eastAsia="fr-FR"/>
+        </w:rPr>
+        <w:t>de l</w:t>
+      </w:r>
+      <w:r>
+        <w:rPr>
+          <w:color w:val="000000"/>
+          <w:szCs w:val="22"/>
+          <w:lang w:eastAsia="fr-FR"/>
+        </w:rPr>
+        <w:t xml:space="preserve">a convention </w:t>
+      </w:r>
+      <w:r>
+        <w:rPr>
+          <w:color w:val="000000"/>
+          <w:szCs w:val="22"/>
+          <w:lang w:eastAsia="fr-FR"/>
+        </w:rPr>
+        <w:t>mentionnée</w:t>
+      </w:r>
+      <w:r>
+        <w:rPr>
+          <w:rFonts w:cs="TimesNewRomanPSMT"/>
+          <w:bCs/>
+        </w:rPr>
+        <w:t>{% else %}</w:t>
+      </w:r>
+      <w:r>
+        <w:rPr>
+          <w:color w:val="000000"/>
+          <w:szCs w:val="22"/>
+          <w:lang w:eastAsia="fr-FR"/>
+        </w:rPr>
+        <w:t>des conventions mentionnées</w:t>
+      </w:r>
+      <w:r>
+        <w:rPr>
+          <w:rFonts w:cs="TimesNewRomanPSMT"/>
+          <w:bCs/>
+        </w:rPr>
+        <w:t>{% endif %}</w:t>
+      </w:r>
+      <w:r>
+        <w:rPr>
+          <w:color w:val="000000"/>
+          <w:szCs w:val="22"/>
+          <w:lang w:eastAsia="fr-FR"/>
+        </w:rPr>
+        <w:t xml:space="preserve"> à l’article 1</w:t>
       </w:r>
       <w:r>
         <w:rPr>
@@ -488,27 +654,97 @@
           <w:szCs w:val="22"/>
           <w:lang w:eastAsia="fr-FR"/>
         </w:rPr>
-        <w:t xml:space="preserve">Les conventions expirent le </w:t>
+        <w:t>{% if</w:t>
+      </w:r>
+      <w:r>
+        <w:rPr>
+          <w:color w:val="000000"/>
+          <w:szCs w:val="22"/>
+          <w:lang w:eastAsia="fr-FR"/>
+        </w:rPr>
+        <w:t xml:space="preserve"> convention.</w:t>
+      </w:r>
+      <w:r>
+        <w:rPr>
+          <w:color w:val="000000"/>
+          <w:szCs w:val="22"/>
+          <w:lang w:eastAsia="fr-FR"/>
+        </w:rPr>
+        <w:t>parents_2nd_vie</w:t>
+      </w:r>
+      <w:r>
+        <w:rPr>
+          <w:color w:val="000000"/>
+          <w:szCs w:val="22"/>
+          <w:lang w:eastAsia="fr-FR"/>
+        </w:rPr>
+        <w:t>.all()</w:t>
+      </w:r>
+      <w:r>
+        <w:rPr>
+          <w:color w:val="000000"/>
+          <w:szCs w:val="22"/>
+          <w:lang w:eastAsia="fr-FR"/>
+        </w:rPr>
+        <w:t>|length == 1 %}La convention expire</w:t>
       </w:r>
       <w:r>
         <w:rPr>
           <w:rFonts w:cs="TimesNewRomanPSMT"/>
-        </w:rPr>
-        <w:t xml:space="preserve">{{ </w:t>
-      </w:r>
-      <w:proofErr w:type="spellStart"/>
+          <w:bCs/>
+        </w:rPr>
+        <w:t>{% else %}</w:t>
+      </w:r>
+      <w:r>
+        <w:rPr>
+          <w:color w:val="000000"/>
+          <w:szCs w:val="22"/>
+          <w:lang w:eastAsia="fr-FR"/>
+        </w:rPr>
+        <w:t xml:space="preserve"> </w:t>
+      </w:r>
+      <w:r>
+        <w:rPr>
+          <w:color w:val="000000"/>
+          <w:szCs w:val="22"/>
+          <w:lang w:eastAsia="fr-FR"/>
+        </w:rPr>
+        <w:t>Les conventions</w:t>
+      </w:r>
       <w:r>
         <w:rPr>
           <w:rFonts w:cs="TimesNewRomanPSMT"/>
-        </w:rPr>
-        <w:t>convention.date_fin_conventionnement|d</w:t>
-      </w:r>
-      <w:proofErr w:type="spellEnd"/>
+          <w:bCs/>
+        </w:rPr>
+        <w:t xml:space="preserve"> </w:t>
+      </w:r>
       <w:r>
         <w:rPr>
           <w:rFonts w:cs="TimesNewRomanPSMT"/>
-        </w:rPr>
-        <w:t xml:space="preserve"> }}</w:t>
+          <w:bCs/>
+        </w:rPr>
+        <w:t>expirent</w:t>
+      </w:r>
+      <w:r>
+        <w:rPr>
+          <w:rFonts w:cs="TimesNewRomanPSMT"/>
+          <w:bCs/>
+        </w:rPr>
+        <w:t>{% endif %}</w:t>
+      </w:r>
+      <w:r>
+        <w:rPr>
+          <w:color w:val="000000"/>
+          <w:szCs w:val="22"/>
+          <w:lang w:eastAsia="fr-FR"/>
+        </w:rPr>
+        <w:t xml:space="preserve"> le </w:t>
+      </w:r>
+      <w:r>
+        <w:rPr>
+          <w:rFonts w:cs="TimesNewRomanPSMT"/>
+        </w:rPr>
+        <w:t>{{ convention.date_fin_conventionnement|d }}</w:t>
       </w:r>
     </w:p>
     <w:p>
@@ -588,7 +824,11 @@
         <w:t xml:space="preserve"> </w:t>
       </w:r>
       <w:r>
-        <w:t>des conventions mentionnées à l’article 1</w:t>
+        <w:t xml:space="preserve">des conventions mentionnées à l’article </w:t>
+      </w:r>
+      <w:r>
+        <w:lastRenderedPageBreak/>
+        <w:t>1</w:t>
       </w:r>
       <w:r>
         <w:rPr>
@@ -620,7 +860,7 @@
           <w:kern w:val="2"/>
           <w:lang w:eastAsia="zh-CN" w:bidi="hi-IN"/>
         </w:rPr>
-        <w:t xml:space="preserve">La part de la redevance mensuelle prise en compte pour le calcul de l'aide personnalisée au logement, assimilable au loyer et aux charges locatives récupérables, acquittée par le résident, hors dépenses liées aux prestations définies à l'article 12, ne doit pas excéder un maximum qui est fixé en euros par type de logement et dont le montant est inscrit </w:t>
+        <w:t xml:space="preserve">La part de la redevance mensuelle prise en compte pour le calcul de l'aide personnalisée au logement, assimilable au loyer et aux charges locatives récupérables, acquittée par le résident, hors dépenses liées aux prestations définies à l'article 12, ne doit pas excéder un maximum qui est fixé en euros par type de logement et dont le montant est inscrit dans le tableau du III de l'annexe </w:t>
       </w:r>
       <w:r>
         <w:rPr>
@@ -628,8 +868,7 @@
           <w:kern w:val="2"/>
           <w:lang w:eastAsia="zh-CN" w:bidi="hi-IN"/>
         </w:rPr>
-        <w:lastRenderedPageBreak/>
-        <w:t xml:space="preserve">dans le tableau du III de l'annexe </w:t>
+        <w:t>au</w:t>
       </w:r>
       <w:r>
         <w:rPr>
@@ -637,7 +876,7 @@
           <w:kern w:val="2"/>
           <w:lang w:eastAsia="zh-CN" w:bidi="hi-IN"/>
         </w:rPr>
-        <w:t>au</w:t>
+        <w:t xml:space="preserve"> présent</w:t>
       </w:r>
       <w:r>
         <w:rPr>
@@ -645,7 +884,7 @@
           <w:kern w:val="2"/>
           <w:lang w:eastAsia="zh-CN" w:bidi="hi-IN"/>
         </w:rPr>
-        <w:t xml:space="preserve"> présent</w:t>
+        <w:t xml:space="preserve"> avenant</w:t>
       </w:r>
       <w:r>
         <w:rPr>
@@ -653,7 +892,7 @@
           <w:kern w:val="2"/>
           <w:lang w:eastAsia="zh-CN" w:bidi="hi-IN"/>
         </w:rPr>
-        <w:t xml:space="preserve"> avenant</w:t>
+        <w:t xml:space="preserve"> applicable au logement concerné selon le type de prêt locatif aidé ayant permis sa  rénovation</w:t>
       </w:r>
       <w:r>
         <w:rPr>
@@ -661,35 +900,35 @@
           <w:kern w:val="2"/>
           <w:lang w:eastAsia="zh-CN" w:bidi="hi-IN"/>
         </w:rPr>
-        <w:t xml:space="preserve"> applicable au logement concerné selon le type de prêt locatif aidé ayant permis sa  rénovation</w:t>
-      </w:r>
-      <w:r>
+        <w:t>.</w:t>
+      </w:r>
+    </w:p>
+    <w:p>
+      <w:pPr>
+        <w:widowControl w:val="0"/>
+        <w:spacing w:after="140" w:line="288" w:lineRule="auto"/>
+        <w:jc w:val="both"/>
         <w:rPr>
           <w:rFonts w:eastAsia="SimSun;宋体"/>
           <w:kern w:val="2"/>
           <w:lang w:eastAsia="zh-CN" w:bidi="hi-IN"/>
         </w:rPr>
-        <w:t>.</w:t>
-      </w:r>
-    </w:p>
-    <w:p>
-      <w:pPr>
-        <w:widowControl w:val="0"/>
-        <w:spacing w:after="140" w:line="288" w:lineRule="auto"/>
-        <w:jc w:val="both"/>
+      </w:pPr>
+      <w:r>
         <w:rPr>
           <w:rFonts w:eastAsia="SimSun;宋体"/>
           <w:kern w:val="2"/>
           <w:lang w:eastAsia="zh-CN" w:bidi="hi-IN"/>
         </w:rPr>
-      </w:pPr>
+        <w:t>Lorsque l</w:t>
+      </w:r>
       <w:r>
         <w:rPr>
           <w:rFonts w:eastAsia="SimSun;宋体"/>
           <w:kern w:val="2"/>
           <w:lang w:eastAsia="zh-CN" w:bidi="hi-IN"/>
         </w:rPr>
-        <w:t>Lorsque l</w:t>
+        <w:t>a rénovation du</w:t>
       </w:r>
       <w:r>
         <w:rPr>
@@ -697,33 +936,7 @@
           <w:kern w:val="2"/>
           <w:lang w:eastAsia="zh-CN" w:bidi="hi-IN"/>
         </w:rPr>
-        <w:t>a rénovation du</w:t>
-      </w:r>
-      <w:r>
-        <w:rPr>
-          <w:rFonts w:eastAsia="SimSun;宋体"/>
-          <w:kern w:val="2"/>
-          <w:lang w:eastAsia="zh-CN" w:bidi="hi-IN"/>
-        </w:rPr>
-        <w:t xml:space="preserve"> logement-foyer a bénéficié de plus d’un prêt locatif aidé (</w:t>
-      </w:r>
-      <w:proofErr w:type="spellStart"/>
-      <w:r>
-        <w:rPr>
-          <w:rFonts w:eastAsia="SimSun;宋体"/>
-          <w:kern w:val="2"/>
-          <w:lang w:eastAsia="zh-CN" w:bidi="hi-IN"/>
-        </w:rPr>
-        <w:t>PLAi</w:t>
-      </w:r>
-      <w:proofErr w:type="spellEnd"/>
-      <w:r>
-        <w:rPr>
-          <w:rFonts w:eastAsia="SimSun;宋体"/>
-          <w:kern w:val="2"/>
-          <w:lang w:eastAsia="zh-CN" w:bidi="hi-IN"/>
-        </w:rPr>
-        <w:t xml:space="preserve">, PLUS, PLS), une redevance maximale est déterminée pour chacun des prêts obtenus et le tableau III de l’annexe </w:t>
+        <w:t xml:space="preserve"> logement-foyer a bénéficié de plus d’un prêt locatif aidé (PLAi, PLUS, PLS), une redevance maximale est déterminée pour chacun des prêts obtenus et le tableau III de l’annexe </w:t>
       </w:r>
       <w:r>
         <w:rPr>
@@ -962,21 +1175,7 @@
         <w:rPr>
           <w:color w:val="000000"/>
         </w:rPr>
-        <w:t>Fait à {{</w:t>
-      </w:r>
-      <w:proofErr w:type="spellStart"/>
-      <w:r>
-        <w:rPr>
-          <w:color w:val="000000"/>
-        </w:rPr>
-        <w:t>administration.get_ville_signature_or_empty</w:t>
-      </w:r>
-      <w:proofErr w:type="spellEnd"/>
-      <w:r>
-        <w:rPr>
-          <w:color w:val="000000"/>
-        </w:rPr>
-        <w:t>() }}, le</w:t>
+        <w:t>Fait à {{administration.get_ville_signature_or_empty() }}, le</w:t>
       </w:r>
     </w:p>
     <w:p>
@@ -1000,77 +1199,7 @@
         <w:rPr>
           <w:color w:val="000000"/>
         </w:rPr>
-        <w:t xml:space="preserve">Le propriétaire (6), {%  if </w:t>
-      </w:r>
-      <w:proofErr w:type="spellStart"/>
-      <w:r>
-        <w:rPr>
-          <w:color w:val="000000"/>
-        </w:rPr>
-        <w:t>convention.signataire_bloc_signature</w:t>
-      </w:r>
-      <w:proofErr w:type="spellEnd"/>
-      <w:r>
-        <w:rPr>
-          <w:color w:val="000000"/>
-        </w:rPr>
-        <w:t xml:space="preserve"> %}{{ </w:t>
-      </w:r>
-      <w:proofErr w:type="spellStart"/>
-      <w:r>
-        <w:rPr>
-          <w:color w:val="000000"/>
-        </w:rPr>
-        <w:t>convention.signataire_bloc_signature|default_empty_if_none</w:t>
-      </w:r>
-      <w:proofErr w:type="spellEnd"/>
-      <w:r>
-        <w:rPr>
-          <w:color w:val="000000"/>
-        </w:rPr>
-        <w:t xml:space="preserve"> }}{% </w:t>
-      </w:r>
-      <w:proofErr w:type="spellStart"/>
-      <w:r>
-        <w:rPr>
-          <w:color w:val="000000"/>
-        </w:rPr>
-        <w:t>else</w:t>
-      </w:r>
-      <w:proofErr w:type="spellEnd"/>
-      <w:r>
-        <w:rPr>
-          <w:color w:val="000000"/>
-        </w:rPr>
-        <w:t xml:space="preserve"> %} {{ </w:t>
-      </w:r>
-      <w:proofErr w:type="spellStart"/>
-      <w:r>
-        <w:rPr>
-          <w:color w:val="000000"/>
-        </w:rPr>
-        <w:t>bailleur.signataire_bloc_signature|default_empty_if_none</w:t>
-      </w:r>
-      <w:proofErr w:type="spellEnd"/>
-      <w:r>
-        <w:rPr>
-          <w:color w:val="000000"/>
-        </w:rPr>
-        <w:t xml:space="preserve"> }}{% </w:t>
-      </w:r>
-      <w:proofErr w:type="spellStart"/>
-      <w:r>
-        <w:rPr>
-          <w:color w:val="000000"/>
-        </w:rPr>
-        <w:t>endif</w:t>
-      </w:r>
-      <w:proofErr w:type="spellEnd"/>
-      <w:r>
-        <w:rPr>
-          <w:color w:val="000000"/>
-        </w:rPr>
-        <w:t xml:space="preserve"> %}</w:t>
+        <w:t>Le propriétaire (6), {%  if convention.signataire_bloc_signature %}{{ convention.signataire_bloc_signature|default_empty_if_none }}{% else %} {{ bailleur.signataire_bloc_signature|default_empty_if_none }}{% endif %}</w:t>
       </w:r>
     </w:p>
     <w:p>
@@ -1121,6 +1250,7 @@
         <w:rPr>
           <w:color w:val="000000"/>
         </w:rPr>
+        <w:lastRenderedPageBreak/>
         <w:t>Le gestionnaire (6), {{ convention.gestionnaire_signataire_bloc_signature|default_empty_if_none }}</w:t>
       </w:r>
     </w:p>
@@ -1178,69 +1308,13 @@
         <w:rPr>
           <w:shd w:val="clear" w:color="auto" w:fill="FFFFFF"/>
         </w:rPr>
-        <w:t xml:space="preserve">Le préfet, le président de l'établissement public de coopération intercommunale, {% if </w:t>
-      </w:r>
-      <w:proofErr w:type="spellStart"/>
-      <w:r>
-        <w:rPr>
-          <w:shd w:val="clear" w:color="auto" w:fill="FFFFFF"/>
-        </w:rPr>
-        <w:t>outre_mer</w:t>
-      </w:r>
-      <w:proofErr w:type="spellEnd"/>
-      <w:r>
-        <w:rPr>
-          <w:shd w:val="clear" w:color="auto" w:fill="FFFFFF"/>
-        </w:rPr>
-        <w:t xml:space="preserve"> %}le président du conseil départemental de Guadeloupe, de La Réunion, de Mayotte, de l'assemblée de Guyane, du conseil exécutif de Martinique{% </w:t>
-      </w:r>
-      <w:proofErr w:type="spellStart"/>
-      <w:r>
-        <w:rPr>
-          <w:shd w:val="clear" w:color="auto" w:fill="FFFFFF"/>
-        </w:rPr>
-        <w:t>else</w:t>
-      </w:r>
-      <w:proofErr w:type="spellEnd"/>
-      <w:r>
-        <w:rPr>
-          <w:shd w:val="clear" w:color="auto" w:fill="FFFFFF"/>
-        </w:rPr>
-        <w:t xml:space="preserve"> %}du conseil départemental, de la métropole de Lyon, de la métropole du Grand Paris, de la métropole d’Aix-Marseille-Provence, ou du conseil exécutif de Corse,{% </w:t>
-      </w:r>
-      <w:proofErr w:type="spellStart"/>
-      <w:r>
-        <w:rPr>
-          <w:shd w:val="clear" w:color="auto" w:fill="FFFFFF"/>
-        </w:rPr>
-        <w:t>endif</w:t>
-      </w:r>
-      <w:proofErr w:type="spellEnd"/>
-      <w:r>
-        <w:rPr>
-          <w:shd w:val="clear" w:color="auto" w:fill="FFFFFF"/>
-        </w:rPr>
-        <w:t xml:space="preserve">  %}</w:t>
-      </w:r>
-      <w:r>
-        <w:rPr>
-          <w:color w:val="000000"/>
-        </w:rPr>
-        <w:t xml:space="preserve"> {{ </w:t>
-      </w:r>
-      <w:proofErr w:type="spellStart"/>
-      <w:r>
-        <w:rPr>
-          <w:color w:val="000000"/>
-        </w:rPr>
-        <w:t>administration.signataire_bloc_signature|default_empty_if_none</w:t>
-      </w:r>
-      <w:proofErr w:type="spellEnd"/>
-      <w:r>
-        <w:rPr>
-          <w:color w:val="000000"/>
-        </w:rPr>
-        <w:t xml:space="preserve"> }}</w:t>
+        <w:t>Le préfet, le président de l'établissement public de coopération intercommunale, {% if outre_mer %}le président du conseil départemental de Guadeloupe, de La Réunion, de Mayotte, de l'assemblée de Guyane, du conseil exécutif de Martinique{% else %}du conseil départemental, de la métropole de Lyon, de la métropole du Grand Paris, de la métropole d’Aix-Marseille-Provence, ou du conseil exécutif de Corse,{% endif  %}</w:t>
+      </w:r>
+      <w:r>
+        <w:rPr>
+          <w:color w:val="000000"/>
+        </w:rPr>
+        <w:t xml:space="preserve"> {{ administration.signataire_bloc_signature|default_empty_if_none }}</w:t>
       </w:r>
     </w:p>
     <w:p>
@@ -1308,29 +1382,7 @@
           <w:szCs w:val="22"/>
           <w:lang w:eastAsia="fr-FR"/>
         </w:rPr>
-        <w:t xml:space="preserve"> %}{{ </w:t>
-      </w:r>
-      <w:proofErr w:type="spellStart"/>
-      <w:r>
-        <w:rPr>
-          <w:b/>
-          <w:bCs/>
-          <w:color w:val="000000"/>
-          <w:szCs w:val="22"/>
-          <w:lang w:eastAsia="fr-FR"/>
-        </w:rPr>
-        <w:t>parent.numero</w:t>
-      </w:r>
-      <w:proofErr w:type="spellEnd"/>
-      <w:r>
-        <w:rPr>
-          <w:b/>
-          <w:bCs/>
-          <w:color w:val="000000"/>
-          <w:szCs w:val="22"/>
-          <w:lang w:eastAsia="fr-FR"/>
-        </w:rPr>
-        <w:t>}}</w:t>
+        <w:t xml:space="preserve"> %}{{ parent.numero}}</w:t>
       </w:r>
       <w:r>
         <w:rPr>
@@ -1338,61 +1390,7 @@
           <w:b/>
           <w:bCs/>
         </w:rPr>
-        <w:t xml:space="preserve">{% if not </w:t>
-      </w:r>
-      <w:proofErr w:type="spellStart"/>
-      <w:r>
-        <w:rPr>
-          <w:rFonts w:cs="TimesNewRomanPSMT"/>
-          <w:b/>
-          <w:bCs/>
-        </w:rPr>
-        <w:t>loop.last</w:t>
-      </w:r>
-      <w:proofErr w:type="spellEnd"/>
-      <w:r>
-        <w:rPr>
-          <w:rFonts w:cs="TimesNewRomanPSMT"/>
-          <w:b/>
-          <w:bCs/>
-        </w:rPr>
-        <w:t xml:space="preserve"> %}, {% </w:t>
-      </w:r>
-      <w:proofErr w:type="spellStart"/>
-      <w:r>
-        <w:rPr>
-          <w:rFonts w:cs="TimesNewRomanPSMT"/>
-          <w:b/>
-          <w:bCs/>
-        </w:rPr>
-        <w:t>endif</w:t>
-      </w:r>
-      <w:proofErr w:type="spellEnd"/>
-      <w:r>
-        <w:rPr>
-          <w:rFonts w:cs="TimesNewRomanPSMT"/>
-          <w:b/>
-          <w:bCs/>
-        </w:rPr>
-        <w:t xml:space="preserve"> %}{% </w:t>
-      </w:r>
-      <w:proofErr w:type="spellStart"/>
-      <w:r>
-        <w:rPr>
-          <w:rFonts w:cs="TimesNewRomanPSMT"/>
-          <w:b/>
-          <w:bCs/>
-        </w:rPr>
-        <w:t>endfor</w:t>
-      </w:r>
-      <w:proofErr w:type="spellEnd"/>
-      <w:r>
-        <w:rPr>
-          <w:rFonts w:cs="TimesNewRomanPSMT"/>
-          <w:b/>
-          <w:bCs/>
-        </w:rPr>
-        <w:t xml:space="preserve"> %}</w:t>
+        <w:t>{% if not loop.last %}, {% endif %}{% endfor %}</w:t>
       </w:r>
     </w:p>
     <w:p>
@@ -1529,14 +1527,12 @@
         </w:rPr>
         <w:t xml:space="preserve"> </w:t>
       </w:r>
-      <w:proofErr w:type="spellStart"/>
       <w:r>
         <w:rPr>
           <w:color w:val="000000"/>
         </w:rPr>
         <w:t>surface_habitable_totale</w:t>
       </w:r>
-      <w:proofErr w:type="spellEnd"/>
     </w:p>
     <w:p>
       <w:pPr>
@@ -1574,15 +1570,7 @@
         <w:t xml:space="preserve">* Surface habitable totale des parties privatives : </w:t>
       </w:r>
       <w:r>
-        <w:t xml:space="preserve">{{ </w:t>
-      </w:r>
-      <w:proofErr w:type="spellStart"/>
-      <w:r>
-        <w:t>sh_totale|f</w:t>
-      </w:r>
-      <w:proofErr w:type="spellEnd"/>
-      <w:r>
-        <w:t xml:space="preserve"> }} </w:t>
+        <w:t xml:space="preserve">{{ sh_totale|f }} </w:t>
       </w:r>
       <w:r>
         <w:rPr>
@@ -1621,21 +1609,7 @@
         <w:rPr>
           <w:color w:val="000000"/>
         </w:rPr>
-        <w:t xml:space="preserve">Nombre total de logements : {{ </w:t>
-      </w:r>
-      <w:proofErr w:type="spellStart"/>
-      <w:r>
-        <w:rPr>
-          <w:color w:val="000000"/>
-        </w:rPr>
-        <w:t>convention.nb_logements</w:t>
-      </w:r>
-      <w:proofErr w:type="spellEnd"/>
-      <w:r>
-        <w:rPr>
-          <w:color w:val="000000"/>
-        </w:rPr>
-        <w:t xml:space="preserve"> }}</w:t>
+        <w:t>Nombre total de logements : {{ convention.nb_logements }}</w:t>
       </w:r>
     </w:p>
     <w:p>
@@ -1651,25 +1625,7 @@
           <w:sz w:val="20"/>
           <w:lang w:val="en-US"/>
         </w:rPr>
-        <w:t xml:space="preserve">{% if </w:t>
-      </w:r>
-      <w:proofErr w:type="spellStart"/>
-      <w:r>
-        <w:rPr>
-          <w:rFonts w:cs="TimesNewRomanPSMT"/>
-          <w:sz w:val="20"/>
-          <w:lang w:val="en-US"/>
-        </w:rPr>
-        <w:t>convention.get_lot_with_financement</w:t>
-      </w:r>
-      <w:proofErr w:type="spellEnd"/>
-      <w:r>
-        <w:rPr>
-          <w:rFonts w:cs="TimesNewRomanPSMT"/>
-          <w:sz w:val="20"/>
-          <w:lang w:val="en-US"/>
-        </w:rPr>
-        <w:t>(‘PLAI’)%}</w:t>
+        <w:t>{% if convention.get_lot_with_financement(‘PLAI’)%}</w:t>
       </w:r>
       <w:r>
         <w:rPr>
@@ -1695,16 +1651,8 @@
         <w:rPr>
           <w:color w:val="000000"/>
         </w:rPr>
-        <w:t xml:space="preserve">Logements financés via un </w:t>
-      </w:r>
-      <w:proofErr w:type="spellStart"/>
-      <w:r>
-        <w:rPr>
-          <w:color w:val="000000"/>
-        </w:rPr>
-        <w:t>PLAi</w:t>
-      </w:r>
-      <w:proofErr w:type="spellEnd"/>
+        <w:t>Logements financés via un PLAi</w:t>
+      </w:r>
       <w:r>
         <w:rPr>
           <w:color w:val="000000"/>
@@ -1994,97 +1942,7 @@
                 <w:sz w:val="20"/>
                 <w:szCs w:val="20"/>
               </w:rPr>
-              <w:t xml:space="preserve">{% if </w:t>
-            </w:r>
-            <w:proofErr w:type="spellStart"/>
-            <w:r>
-              <w:rPr>
-                <w:color w:val="000000"/>
-                <w:sz w:val="20"/>
-                <w:szCs w:val="20"/>
-              </w:rPr>
-              <w:t>outre_mer</w:t>
-            </w:r>
-            <w:proofErr w:type="spellEnd"/>
-            <w:r>
-              <w:rPr>
-                <w:color w:val="000000"/>
-                <w:sz w:val="20"/>
-                <w:szCs w:val="20"/>
-              </w:rPr>
-              <w:t xml:space="preserve"> %}%}{{</w:t>
-            </w:r>
-            <w:proofErr w:type="spellStart"/>
-            <w:r>
-              <w:rPr>
-                <w:color w:val="000000"/>
-                <w:sz w:val="20"/>
-                <w:szCs w:val="20"/>
-              </w:rPr>
-              <w:t>l.typologie</w:t>
-            </w:r>
-            <w:proofErr w:type="spellEnd"/>
-            <w:r>
-              <w:rPr>
-                <w:color w:val="000000"/>
-                <w:sz w:val="20"/>
-                <w:szCs w:val="20"/>
-              </w:rPr>
-              <w:t xml:space="preserve">}}{% </w:t>
-            </w:r>
-            <w:proofErr w:type="spellStart"/>
-            <w:r>
-              <w:rPr>
-                <w:color w:val="000000"/>
-                <w:sz w:val="20"/>
-                <w:szCs w:val="20"/>
-              </w:rPr>
-              <w:t>else</w:t>
-            </w:r>
-            <w:proofErr w:type="spellEnd"/>
-            <w:r>
-              <w:rPr>
-                <w:color w:val="000000"/>
-                <w:sz w:val="20"/>
-                <w:szCs w:val="20"/>
-              </w:rPr>
-              <w:t xml:space="preserve"> %}{{</w:t>
-            </w:r>
-            <w:proofErr w:type="spellStart"/>
-            <w:r>
-              <w:rPr>
-                <w:color w:val="000000"/>
-                <w:sz w:val="20"/>
-                <w:szCs w:val="20"/>
-              </w:rPr>
-              <w:t>l.typologie|tl</w:t>
-            </w:r>
-            <w:proofErr w:type="spellEnd"/>
-            <w:r>
-              <w:rPr>
-                <w:color w:val="000000"/>
-                <w:sz w:val="20"/>
-                <w:szCs w:val="20"/>
-              </w:rPr>
-              <w:t xml:space="preserve">}}{% </w:t>
-            </w:r>
-            <w:proofErr w:type="spellStart"/>
-            <w:r>
-              <w:rPr>
-                <w:color w:val="000000"/>
-                <w:sz w:val="20"/>
-                <w:szCs w:val="20"/>
-              </w:rPr>
-              <w:t>endif</w:t>
-            </w:r>
-            <w:proofErr w:type="spellEnd"/>
-            <w:r>
-              <w:rPr>
-                <w:color w:val="000000"/>
-                <w:sz w:val="20"/>
-                <w:szCs w:val="20"/>
-              </w:rPr>
-              <w:t xml:space="preserve"> %}</w:t>
+              <w:t>{% if outre_mer %}%}{{l.typologie}}{% else %}{{l.typologie|tl}}{% endif %}</w:t>
             </w:r>
           </w:p>
         </w:tc>
@@ -2112,25 +1970,7 @@
                 <w:sz w:val="20"/>
                 <w:szCs w:val="20"/>
               </w:rPr>
-              <w:t>{{</w:t>
-            </w:r>
-            <w:proofErr w:type="spellStart"/>
-            <w:r>
-              <w:rPr>
-                <w:color w:val="000000"/>
-                <w:sz w:val="20"/>
-                <w:szCs w:val="20"/>
-              </w:rPr>
-              <w:t>l.surface_habitable|f</w:t>
-            </w:r>
-            <w:proofErr w:type="spellEnd"/>
-            <w:r>
-              <w:rPr>
-                <w:color w:val="000000"/>
-                <w:sz w:val="20"/>
-                <w:szCs w:val="20"/>
-              </w:rPr>
-              <w:t>}}</w:t>
+              <w:t>{{l.surface_habitable|f}}</w:t>
             </w:r>
           </w:p>
         </w:tc>
@@ -2158,25 +1998,7 @@
                 <w:sz w:val="20"/>
                 <w:szCs w:val="20"/>
               </w:rPr>
-              <w:t>{{</w:t>
-            </w:r>
-            <w:proofErr w:type="spellStart"/>
-            <w:r>
-              <w:rPr>
-                <w:color w:val="000000"/>
-                <w:sz w:val="20"/>
-                <w:szCs w:val="20"/>
-              </w:rPr>
-              <w:t>l.designation</w:t>
-            </w:r>
-            <w:proofErr w:type="spellEnd"/>
-            <w:r>
-              <w:rPr>
-                <w:color w:val="000000"/>
-                <w:sz w:val="20"/>
-                <w:szCs w:val="20"/>
-              </w:rPr>
-              <w:t>}}</w:t>
+              <w:t>{{l.designation}}</w:t>
             </w:r>
           </w:p>
         </w:tc>
@@ -2204,25 +2026,7 @@
                 <w:sz w:val="20"/>
                 <w:szCs w:val="20"/>
               </w:rPr>
-              <w:t>{{</w:t>
-            </w:r>
-            <w:proofErr w:type="spellStart"/>
-            <w:r>
-              <w:rPr>
-                <w:color w:val="000000"/>
-                <w:sz w:val="20"/>
-                <w:szCs w:val="20"/>
-              </w:rPr>
-              <w:t>l.loyer|f</w:t>
-            </w:r>
-            <w:proofErr w:type="spellEnd"/>
-            <w:r>
-              <w:rPr>
-                <w:color w:val="000000"/>
-                <w:sz w:val="20"/>
-                <w:szCs w:val="20"/>
-              </w:rPr>
-              <w:t>}}</w:t>
+              <w:t>{{l.loyer|f}}</w:t>
             </w:r>
           </w:p>
         </w:tc>
@@ -2257,25 +2061,7 @@
                 <w:sz w:val="16"/>
                 <w:szCs w:val="16"/>
               </w:rPr>
-              <w:t xml:space="preserve">{%tr </w:t>
-            </w:r>
-            <w:proofErr w:type="spellStart"/>
-            <w:r>
-              <w:rPr>
-                <w:color w:val="000000"/>
-                <w:sz w:val="16"/>
-                <w:szCs w:val="16"/>
-              </w:rPr>
-              <w:t>endfor</w:t>
-            </w:r>
-            <w:proofErr w:type="spellEnd"/>
-            <w:r>
-              <w:rPr>
-                <w:color w:val="000000"/>
-                <w:sz w:val="16"/>
-                <w:szCs w:val="16"/>
-              </w:rPr>
-              <w:t xml:space="preserve"> %}</w:t>
+              <w:t>{%tr endfor %}</w:t>
             </w:r>
           </w:p>
         </w:tc>
@@ -2306,21 +2092,7 @@
               <w:rPr>
                 <w:color w:val="000000"/>
               </w:rPr>
-              <w:t xml:space="preserve">(*) Normes des typologies définies par l'arrêté du {% if </w:t>
-            </w:r>
-            <w:proofErr w:type="spellStart"/>
-            <w:r>
-              <w:rPr>
-                <w:color w:val="000000"/>
-              </w:rPr>
-              <w:t>outre_mer</w:t>
-            </w:r>
-            <w:proofErr w:type="spellEnd"/>
-            <w:r>
-              <w:rPr>
-                <w:color w:val="000000"/>
-              </w:rPr>
-              <w:t xml:space="preserve"> %}3 avril 2023 relatif aux caractéristiques techniques, aux plafonds de ressources et aux plafonds de redevance des opérations de construction, d'acquisition-amélioration ou d'amélioration des logements-foyers en Guadeloupe,</w:t>
+              <w:t>(*) Normes des typologies définies par l'arrêté du {% if outre_mer %}3 avril 2023 relatif aux caractéristiques techniques, aux plafonds de ressources et aux plafonds de redevance des opérations de construction, d'acquisition-amélioration ou d'amélioration des logements-foyers en Guadeloupe,</w:t>
             </w:r>
             <w:r>
               <w:rPr>
@@ -2334,35 +2106,7 @@
               <w:rPr>
                 <w:color w:val="000000"/>
               </w:rPr>
-              <w:t xml:space="preserve">en Guyane, en Martinique, à La Réunion, à Mayotte{% </w:t>
-            </w:r>
-            <w:proofErr w:type="spellStart"/>
-            <w:r>
-              <w:rPr>
-                <w:color w:val="000000"/>
-              </w:rPr>
-              <w:t>else</w:t>
-            </w:r>
-            <w:proofErr w:type="spellEnd"/>
-            <w:r>
-              <w:rPr>
-                <w:color w:val="000000"/>
-              </w:rPr>
-              <w:t xml:space="preserve"> %}17 octobre 2011. A prendre en compte dans la liste déroulante{% </w:t>
-            </w:r>
-            <w:proofErr w:type="spellStart"/>
-            <w:r>
-              <w:rPr>
-                <w:color w:val="000000"/>
-              </w:rPr>
-              <w:t>endif</w:t>
-            </w:r>
-            <w:proofErr w:type="spellEnd"/>
-            <w:r>
-              <w:rPr>
-                <w:color w:val="000000"/>
-              </w:rPr>
-              <w:t xml:space="preserve"> %}</w:t>
+              <w:t>en Guyane, en Martinique, à La Réunion, à Mayotte{% else %}17 octobre 2011. A prendre en compte dans la liste déroulante{% endif %}</w:t>
             </w:r>
           </w:p>
         </w:tc>
@@ -2381,23 +2125,7 @@
           <w:rFonts w:cs="TimesNewRomanPSMT"/>
           <w:sz w:val="20"/>
         </w:rPr>
-        <w:t xml:space="preserve">{% </w:t>
-      </w:r>
-      <w:proofErr w:type="spellStart"/>
-      <w:r>
-        <w:rPr>
-          <w:rFonts w:cs="TimesNewRomanPSMT"/>
-          <w:sz w:val="20"/>
-        </w:rPr>
-        <w:t>endif</w:t>
-      </w:r>
-      <w:proofErr w:type="spellEnd"/>
-      <w:r>
-        <w:rPr>
-          <w:rFonts w:cs="TimesNewRomanPSMT"/>
-          <w:sz w:val="20"/>
-        </w:rPr>
-        <w:t xml:space="preserve"> %}</w:t>
+        <w:t>{% endif %}</w:t>
       </w:r>
     </w:p>
     <w:p>
@@ -2420,25 +2148,7 @@
           <w:sz w:val="20"/>
           <w:lang w:val="en-US"/>
         </w:rPr>
-        <w:t xml:space="preserve">{% if </w:t>
-      </w:r>
-      <w:proofErr w:type="spellStart"/>
-      <w:r>
-        <w:rPr>
-          <w:rFonts w:cs="TimesNewRomanPSMT"/>
-          <w:sz w:val="20"/>
-          <w:lang w:val="en-US"/>
-        </w:rPr>
-        <w:t>convention.get_lot_with_financement</w:t>
-      </w:r>
-      <w:proofErr w:type="spellEnd"/>
-      <w:r>
-        <w:rPr>
-          <w:rFonts w:cs="TimesNewRomanPSMT"/>
-          <w:sz w:val="20"/>
-          <w:lang w:val="en-US"/>
-        </w:rPr>
-        <w:t>(‘PLUS’)%}</w:t>
+        <w:t>{% if convention.get_lot_with_financement(‘PLUS’)%}</w:t>
       </w:r>
     </w:p>
     <w:p>
@@ -2754,97 +2464,7 @@
                 <w:sz w:val="20"/>
                 <w:szCs w:val="20"/>
               </w:rPr>
-              <w:t xml:space="preserve">{% if </w:t>
-            </w:r>
-            <w:proofErr w:type="spellStart"/>
-            <w:r>
-              <w:rPr>
-                <w:color w:val="000000"/>
-                <w:sz w:val="20"/>
-                <w:szCs w:val="20"/>
-              </w:rPr>
-              <w:t>outre_mer</w:t>
-            </w:r>
-            <w:proofErr w:type="spellEnd"/>
-            <w:r>
-              <w:rPr>
-                <w:color w:val="000000"/>
-                <w:sz w:val="20"/>
-                <w:szCs w:val="20"/>
-              </w:rPr>
-              <w:t xml:space="preserve"> %}%}{{</w:t>
-            </w:r>
-            <w:proofErr w:type="spellStart"/>
-            <w:r>
-              <w:rPr>
-                <w:color w:val="000000"/>
-                <w:sz w:val="20"/>
-                <w:szCs w:val="20"/>
-              </w:rPr>
-              <w:t>l.typologie</w:t>
-            </w:r>
-            <w:proofErr w:type="spellEnd"/>
-            <w:r>
-              <w:rPr>
-                <w:color w:val="000000"/>
-                <w:sz w:val="20"/>
-                <w:szCs w:val="20"/>
-              </w:rPr>
-              <w:t xml:space="preserve">}}{% </w:t>
-            </w:r>
-            <w:proofErr w:type="spellStart"/>
-            <w:r>
-              <w:rPr>
-                <w:color w:val="000000"/>
-                <w:sz w:val="20"/>
-                <w:szCs w:val="20"/>
-              </w:rPr>
-              <w:t>else</w:t>
-            </w:r>
-            <w:proofErr w:type="spellEnd"/>
-            <w:r>
-              <w:rPr>
-                <w:color w:val="000000"/>
-                <w:sz w:val="20"/>
-                <w:szCs w:val="20"/>
-              </w:rPr>
-              <w:t xml:space="preserve"> %}{{</w:t>
-            </w:r>
-            <w:proofErr w:type="spellStart"/>
-            <w:r>
-              <w:rPr>
-                <w:color w:val="000000"/>
-                <w:sz w:val="20"/>
-                <w:szCs w:val="20"/>
-              </w:rPr>
-              <w:t>l.typologie|tl</w:t>
-            </w:r>
-            <w:proofErr w:type="spellEnd"/>
-            <w:r>
-              <w:rPr>
-                <w:color w:val="000000"/>
-                <w:sz w:val="20"/>
-                <w:szCs w:val="20"/>
-              </w:rPr>
-              <w:t xml:space="preserve">}}{% </w:t>
-            </w:r>
-            <w:proofErr w:type="spellStart"/>
-            <w:r>
-              <w:rPr>
-                <w:color w:val="000000"/>
-                <w:sz w:val="20"/>
-                <w:szCs w:val="20"/>
-              </w:rPr>
-              <w:t>endif</w:t>
-            </w:r>
-            <w:proofErr w:type="spellEnd"/>
-            <w:r>
-              <w:rPr>
-                <w:color w:val="000000"/>
-                <w:sz w:val="20"/>
-                <w:szCs w:val="20"/>
-              </w:rPr>
-              <w:t xml:space="preserve"> %}</w:t>
+              <w:t>{% if outre_mer %}%}{{l.typologie}}{% else %}{{l.typologie|tl}}{% endif %}</w:t>
             </w:r>
           </w:p>
         </w:tc>
@@ -2872,25 +2492,7 @@
                 <w:sz w:val="20"/>
                 <w:szCs w:val="20"/>
               </w:rPr>
-              <w:t>{{</w:t>
-            </w:r>
-            <w:proofErr w:type="spellStart"/>
-            <w:r>
-              <w:rPr>
-                <w:color w:val="000000"/>
-                <w:sz w:val="20"/>
-                <w:szCs w:val="20"/>
-              </w:rPr>
-              <w:t>l.surface_habitable|f</w:t>
-            </w:r>
-            <w:proofErr w:type="spellEnd"/>
-            <w:r>
-              <w:rPr>
-                <w:color w:val="000000"/>
-                <w:sz w:val="20"/>
-                <w:szCs w:val="20"/>
-              </w:rPr>
-              <w:t>}}</w:t>
+              <w:t>{{l.surface_habitable|f}}</w:t>
             </w:r>
           </w:p>
         </w:tc>
@@ -2918,25 +2520,7 @@
                 <w:sz w:val="20"/>
                 <w:szCs w:val="20"/>
               </w:rPr>
-              <w:t>{{</w:t>
-            </w:r>
-            <w:proofErr w:type="spellStart"/>
-            <w:r>
-              <w:rPr>
-                <w:color w:val="000000"/>
-                <w:sz w:val="20"/>
-                <w:szCs w:val="20"/>
-              </w:rPr>
-              <w:t>l.designation</w:t>
-            </w:r>
-            <w:proofErr w:type="spellEnd"/>
-            <w:r>
-              <w:rPr>
-                <w:color w:val="000000"/>
-                <w:sz w:val="20"/>
-                <w:szCs w:val="20"/>
-              </w:rPr>
-              <w:t>}}</w:t>
+              <w:t>{{l.designation}}</w:t>
             </w:r>
           </w:p>
         </w:tc>
@@ -2964,25 +2548,7 @@
                 <w:sz w:val="20"/>
                 <w:szCs w:val="20"/>
               </w:rPr>
-              <w:t>{{</w:t>
-            </w:r>
-            <w:proofErr w:type="spellStart"/>
-            <w:r>
-              <w:rPr>
-                <w:color w:val="000000"/>
-                <w:sz w:val="20"/>
-                <w:szCs w:val="20"/>
-              </w:rPr>
-              <w:t>l.loyer|f</w:t>
-            </w:r>
-            <w:proofErr w:type="spellEnd"/>
-            <w:r>
-              <w:rPr>
-                <w:color w:val="000000"/>
-                <w:sz w:val="20"/>
-                <w:szCs w:val="20"/>
-              </w:rPr>
-              <w:t>}}</w:t>
+              <w:t>{{l.loyer|f}}</w:t>
             </w:r>
           </w:p>
         </w:tc>
@@ -3017,25 +2583,7 @@
                 <w:sz w:val="16"/>
                 <w:szCs w:val="16"/>
               </w:rPr>
-              <w:t xml:space="preserve">{%tr </w:t>
-            </w:r>
-            <w:proofErr w:type="spellStart"/>
-            <w:r>
-              <w:rPr>
-                <w:color w:val="000000"/>
-                <w:sz w:val="16"/>
-                <w:szCs w:val="16"/>
-              </w:rPr>
-              <w:t>endfor</w:t>
-            </w:r>
-            <w:proofErr w:type="spellEnd"/>
-            <w:r>
-              <w:rPr>
-                <w:color w:val="000000"/>
-                <w:sz w:val="16"/>
-                <w:szCs w:val="16"/>
-              </w:rPr>
-              <w:t xml:space="preserve"> %}</w:t>
+              <w:t>{%tr endfor %}</w:t>
             </w:r>
           </w:p>
         </w:tc>
@@ -3066,21 +2614,7 @@
               <w:rPr>
                 <w:color w:val="000000"/>
               </w:rPr>
-              <w:t xml:space="preserve">(*) Normes des typologies définies par l'arrêté du {% if </w:t>
-            </w:r>
-            <w:proofErr w:type="spellStart"/>
-            <w:r>
-              <w:rPr>
-                <w:color w:val="000000"/>
-              </w:rPr>
-              <w:t>outre_mer</w:t>
-            </w:r>
-            <w:proofErr w:type="spellEnd"/>
-            <w:r>
-              <w:rPr>
-                <w:color w:val="000000"/>
-              </w:rPr>
-              <w:t xml:space="preserve"> %}3 avril 2023 relatif aux caractéristiques techniques, aux plafonds de ressources et aux plafonds de redevance des opérations de construction, d'acquisition-amélioration ou d'amélioration des logements-foyers en Guadeloupe,</w:t>
+              <w:t>(*) Normes des typologies définies par l'arrêté du {% if outre_mer %}3 avril 2023 relatif aux caractéristiques techniques, aux plafonds de ressources et aux plafonds de redevance des opérations de construction, d'acquisition-amélioration ou d'amélioration des logements-foyers en Guadeloupe,</w:t>
             </w:r>
             <w:r>
               <w:rPr>
@@ -3094,35 +2628,7 @@
               <w:rPr>
                 <w:color w:val="000000"/>
               </w:rPr>
-              <w:t xml:space="preserve">en Guyane, en Martinique, à La Réunion, à Mayotte{% </w:t>
-            </w:r>
-            <w:proofErr w:type="spellStart"/>
-            <w:r>
-              <w:rPr>
-                <w:color w:val="000000"/>
-              </w:rPr>
-              <w:t>else</w:t>
-            </w:r>
-            <w:proofErr w:type="spellEnd"/>
-            <w:r>
-              <w:rPr>
-                <w:color w:val="000000"/>
-              </w:rPr>
-              <w:t xml:space="preserve"> %}17 octobre 2011. A prendre en compte dans la liste déroulante{% </w:t>
-            </w:r>
-            <w:proofErr w:type="spellStart"/>
-            <w:r>
-              <w:rPr>
-                <w:color w:val="000000"/>
-              </w:rPr>
-              <w:t>endif</w:t>
-            </w:r>
-            <w:proofErr w:type="spellEnd"/>
-            <w:r>
-              <w:rPr>
-                <w:color w:val="000000"/>
-              </w:rPr>
-              <w:t xml:space="preserve"> %}</w:t>
+              <w:t>en Guyane, en Martinique, à La Réunion, à Mayotte{% else %}17 octobre 2011. A prendre en compte dans la liste déroulante{% endif %}</w:t>
             </w:r>
           </w:p>
         </w:tc>
@@ -3141,23 +2647,7 @@
           <w:rFonts w:cs="TimesNewRomanPSMT"/>
           <w:sz w:val="20"/>
         </w:rPr>
-        <w:t xml:space="preserve">{% </w:t>
-      </w:r>
-      <w:proofErr w:type="spellStart"/>
-      <w:r>
-        <w:rPr>
-          <w:rFonts w:cs="TimesNewRomanPSMT"/>
-          <w:sz w:val="20"/>
-        </w:rPr>
-        <w:t>endif</w:t>
-      </w:r>
-      <w:proofErr w:type="spellEnd"/>
-      <w:r>
-        <w:rPr>
-          <w:rFonts w:cs="TimesNewRomanPSMT"/>
-          <w:sz w:val="20"/>
-        </w:rPr>
-        <w:t xml:space="preserve"> %}</w:t>
+        <w:t>{% endif %}</w:t>
       </w:r>
     </w:p>
     <w:p>
@@ -3187,25 +2677,7 @@
           <w:sz w:val="20"/>
           <w:lang w:val="en-US"/>
         </w:rPr>
-        <w:t xml:space="preserve">{% if </w:t>
-      </w:r>
-      <w:proofErr w:type="spellStart"/>
-      <w:r>
-        <w:rPr>
-          <w:rFonts w:cs="TimesNewRomanPSMT"/>
-          <w:sz w:val="20"/>
-          <w:lang w:val="en-US"/>
-        </w:rPr>
-        <w:t>convention.get_lot_with_financement</w:t>
-      </w:r>
-      <w:proofErr w:type="spellEnd"/>
-      <w:r>
-        <w:rPr>
-          <w:rFonts w:cs="TimesNewRomanPSMT"/>
-          <w:sz w:val="20"/>
-          <w:lang w:val="en-US"/>
-        </w:rPr>
-        <w:t>(‘PLS’)%}</w:t>
+        <w:t>{% if convention.get_lot_with_financement(‘PLS’)%}</w:t>
       </w:r>
     </w:p>
     <w:p>
@@ -3465,43 +2937,7 @@
                 <w:szCs w:val="16"/>
                 <w:lang w:val="en-US"/>
               </w:rPr>
-              <w:t xml:space="preserve">{%tr for l in </w:t>
-            </w:r>
-            <w:proofErr w:type="spellStart"/>
-            <w:r>
-              <w:rPr>
-                <w:sz w:val="16"/>
-                <w:szCs w:val="16"/>
-                <w:lang w:val="en-US"/>
-              </w:rPr>
-              <w:t>convention.get_lot_with_financement</w:t>
-            </w:r>
-            <w:proofErr w:type="spellEnd"/>
-            <w:r>
-              <w:rPr>
-                <w:sz w:val="16"/>
-                <w:szCs w:val="16"/>
-                <w:lang w:val="en-US"/>
-              </w:rPr>
-              <w:t>(‘PLS’) .</w:t>
-            </w:r>
-            <w:proofErr w:type="spellStart"/>
-            <w:r>
-              <w:rPr>
-                <w:sz w:val="16"/>
-                <w:szCs w:val="16"/>
-                <w:lang w:val="en-US"/>
-              </w:rPr>
-              <w:t>logements_import_ordered</w:t>
-            </w:r>
-            <w:proofErr w:type="spellEnd"/>
-            <w:r>
-              <w:rPr>
-                <w:sz w:val="16"/>
-                <w:szCs w:val="16"/>
-                <w:lang w:val="en-US"/>
-              </w:rPr>
-              <w:t xml:space="preserve"> %}</w:t>
+              <w:t>{%tr for l in convention.get_lot_with_financement(‘PLS’) .logements_import_ordered %}</w:t>
             </w:r>
           </w:p>
         </w:tc>
@@ -3537,67 +2973,7 @@
                 <w:szCs w:val="20"/>
                 <w:lang w:val="en-US"/>
               </w:rPr>
-              <w:t xml:space="preserve">{% if </w:t>
-            </w:r>
-            <w:proofErr w:type="spellStart"/>
-            <w:r>
-              <w:rPr>
-                <w:color w:val="000000"/>
-                <w:sz w:val="20"/>
-                <w:szCs w:val="20"/>
-                <w:lang w:val="en-US"/>
-              </w:rPr>
-              <w:t>outre_mer</w:t>
-            </w:r>
-            <w:proofErr w:type="spellEnd"/>
-            <w:r>
-              <w:rPr>
-                <w:color w:val="000000"/>
-                <w:sz w:val="20"/>
-                <w:szCs w:val="20"/>
-                <w:lang w:val="en-US"/>
-              </w:rPr>
-              <w:t xml:space="preserve"> %}%}{{</w:t>
-            </w:r>
-            <w:proofErr w:type="spellStart"/>
-            <w:r>
-              <w:rPr>
-                <w:color w:val="000000"/>
-                <w:sz w:val="20"/>
-                <w:szCs w:val="20"/>
-                <w:lang w:val="en-US"/>
-              </w:rPr>
-              <w:t>l.typologie</w:t>
-            </w:r>
-            <w:proofErr w:type="spellEnd"/>
-            <w:r>
-              <w:rPr>
-                <w:color w:val="000000"/>
-                <w:sz w:val="20"/>
-                <w:szCs w:val="20"/>
-                <w:lang w:val="en-US"/>
-              </w:rPr>
-              <w:t>}}{% else %}{{</w:t>
-            </w:r>
-            <w:proofErr w:type="spellStart"/>
-            <w:r>
-              <w:rPr>
-                <w:color w:val="000000"/>
-                <w:sz w:val="20"/>
-                <w:szCs w:val="20"/>
-                <w:lang w:val="en-US"/>
-              </w:rPr>
-              <w:t>l.typologie|tl</w:t>
-            </w:r>
-            <w:proofErr w:type="spellEnd"/>
-            <w:r>
-              <w:rPr>
-                <w:color w:val="000000"/>
-                <w:sz w:val="20"/>
-                <w:szCs w:val="20"/>
-                <w:lang w:val="en-US"/>
-              </w:rPr>
-              <w:t>}}{% endif %}</w:t>
+              <w:t>{% if outre_mer %}%}{{l.typologie}}{% else %}{{l.typologie|tl}}{% endif %}</w:t>
             </w:r>
           </w:p>
         </w:tc>
@@ -3625,25 +3001,7 @@
                 <w:sz w:val="20"/>
                 <w:szCs w:val="20"/>
               </w:rPr>
-              <w:t>{{</w:t>
-            </w:r>
-            <w:proofErr w:type="spellStart"/>
-            <w:r>
-              <w:rPr>
-                <w:color w:val="000000"/>
-                <w:sz w:val="20"/>
-                <w:szCs w:val="20"/>
-              </w:rPr>
-              <w:t>l.surface_habitable|f</w:t>
-            </w:r>
-            <w:proofErr w:type="spellEnd"/>
-            <w:r>
-              <w:rPr>
-                <w:color w:val="000000"/>
-                <w:sz w:val="20"/>
-                <w:szCs w:val="20"/>
-              </w:rPr>
-              <w:t>}}</w:t>
+              <w:t>{{l.surface_habitable|f}}</w:t>
             </w:r>
           </w:p>
         </w:tc>
@@ -3671,25 +3029,7 @@
                 <w:sz w:val="20"/>
                 <w:szCs w:val="20"/>
               </w:rPr>
-              <w:t>{{</w:t>
-            </w:r>
-            <w:proofErr w:type="spellStart"/>
-            <w:r>
-              <w:rPr>
-                <w:color w:val="000000"/>
-                <w:sz w:val="20"/>
-                <w:szCs w:val="20"/>
-              </w:rPr>
-              <w:t>l.designation</w:t>
-            </w:r>
-            <w:proofErr w:type="spellEnd"/>
-            <w:r>
-              <w:rPr>
-                <w:color w:val="000000"/>
-                <w:sz w:val="20"/>
-                <w:szCs w:val="20"/>
-              </w:rPr>
-              <w:t>}}</w:t>
+              <w:t>{{l.designation}}</w:t>
             </w:r>
           </w:p>
         </w:tc>
@@ -3717,25 +3057,7 @@
                 <w:sz w:val="20"/>
                 <w:szCs w:val="20"/>
               </w:rPr>
-              <w:t>{{</w:t>
-            </w:r>
-            <w:proofErr w:type="spellStart"/>
-            <w:r>
-              <w:rPr>
-                <w:color w:val="000000"/>
-                <w:sz w:val="20"/>
-                <w:szCs w:val="20"/>
-              </w:rPr>
-              <w:t>l.loyer|f</w:t>
-            </w:r>
-            <w:proofErr w:type="spellEnd"/>
-            <w:r>
-              <w:rPr>
-                <w:color w:val="000000"/>
-                <w:sz w:val="20"/>
-                <w:szCs w:val="20"/>
-              </w:rPr>
-              <w:t>}}</w:t>
+              <w:t>{{l.loyer|f}}</w:t>
             </w:r>
           </w:p>
         </w:tc>
@@ -3770,25 +3092,7 @@
                 <w:sz w:val="16"/>
                 <w:szCs w:val="16"/>
               </w:rPr>
-              <w:t xml:space="preserve">{%tr </w:t>
-            </w:r>
-            <w:proofErr w:type="spellStart"/>
-            <w:r>
-              <w:rPr>
-                <w:color w:val="000000"/>
-                <w:sz w:val="16"/>
-                <w:szCs w:val="16"/>
-              </w:rPr>
-              <w:t>endfor</w:t>
-            </w:r>
-            <w:proofErr w:type="spellEnd"/>
-            <w:r>
-              <w:rPr>
-                <w:color w:val="000000"/>
-                <w:sz w:val="16"/>
-                <w:szCs w:val="16"/>
-              </w:rPr>
-              <w:t xml:space="preserve"> %}</w:t>
+              <w:t>{%tr endfor %}</w:t>
             </w:r>
           </w:p>
         </w:tc>
@@ -3819,21 +3123,7 @@
               <w:rPr>
                 <w:color w:val="000000"/>
               </w:rPr>
-              <w:t xml:space="preserve">(*) Normes des typologies définies par l'arrêté du {% if </w:t>
-            </w:r>
-            <w:proofErr w:type="spellStart"/>
-            <w:r>
-              <w:rPr>
-                <w:color w:val="000000"/>
-              </w:rPr>
-              <w:t>outre_mer</w:t>
-            </w:r>
-            <w:proofErr w:type="spellEnd"/>
-            <w:r>
-              <w:rPr>
-                <w:color w:val="000000"/>
-              </w:rPr>
-              <w:t xml:space="preserve"> %}3 avril 2023 relatif aux caractéristiques techniques, aux plafonds de ressources et aux plafonds de redevance des opérations de construction, d'acquisition-amélioration ou d'amélioration des logements-foyers en Guadeloupe,</w:t>
+              <w:t>(*) Normes des typologies définies par l'arrêté du {% if outre_mer %}3 avril 2023 relatif aux caractéristiques techniques, aux plafonds de ressources et aux plafonds de redevance des opérations de construction, d'acquisition-amélioration ou d'amélioration des logements-foyers en Guadeloupe,</w:t>
             </w:r>
             <w:r>
               <w:rPr>
@@ -3847,35 +3137,7 @@
               <w:rPr>
                 <w:color w:val="000000"/>
               </w:rPr>
-              <w:t xml:space="preserve">en Guyane, en Martinique, à La Réunion, à Mayotte{% </w:t>
-            </w:r>
-            <w:proofErr w:type="spellStart"/>
-            <w:r>
-              <w:rPr>
-                <w:color w:val="000000"/>
-              </w:rPr>
-              <w:t>else</w:t>
-            </w:r>
-            <w:proofErr w:type="spellEnd"/>
-            <w:r>
-              <w:rPr>
-                <w:color w:val="000000"/>
-              </w:rPr>
-              <w:t xml:space="preserve"> %}17 octobre 2011. A prendre en compte dans la liste déroulante{% </w:t>
-            </w:r>
-            <w:proofErr w:type="spellStart"/>
-            <w:r>
-              <w:rPr>
-                <w:color w:val="000000"/>
-              </w:rPr>
-              <w:t>endif</w:t>
-            </w:r>
-            <w:proofErr w:type="spellEnd"/>
-            <w:r>
-              <w:rPr>
-                <w:color w:val="000000"/>
-              </w:rPr>
-              <w:t xml:space="preserve"> %}</w:t>
+              <w:t>en Guyane, en Martinique, à La Réunion, à Mayotte{% else %}17 octobre 2011. A prendre en compte dans la liste déroulante{% endif %}</w:t>
             </w:r>
           </w:p>
         </w:tc>
@@ -3894,23 +3156,7 @@
           <w:rFonts w:cs="TimesNewRomanPSMT"/>
           <w:sz w:val="20"/>
         </w:rPr>
-        <w:t xml:space="preserve">{% </w:t>
-      </w:r>
-      <w:proofErr w:type="spellStart"/>
-      <w:r>
-        <w:rPr>
-          <w:rFonts w:cs="TimesNewRomanPSMT"/>
-          <w:sz w:val="20"/>
-        </w:rPr>
-        <w:t>endif</w:t>
-      </w:r>
-      <w:proofErr w:type="spellEnd"/>
-      <w:r>
-        <w:rPr>
-          <w:rFonts w:cs="TimesNewRomanPSMT"/>
-          <w:sz w:val="20"/>
-        </w:rPr>
-        <w:t xml:space="preserve"> %}</w:t>
+        <w:t>{% endif %}</w:t>
       </w:r>
     </w:p>
     <w:p>
@@ -3937,21 +3183,7 @@
         <w:rPr>
           <w:color w:val="000000"/>
         </w:rPr>
-        <w:t xml:space="preserve">* Surface totale des locaux à usage collectif : {{ </w:t>
-      </w:r>
-      <w:proofErr w:type="spellStart"/>
-      <w:r>
-        <w:rPr>
-          <w:color w:val="000000"/>
-        </w:rPr>
-        <w:t>lc_sh_totale|f</w:t>
-      </w:r>
-      <w:proofErr w:type="spellEnd"/>
-      <w:r>
-        <w:rPr>
-          <w:color w:val="000000"/>
-        </w:rPr>
-        <w:t xml:space="preserve"> }} mètres carrés de surface habitable : </w:t>
+        <w:t xml:space="preserve">* Surface totale des locaux à usage collectif : {{ lc_sh_totale|f }} mètres carrés de surface habitable : </w:t>
       </w:r>
     </w:p>
     <w:p>
@@ -4102,39 +3334,7 @@
                 <w:szCs w:val="16"/>
               </w:rPr>
               <w:lastRenderedPageBreak/>
-              <w:t xml:space="preserve">{%tr for </w:t>
-            </w:r>
-            <w:proofErr w:type="spellStart"/>
-            <w:r>
-              <w:rPr>
-                <w:sz w:val="16"/>
-                <w:szCs w:val="16"/>
-              </w:rPr>
-              <w:t>lc</w:t>
-            </w:r>
-            <w:proofErr w:type="spellEnd"/>
-            <w:r>
-              <w:rPr>
-                <w:sz w:val="16"/>
-                <w:szCs w:val="16"/>
-              </w:rPr>
-              <w:t xml:space="preserve"> in </w:t>
-            </w:r>
-            <w:proofErr w:type="spellStart"/>
-            <w:r>
-              <w:rPr>
-                <w:sz w:val="16"/>
-                <w:szCs w:val="16"/>
-              </w:rPr>
-              <w:t>locaux_collectifs</w:t>
-            </w:r>
-            <w:proofErr w:type="spellEnd"/>
-            <w:r>
-              <w:rPr>
-                <w:sz w:val="16"/>
-                <w:szCs w:val="16"/>
-              </w:rPr>
-              <w:t xml:space="preserve"> %}</w:t>
+              <w:t>{%tr for lc in locaux_collectifs %}</w:t>
             </w:r>
           </w:p>
         </w:tc>
@@ -4169,25 +3369,7 @@
                 <w:sz w:val="20"/>
                 <w:szCs w:val="20"/>
               </w:rPr>
-              <w:t xml:space="preserve">{{ </w:t>
-            </w:r>
-            <w:proofErr w:type="spellStart"/>
-            <w:r>
-              <w:rPr>
-                <w:color w:val="000000"/>
-                <w:sz w:val="20"/>
-                <w:szCs w:val="20"/>
-              </w:rPr>
-              <w:t>lc.type_local</w:t>
-            </w:r>
-            <w:proofErr w:type="spellEnd"/>
-            <w:r>
-              <w:rPr>
-                <w:color w:val="000000"/>
-                <w:sz w:val="20"/>
-                <w:szCs w:val="20"/>
-              </w:rPr>
-              <w:t xml:space="preserve"> }}</w:t>
+              <w:t>{{ lc.type_local }}</w:t>
             </w:r>
           </w:p>
         </w:tc>
@@ -4216,25 +3398,7 @@
                 <w:sz w:val="20"/>
                 <w:szCs w:val="20"/>
               </w:rPr>
-              <w:t xml:space="preserve">{{ </w:t>
-            </w:r>
-            <w:proofErr w:type="spellStart"/>
-            <w:r>
-              <w:rPr>
-                <w:color w:val="000000"/>
-                <w:sz w:val="20"/>
-                <w:szCs w:val="20"/>
-              </w:rPr>
-              <w:t>lc.surface_habitable</w:t>
-            </w:r>
-            <w:proofErr w:type="spellEnd"/>
-            <w:r>
-              <w:rPr>
-                <w:color w:val="000000"/>
-                <w:sz w:val="20"/>
-                <w:szCs w:val="20"/>
-              </w:rPr>
-              <w:t xml:space="preserve"> }}</w:t>
+              <w:t>{{ lc.surface_habitable }}</w:t>
             </w:r>
           </w:p>
         </w:tc>
@@ -4263,25 +3427,7 @@
                 <w:sz w:val="20"/>
                 <w:szCs w:val="20"/>
               </w:rPr>
-              <w:t xml:space="preserve">{{ </w:t>
-            </w:r>
-            <w:proofErr w:type="spellStart"/>
-            <w:r>
-              <w:rPr>
-                <w:color w:val="000000"/>
-                <w:sz w:val="20"/>
-                <w:szCs w:val="20"/>
-              </w:rPr>
-              <w:t>lc.nombre</w:t>
-            </w:r>
-            <w:proofErr w:type="spellEnd"/>
-            <w:r>
-              <w:rPr>
-                <w:color w:val="000000"/>
-                <w:sz w:val="20"/>
-                <w:szCs w:val="20"/>
-              </w:rPr>
-              <w:t xml:space="preserve"> }}</w:t>
+              <w:t>{{ lc.nombre }}</w:t>
             </w:r>
           </w:p>
         </w:tc>
@@ -4315,25 +3461,7 @@
                 <w:sz w:val="16"/>
                 <w:szCs w:val="16"/>
               </w:rPr>
-              <w:t xml:space="preserve">{%tr </w:t>
-            </w:r>
-            <w:proofErr w:type="spellStart"/>
-            <w:r>
-              <w:rPr>
-                <w:color w:val="000000"/>
-                <w:sz w:val="16"/>
-                <w:szCs w:val="16"/>
-              </w:rPr>
-              <w:t>endfor</w:t>
-            </w:r>
-            <w:proofErr w:type="spellEnd"/>
-            <w:r>
-              <w:rPr>
-                <w:color w:val="000000"/>
-                <w:sz w:val="16"/>
-                <w:szCs w:val="16"/>
-              </w:rPr>
-              <w:t xml:space="preserve"> %}</w:t>
+              <w:t>{%tr endfor %}</w:t>
             </w:r>
           </w:p>
         </w:tc>
@@ -4374,21 +3502,7 @@
         <w:rPr>
           <w:color w:val="000000"/>
         </w:rPr>
-        <w:t xml:space="preserve">{% if </w:t>
-      </w:r>
-      <w:proofErr w:type="spellStart"/>
-      <w:r>
-        <w:rPr>
-          <w:color w:val="000000"/>
-        </w:rPr>
-        <w:t>lot.foyer_residence_dependance</w:t>
-      </w:r>
-      <w:proofErr w:type="spellEnd"/>
-      <w:r>
-        <w:rPr>
-          <w:color w:val="000000"/>
-        </w:rPr>
-        <w:t xml:space="preserve"> %}</w:t>
+        <w:t>{% if lot.foyer_residence_dependance %}</w:t>
       </w:r>
     </w:p>
     <w:p>
@@ -4409,21 +3523,7 @@
         <w:rPr>
           <w:color w:val="000000"/>
         </w:rPr>
-        <w:t xml:space="preserve">{{ </w:t>
-      </w:r>
-      <w:proofErr w:type="spellStart"/>
-      <w:r>
-        <w:rPr>
-          <w:color w:val="000000"/>
-        </w:rPr>
-        <w:t>lot.foyer_residence_dependance</w:t>
-      </w:r>
-      <w:proofErr w:type="spellEnd"/>
-      <w:r>
-        <w:rPr>
-          <w:color w:val="000000"/>
-        </w:rPr>
-        <w:t xml:space="preserve"> }}</w:t>
+        <w:t>{{ lot.foyer_residence_dependance }}</w:t>
       </w:r>
     </w:p>
     <w:p>
@@ -4436,41 +3536,13 @@
         <w:rPr>
           <w:color w:val="000000"/>
         </w:rPr>
-        <w:t xml:space="preserve">{%- </w:t>
-      </w:r>
-      <w:proofErr w:type="spellStart"/>
-      <w:r>
-        <w:rPr>
-          <w:color w:val="000000"/>
-        </w:rPr>
-        <w:t>endif</w:t>
-      </w:r>
-      <w:proofErr w:type="spellEnd"/>
-      <w:r>
-        <w:rPr>
-          <w:color w:val="000000"/>
-        </w:rPr>
-        <w:t xml:space="preserve"> %}</w:t>
+        <w:t>{%- endif %}</w:t>
       </w:r>
       <w:r>
         <w:rPr>
           <w:rFonts w:cs="TimesNewRomanPSMT"/>
         </w:rPr>
-        <w:t xml:space="preserve">{% </w:t>
-      </w:r>
-      <w:proofErr w:type="spellStart"/>
-      <w:r>
-        <w:rPr>
-          <w:rFonts w:cs="TimesNewRomanPSMT"/>
-        </w:rPr>
-        <w:t>endfor</w:t>
-      </w:r>
-      <w:proofErr w:type="spellEnd"/>
-      <w:r>
-        <w:rPr>
-          <w:rFonts w:cs="TimesNewRomanPSMT"/>
-        </w:rPr>
-        <w:t xml:space="preserve"> %}</w:t>
+        <w:t>{% endfor %}</w:t>
       </w:r>
     </w:p>
     <w:p>
@@ -4492,14 +3564,12 @@
         </w:rPr>
         <w:t>Garages et/ ou parking (nombre) : {{</w:t>
       </w:r>
-      <w:proofErr w:type="spellStart"/>
       <w:r>
         <w:rPr>
           <w:color w:val="000000"/>
         </w:rPr>
         <w:t>nombre_garage</w:t>
       </w:r>
-      <w:proofErr w:type="spellEnd"/>
       <w:r>
         <w:rPr>
           <w:color w:val="000000"/>
@@ -4546,21 +3616,12 @@
         </w:rPr>
         <w:t xml:space="preserve">{% for line in </w:t>
       </w:r>
-      <w:proofErr w:type="spellStart"/>
       <w:r>
         <w:rPr>
           <w:color w:val="000000"/>
           <w:lang w:val="en-US"/>
         </w:rPr>
-        <w:t>lot.foyer_residence_locaux_hors_convention|get_text_as_list</w:t>
-      </w:r>
-      <w:proofErr w:type="spellEnd"/>
-      <w:r>
-        <w:rPr>
-          <w:color w:val="000000"/>
-          <w:lang w:val="en-US"/>
-        </w:rPr>
-        <w:t xml:space="preserve"> </w:t>
+        <w:t xml:space="preserve">lot.foyer_residence_locaux_hors_convention|get_text_as_list </w:t>
       </w:r>
       <w:r>
         <w:rPr>
@@ -4599,35 +3660,7 @@
         <w:rPr>
           <w:color w:val="000000"/>
         </w:rPr>
-        <w:t xml:space="preserve">{%- </w:t>
-      </w:r>
-      <w:proofErr w:type="spellStart"/>
-      <w:r>
-        <w:rPr>
-          <w:color w:val="000000"/>
-        </w:rPr>
-        <w:t>endfor</w:t>
-      </w:r>
-      <w:proofErr w:type="spellEnd"/>
-      <w:r>
-        <w:rPr>
-          <w:color w:val="000000"/>
-        </w:rPr>
-        <w:t xml:space="preserve"> %}{%- </w:t>
-      </w:r>
-      <w:proofErr w:type="spellStart"/>
-      <w:r>
-        <w:rPr>
-          <w:color w:val="000000"/>
-        </w:rPr>
-        <w:t>endfor</w:t>
-      </w:r>
-      <w:proofErr w:type="spellEnd"/>
-      <w:r>
-        <w:rPr>
-          <w:color w:val="000000"/>
-        </w:rPr>
-        <w:t xml:space="preserve"> %}</w:t>
+        <w:t>{%- endfor %}{%- endfor %}</w:t>
       </w:r>
     </w:p>
     <w:p>
@@ -5231,37 +4264,7 @@
                                 <w14:round/>
                               </w14:textOutline>
                             </w:rPr>
-                            <w:t xml:space="preserve">{{ </w:t>
-                          </w:r>
-                          <w:proofErr w:type="spellStart"/>
-                          <w:r>
-                            <w:rPr>
-                              <w:color w:val="7F7F7F"/>
-                              <w:sz w:val="2"/>
-                              <w:szCs w:val="20"/>
-                              <w:lang w:val="en-US"/>
-                              <w14:textOutline w14:w="0" w14:cap="flat" w14:cmpd="sng" w14:algn="ctr">
-                                <w14:noFill/>
-                                <w14:prstDash w14:val="solid"/>
-                                <w14:round/>
-                              </w14:textOutline>
-                            </w:rPr>
-                            <w:t>convention.display_not_validated_status</w:t>
-                          </w:r>
-                          <w:proofErr w:type="spellEnd"/>
-                          <w:r>
-                            <w:rPr>
-                              <w:color w:val="7F7F7F"/>
-                              <w:sz w:val="2"/>
-                              <w:szCs w:val="20"/>
-                              <w:lang w:val="en-US"/>
-                              <w14:textOutline w14:w="0" w14:cap="flat" w14:cmpd="sng" w14:algn="ctr">
-                                <w14:noFill/>
-                                <w14:prstDash w14:val="solid"/>
-                                <w14:round/>
-                              </w14:textOutline>
-                            </w:rPr>
-                            <w:t>() }}</w:t>
+                            <w:t>{{ convention.display_not_validated_status() }}</w:t>
                           </w:r>
                         </w:p>
                       </w:txbxContent>
@@ -5308,37 +4311,7 @@
                           <w14:round/>
                         </w14:textOutline>
                       </w:rPr>
-                      <w:t xml:space="preserve">{{ </w:t>
-                    </w:r>
-                    <w:proofErr w:type="spellStart"/>
-                    <w:r>
-                      <w:rPr>
-                        <w:color w:val="7F7F7F"/>
-                        <w:sz w:val="2"/>
-                        <w:szCs w:val="20"/>
-                        <w:lang w:val="en-US"/>
-                        <w14:textOutline w14:w="0" w14:cap="flat" w14:cmpd="sng" w14:algn="ctr">
-                          <w14:noFill/>
-                          <w14:prstDash w14:val="solid"/>
-                          <w14:round/>
-                        </w14:textOutline>
-                      </w:rPr>
-                      <w:t>convention.display_not_validated_status</w:t>
-                    </w:r>
-                    <w:proofErr w:type="spellEnd"/>
-                    <w:r>
-                      <w:rPr>
-                        <w:color w:val="7F7F7F"/>
-                        <w:sz w:val="2"/>
-                        <w:szCs w:val="20"/>
-                        <w:lang w:val="en-US"/>
-                        <w14:textOutline w14:w="0" w14:cap="flat" w14:cmpd="sng" w14:algn="ctr">
-                          <w14:noFill/>
-                          <w14:prstDash w14:val="solid"/>
-                          <w14:round/>
-                        </w14:textOutline>
-                      </w:rPr>
-                      <w:t>() }}</w:t>
+                      <w:t>{{ convention.display_not_validated_status() }}</w:t>
                     </w:r>
                   </w:p>
                 </w:txbxContent>
@@ -6413,37 +5386,7 @@
                                 <w14:round/>
                               </w14:textOutline>
                             </w:rPr>
-                            <w:t xml:space="preserve">{{ </w:t>
-                          </w:r>
-                          <w:proofErr w:type="spellStart"/>
-                          <w:r>
-                            <w:rPr>
-                              <w:color w:val="7F7F7F"/>
-                              <w:sz w:val="2"/>
-                              <w:szCs w:val="20"/>
-                              <w:lang w:val="en-US"/>
-                              <w14:textOutline w14:w="0" w14:cap="flat" w14:cmpd="sng" w14:algn="ctr">
-                                <w14:noFill/>
-                                <w14:prstDash w14:val="solid"/>
-                                <w14:round/>
-                              </w14:textOutline>
-                            </w:rPr>
-                            <w:t>convention.display_not_validated_status</w:t>
-                          </w:r>
-                          <w:proofErr w:type="spellEnd"/>
-                          <w:r>
-                            <w:rPr>
-                              <w:color w:val="7F7F7F"/>
-                              <w:sz w:val="2"/>
-                              <w:szCs w:val="20"/>
-                              <w:lang w:val="en-US"/>
-                              <w14:textOutline w14:w="0" w14:cap="flat" w14:cmpd="sng" w14:algn="ctr">
-                                <w14:noFill/>
-                                <w14:prstDash w14:val="solid"/>
-                                <w14:round/>
-                              </w14:textOutline>
-                            </w:rPr>
-                            <w:t>() }}</w:t>
+                            <w:t>{{ convention.display_not_validated_status() }}</w:t>
                           </w:r>
                         </w:p>
                       </w:txbxContent>
@@ -6490,37 +5433,7 @@
                           <w14:round/>
                         </w14:textOutline>
                       </w:rPr>
-                      <w:t xml:space="preserve">{{ </w:t>
-                    </w:r>
-                    <w:proofErr w:type="spellStart"/>
-                    <w:r>
-                      <w:rPr>
-                        <w:color w:val="7F7F7F"/>
-                        <w:sz w:val="2"/>
-                        <w:szCs w:val="20"/>
-                        <w:lang w:val="en-US"/>
-                        <w14:textOutline w14:w="0" w14:cap="flat" w14:cmpd="sng" w14:algn="ctr">
-                          <w14:noFill/>
-                          <w14:prstDash w14:val="solid"/>
-                          <w14:round/>
-                        </w14:textOutline>
-                      </w:rPr>
-                      <w:t>convention.display_not_validated_status</w:t>
-                    </w:r>
-                    <w:proofErr w:type="spellEnd"/>
-                    <w:r>
-                      <w:rPr>
-                        <w:color w:val="7F7F7F"/>
-                        <w:sz w:val="2"/>
-                        <w:szCs w:val="20"/>
-                        <w:lang w:val="en-US"/>
-                        <w14:textOutline w14:w="0" w14:cap="flat" w14:cmpd="sng" w14:algn="ctr">
-                          <w14:noFill/>
-                          <w14:prstDash w14:val="solid"/>
-                          <w14:round/>
-                        </w14:textOutline>
-                      </w:rPr>
-                      <w:t>() }}</w:t>
+                      <w:t>{{ convention.display_not_validated_status() }}</w:t>
                     </w:r>
                   </w:p>
                 </w:txbxContent>
@@ -7981,6 +6894,7 @@
   <w:style w:type="character" w:default="1" w:styleId="Policepardfaut">
     <w:name w:val="Default Paragraph Font"/>
     <w:uiPriority w:val="1"/>
+    <w:semiHidden/>
     <w:unhideWhenUsed/>
   </w:style>
   <w:style w:type="table" w:default="1" w:styleId="TableauNormal">

</xml_diff>

<commit_message>
Retours sur les templates 2nd vie. Sélection et gestion du pluriel/singulier (#2147)
* gestion singulier/pluriel dans les avenants 2nd vie

* suppression tmp

---------

Co-authored-by: adrien.abescat <adrien.abescat@sully-group.fr>
</commit_message>
<xml_diff>
--- a/documents/Avenant2ndeVie-Foyer-template.docx
+++ b/documents/Avenant2ndeVie-Foyer-template.docx
@@ -21,7 +21,7 @@
           <w:szCs w:val="22"/>
           <w:lang w:eastAsia="fr-FR"/>
         </w:rPr>
-        <w:t>Avenant aux conventions n°</w:t>
+        <w:t>{% if</w:t>
       </w:r>
       <w:r>
         <w:rPr>
@@ -29,7 +29,7 @@
           <w:szCs w:val="22"/>
           <w:lang w:eastAsia="fr-FR"/>
         </w:rPr>
-        <w:t xml:space="preserve">{% </w:t>
+        <w:t xml:space="preserve"> convention.</w:t>
       </w:r>
       <w:r>
         <w:rPr>
@@ -37,7 +37,7 @@
           <w:szCs w:val="22"/>
           <w:lang w:eastAsia="fr-FR"/>
         </w:rPr>
-        <w:t xml:space="preserve">for parent in </w:t>
+        <w:t>parents_2nd_vie</w:t>
       </w:r>
       <w:r>
         <w:rPr>
@@ -45,7 +45,7 @@
           <w:szCs w:val="22"/>
           <w:lang w:eastAsia="fr-FR"/>
         </w:rPr>
-        <w:t>convention.parents_2nd_vie.all()</w:t>
+        <w:t>.all()</w:t>
       </w:r>
       <w:r>
         <w:rPr>
@@ -53,7 +53,14 @@
           <w:szCs w:val="22"/>
           <w:lang w:eastAsia="fr-FR"/>
         </w:rPr>
-        <w:t xml:space="preserve"> %}{{</w:t>
+        <w:t>|length == 1 %}Avenant à la convention</w:t>
+      </w:r>
+      <w:r>
+        <w:rPr>
+          <w:rFonts w:cs="TimesNewRomanPSMT"/>
+          <w:bCs/>
+        </w:rPr>
+        <w:t>{% else %}</w:t>
       </w:r>
       <w:r>
         <w:rPr>
@@ -61,16 +68,22 @@
           <w:szCs w:val="22"/>
           <w:lang w:eastAsia="fr-FR"/>
         </w:rPr>
-        <w:t xml:space="preserve"> </w:t>
-      </w:r>
-      <w:proofErr w:type="spellStart"/>
+        <w:t>Avenant aux conventions</w:t>
+      </w:r>
+      <w:r>
+        <w:rPr>
+          <w:rFonts w:cs="TimesNewRomanPSMT"/>
+          <w:bCs/>
+        </w:rPr>
+        <w:t>{% endif %}</w:t>
+      </w:r>
       <w:r>
         <w:rPr>
           <w:color w:val="000000"/>
           <w:szCs w:val="22"/>
           <w:lang w:eastAsia="fr-FR"/>
         </w:rPr>
-        <w:t>parent</w:t>
+        <w:t xml:space="preserve"> n°</w:t>
       </w:r>
       <w:r>
         <w:rPr>
@@ -78,76 +91,65 @@
           <w:szCs w:val="22"/>
           <w:lang w:eastAsia="fr-FR"/>
         </w:rPr>
-        <w:t>.numero</w:t>
-      </w:r>
-      <w:proofErr w:type="spellEnd"/>
+        <w:t xml:space="preserve">{% </w:t>
+      </w:r>
       <w:r>
         <w:rPr>
           <w:color w:val="000000"/>
           <w:szCs w:val="22"/>
           <w:lang w:eastAsia="fr-FR"/>
         </w:rPr>
-        <w:t>}}</w:t>
+        <w:t xml:space="preserve">for parent in </w:t>
+      </w:r>
+      <w:r>
+        <w:rPr>
+          <w:color w:val="000000"/>
+          <w:szCs w:val="22"/>
+          <w:lang w:eastAsia="fr-FR"/>
+        </w:rPr>
+        <w:t>convention.parents_2nd_vie.all()</w:t>
+      </w:r>
+      <w:r>
+        <w:rPr>
+          <w:color w:val="000000"/>
+          <w:szCs w:val="22"/>
+          <w:lang w:eastAsia="fr-FR"/>
+        </w:rPr>
+        <w:t xml:space="preserve"> %}{{</w:t>
+      </w:r>
+      <w:r>
+        <w:rPr>
+          <w:color w:val="000000"/>
+          <w:szCs w:val="22"/>
+          <w:lang w:eastAsia="fr-FR"/>
+        </w:rPr>
+        <w:t xml:space="preserve"> parent</w:t>
+      </w:r>
+      <w:r>
+        <w:rPr>
+          <w:color w:val="000000"/>
+          <w:szCs w:val="22"/>
+          <w:lang w:eastAsia="fr-FR"/>
+        </w:rPr>
+        <w:t>.numero}}</w:t>
       </w:r>
       <w:r>
         <w:rPr>
           <w:rFonts w:cs="TimesNewRomanPSMT"/>
         </w:rPr>
-        <w:t xml:space="preserve">{% if not </w:t>
-      </w:r>
-      <w:proofErr w:type="spellStart"/>
+        <w:t>{% if not loop.last %},</w:t>
+      </w:r>
       <w:r>
         <w:rPr>
           <w:rFonts w:cs="TimesNewRomanPSMT"/>
         </w:rPr>
-        <w:t>loop.last</w:t>
-      </w:r>
-      <w:proofErr w:type="spellEnd"/>
+        <w:t xml:space="preserve"> </w:t>
+      </w:r>
       <w:r>
         <w:rPr>
           <w:rFonts w:cs="TimesNewRomanPSMT"/>
         </w:rPr>
-        <w:t xml:space="preserve"> %},</w:t>
-      </w:r>
-      <w:r>
-        <w:rPr>
-          <w:rFonts w:cs="TimesNewRomanPSMT"/>
-        </w:rPr>
-        <w:t xml:space="preserve"> </w:t>
-      </w:r>
-      <w:r>
-        <w:rPr>
-          <w:rFonts w:cs="TimesNewRomanPSMT"/>
-        </w:rPr>
-        <w:t xml:space="preserve">{% </w:t>
-      </w:r>
-      <w:proofErr w:type="spellStart"/>
-      <w:r>
-        <w:rPr>
-          <w:rFonts w:cs="TimesNewRomanPSMT"/>
-        </w:rPr>
-        <w:t>endif</w:t>
-      </w:r>
-      <w:proofErr w:type="spellEnd"/>
-      <w:r>
-        <w:rPr>
-          <w:rFonts w:cs="TimesNewRomanPSMT"/>
-        </w:rPr>
-        <w:t xml:space="preserve"> %}{% </w:t>
-      </w:r>
-      <w:proofErr w:type="spellStart"/>
-      <w:r>
-        <w:rPr>
-          <w:rFonts w:cs="TimesNewRomanPSMT"/>
-        </w:rPr>
-        <w:t>endfor</w:t>
-      </w:r>
-      <w:proofErr w:type="spellEnd"/>
-      <w:r>
-        <w:rPr>
-          <w:rFonts w:cs="TimesNewRomanPSMT"/>
-        </w:rPr>
-        <w:t xml:space="preserve"> %}</w:t>
+        <w:t>{% endif %}{% endfor %}</w:t>
       </w:r>
     </w:p>
     <w:p>
@@ -215,7 +217,7 @@
           <w:szCs w:val="22"/>
           <w:lang w:eastAsia="fr-FR"/>
         </w:rPr>
-        <w:t>Les conventions n°</w:t>
+        <w:t>{% if</w:t>
       </w:r>
       <w:r>
         <w:rPr>
@@ -223,7 +225,7 @@
           <w:szCs w:val="22"/>
           <w:lang w:eastAsia="fr-FR"/>
         </w:rPr>
-        <w:t xml:space="preserve">{% </w:t>
+        <w:t xml:space="preserve"> convention.</w:t>
       </w:r>
       <w:r>
         <w:rPr>
@@ -231,7 +233,7 @@
           <w:szCs w:val="22"/>
           <w:lang w:eastAsia="fr-FR"/>
         </w:rPr>
-        <w:t xml:space="preserve">for parent in </w:t>
+        <w:t>parents_2nd_vie</w:t>
       </w:r>
       <w:r>
         <w:rPr>
@@ -239,7 +241,7 @@
           <w:szCs w:val="22"/>
           <w:lang w:eastAsia="fr-FR"/>
         </w:rPr>
-        <w:t>convention.parents_2nd_vie.all()</w:t>
+        <w:t>.all()</w:t>
       </w:r>
       <w:r>
         <w:rPr>
@@ -247,7 +249,14 @@
           <w:szCs w:val="22"/>
           <w:lang w:eastAsia="fr-FR"/>
         </w:rPr>
-        <w:t xml:space="preserve"> %}{{</w:t>
+        <w:t>|length == 1 %}La convention</w:t>
+      </w:r>
+      <w:r>
+        <w:rPr>
+          <w:rFonts w:cs="TimesNewRomanPSMT"/>
+          <w:bCs/>
+        </w:rPr>
+        <w:t>{% else %}</w:t>
       </w:r>
       <w:r>
         <w:rPr>
@@ -257,14 +266,20 @@
         </w:rPr>
         <w:t xml:space="preserve"> </w:t>
       </w:r>
-      <w:proofErr w:type="spellStart"/>
       <w:r>
         <w:rPr>
           <w:color w:val="000000"/>
           <w:szCs w:val="22"/>
           <w:lang w:eastAsia="fr-FR"/>
         </w:rPr>
-        <w:t>parent</w:t>
+        <w:t>Les conventions</w:t>
+      </w:r>
+      <w:r>
+        <w:rPr>
+          <w:rFonts w:cs="TimesNewRomanPSMT"/>
+          <w:bCs/>
+        </w:rPr>
+        <w:t xml:space="preserve"> {% endif %}</w:t>
       </w:r>
       <w:r>
         <w:rPr>
@@ -272,76 +287,15 @@
           <w:szCs w:val="22"/>
           <w:lang w:eastAsia="fr-FR"/>
         </w:rPr>
-        <w:t>.numero</w:t>
-      </w:r>
-      <w:proofErr w:type="spellEnd"/>
+        <w:t xml:space="preserve"> n°</w:t>
+      </w:r>
       <w:r>
         <w:rPr>
           <w:color w:val="000000"/>
           <w:szCs w:val="22"/>
           <w:lang w:eastAsia="fr-FR"/>
         </w:rPr>
-        <w:t>}}</w:t>
-      </w:r>
-      <w:r>
-        <w:rPr>
-          <w:rFonts w:cs="TimesNewRomanPSMT"/>
-        </w:rPr>
-        <w:t xml:space="preserve">{% if not </w:t>
-      </w:r>
-      <w:proofErr w:type="spellStart"/>
-      <w:r>
-        <w:rPr>
-          <w:rFonts w:cs="TimesNewRomanPSMT"/>
-        </w:rPr>
-        <w:t>loop.last</w:t>
-      </w:r>
-      <w:proofErr w:type="spellEnd"/>
-      <w:r>
-        <w:rPr>
-          <w:rFonts w:cs="TimesNewRomanPSMT"/>
-        </w:rPr>
-        <w:t xml:space="preserve"> %},</w:t>
-      </w:r>
-      <w:r>
-        <w:rPr>
-          <w:rFonts w:cs="TimesNewRomanPSMT"/>
-        </w:rPr>
-        <w:t xml:space="preserve"> </w:t>
-      </w:r>
-      <w:r>
-        <w:rPr>
-          <w:rFonts w:cs="TimesNewRomanPSMT"/>
-        </w:rPr>
         <w:t xml:space="preserve">{% </w:t>
-      </w:r>
-      <w:proofErr w:type="spellStart"/>
-      <w:r>
-        <w:rPr>
-          <w:rFonts w:cs="TimesNewRomanPSMT"/>
-        </w:rPr>
-        <w:t>endif</w:t>
-      </w:r>
-      <w:proofErr w:type="spellEnd"/>
-      <w:r>
-        <w:rPr>
-          <w:rFonts w:cs="TimesNewRomanPSMT"/>
-        </w:rPr>
-        <w:t xml:space="preserve"> %}{% </w:t>
-      </w:r>
-      <w:proofErr w:type="spellStart"/>
-      <w:r>
-        <w:rPr>
-          <w:rFonts w:cs="TimesNewRomanPSMT"/>
-        </w:rPr>
-        <w:t>endfor</w:t>
-      </w:r>
-      <w:proofErr w:type="spellEnd"/>
-      <w:r>
-        <w:rPr>
-          <w:rFonts w:cs="TimesNewRomanPSMT"/>
-        </w:rPr>
-        <w:t xml:space="preserve"> %}</w:t>
       </w:r>
       <w:r>
         <w:rPr>
@@ -349,7 +303,7 @@
           <w:szCs w:val="22"/>
           <w:lang w:eastAsia="fr-FR"/>
         </w:rPr>
-        <w:t xml:space="preserve"> sont modifiées à l'issue des travaux réalisés dans le cadre de l'opération de réhabilitation "seconde vie" n°</w:t>
+        <w:t xml:space="preserve">for parent in </w:t>
       </w:r>
       <w:r>
         <w:rPr>
@@ -357,25 +311,143 @@
           <w:szCs w:val="22"/>
           <w:lang w:eastAsia="fr-FR"/>
         </w:rPr>
-        <w:t>{{</w:t>
-      </w:r>
-      <w:proofErr w:type="spellStart"/>
+        <w:t>convention.parents_2nd_vie.all()</w:t>
+      </w:r>
       <w:r>
         <w:rPr>
           <w:color w:val="000000"/>
           <w:szCs w:val="22"/>
           <w:lang w:eastAsia="fr-FR"/>
         </w:rPr>
-        <w:t>convention.programme.numero_operation</w:t>
-      </w:r>
-      <w:proofErr w:type="spellEnd"/>
+        <w:t xml:space="preserve"> %}{{</w:t>
+      </w:r>
       <w:r>
         <w:rPr>
           <w:color w:val="000000"/>
           <w:szCs w:val="22"/>
           <w:lang w:eastAsia="fr-FR"/>
         </w:rPr>
-        <w:t>}}</w:t>
+        <w:t xml:space="preserve"> parent</w:t>
+      </w:r>
+      <w:r>
+        <w:rPr>
+          <w:color w:val="000000"/>
+          <w:szCs w:val="22"/>
+          <w:lang w:eastAsia="fr-FR"/>
+        </w:rPr>
+        <w:t>.numero}}</w:t>
+      </w:r>
+      <w:r>
+        <w:rPr>
+          <w:rFonts w:cs="TimesNewRomanPSMT"/>
+        </w:rPr>
+        <w:t>{% if not loop.last %},</w:t>
+      </w:r>
+      <w:r>
+        <w:rPr>
+          <w:rFonts w:cs="TimesNewRomanPSMT"/>
+        </w:rPr>
+        <w:t xml:space="preserve"> </w:t>
+      </w:r>
+      <w:r>
+        <w:rPr>
+          <w:rFonts w:cs="TimesNewRomanPSMT"/>
+        </w:rPr>
+        <w:t>{% endif %}{% endfor %}</w:t>
+      </w:r>
+      <w:r>
+        <w:rPr>
+          <w:color w:val="000000"/>
+          <w:szCs w:val="22"/>
+          <w:lang w:eastAsia="fr-FR"/>
+        </w:rPr>
+        <w:t xml:space="preserve"> </w:t>
+      </w:r>
+      <w:r>
+        <w:rPr>
+          <w:color w:val="000000"/>
+          <w:szCs w:val="22"/>
+          <w:lang w:eastAsia="fr-FR"/>
+        </w:rPr>
+        <w:t>{% if</w:t>
+      </w:r>
+      <w:r>
+        <w:rPr>
+          <w:color w:val="000000"/>
+          <w:szCs w:val="22"/>
+          <w:lang w:eastAsia="fr-FR"/>
+        </w:rPr>
+        <w:t xml:space="preserve"> convention.</w:t>
+      </w:r>
+      <w:r>
+        <w:rPr>
+          <w:color w:val="000000"/>
+          <w:szCs w:val="22"/>
+          <w:lang w:eastAsia="fr-FR"/>
+        </w:rPr>
+        <w:t>parents_2nd_vie</w:t>
+      </w:r>
+      <w:r>
+        <w:rPr>
+          <w:color w:val="000000"/>
+          <w:szCs w:val="22"/>
+          <w:lang w:eastAsia="fr-FR"/>
+        </w:rPr>
+        <w:t>.all()</w:t>
+      </w:r>
+      <w:r>
+        <w:rPr>
+          <w:color w:val="000000"/>
+          <w:szCs w:val="22"/>
+          <w:lang w:eastAsia="fr-FR"/>
+        </w:rPr>
+        <w:t>|length == 1 %}</w:t>
+      </w:r>
+      <w:r>
+        <w:rPr>
+          <w:color w:val="000000"/>
+          <w:szCs w:val="22"/>
+          <w:lang w:eastAsia="fr-FR"/>
+        </w:rPr>
+        <w:t>est modifiée</w:t>
+      </w:r>
+      <w:r>
+        <w:rPr>
+          <w:rFonts w:cs="TimesNewRomanPSMT"/>
+          <w:bCs/>
+        </w:rPr>
+        <w:t>{% else %}</w:t>
+      </w:r>
+      <w:r>
+        <w:rPr>
+          <w:color w:val="000000"/>
+          <w:szCs w:val="22"/>
+          <w:lang w:eastAsia="fr-FR"/>
+        </w:rPr>
+        <w:t>sont modifiées</w:t>
+      </w:r>
+      <w:r>
+        <w:rPr>
+          <w:rFonts w:cs="TimesNewRomanPSMT"/>
+          <w:bCs/>
+        </w:rPr>
+        <w:t>{% endif %}</w:t>
+      </w:r>
+      <w:r>
+        <w:rPr>
+          <w:color w:val="000000"/>
+          <w:szCs w:val="22"/>
+          <w:lang w:eastAsia="fr-FR"/>
+        </w:rPr>
+        <w:t xml:space="preserve"> à l'issue des travaux réalisés dans le cadre de l'opération de réhabilitation "seconde vie" n°</w:t>
+      </w:r>
+      <w:r>
+        <w:rPr>
+          <w:color w:val="000000"/>
+          <w:szCs w:val="22"/>
+          <w:lang w:eastAsia="fr-FR"/>
+        </w:rPr>
+        <w:t>{{convention.programme.numero_operation}}</w:t>
       </w:r>
       <w:r>
         <w:rPr>
@@ -451,7 +523,101 @@
           <w:szCs w:val="22"/>
           <w:lang w:eastAsia="fr-FR"/>
         </w:rPr>
-        <w:t>La date d’expiration des conventions mentionnées à l’article 1</w:t>
+        <w:t xml:space="preserve">La date d’expiration </w:t>
+      </w:r>
+      <w:r>
+        <w:rPr>
+          <w:color w:val="000000"/>
+          <w:szCs w:val="22"/>
+          <w:lang w:eastAsia="fr-FR"/>
+        </w:rPr>
+        <w:t>{% if</w:t>
+      </w:r>
+      <w:r>
+        <w:rPr>
+          <w:color w:val="000000"/>
+          <w:szCs w:val="22"/>
+          <w:lang w:eastAsia="fr-FR"/>
+        </w:rPr>
+        <w:t xml:space="preserve"> convention.</w:t>
+      </w:r>
+      <w:r>
+        <w:rPr>
+          <w:color w:val="000000"/>
+          <w:szCs w:val="22"/>
+          <w:lang w:eastAsia="fr-FR"/>
+        </w:rPr>
+        <w:t>parents_2nd_vie</w:t>
+      </w:r>
+      <w:r>
+        <w:rPr>
+          <w:color w:val="000000"/>
+          <w:szCs w:val="22"/>
+          <w:lang w:eastAsia="fr-FR"/>
+        </w:rPr>
+        <w:t>.all()</w:t>
+      </w:r>
+      <w:r>
+        <w:rPr>
+          <w:color w:val="000000"/>
+          <w:szCs w:val="22"/>
+          <w:lang w:eastAsia="fr-FR"/>
+        </w:rPr>
+        <w:t>|length == 1 %}</w:t>
+      </w:r>
+      <w:r>
+        <w:rPr>
+          <w:color w:val="000000"/>
+          <w:szCs w:val="22"/>
+          <w:lang w:eastAsia="fr-FR"/>
+        </w:rPr>
+        <w:t>de l</w:t>
+      </w:r>
+      <w:r>
+        <w:rPr>
+          <w:color w:val="000000"/>
+          <w:szCs w:val="22"/>
+          <w:lang w:eastAsia="fr-FR"/>
+        </w:rPr>
+        <w:t xml:space="preserve">a convention </w:t>
+      </w:r>
+      <w:r>
+        <w:rPr>
+          <w:color w:val="000000"/>
+          <w:szCs w:val="22"/>
+          <w:lang w:eastAsia="fr-FR"/>
+        </w:rPr>
+        <w:t>mentionnée</w:t>
+      </w:r>
+      <w:r>
+        <w:rPr>
+          <w:rFonts w:cs="TimesNewRomanPSMT"/>
+          <w:bCs/>
+        </w:rPr>
+        <w:t>{% else %}</w:t>
+      </w:r>
+      <w:r>
+        <w:rPr>
+          <w:color w:val="000000"/>
+          <w:szCs w:val="22"/>
+          <w:lang w:eastAsia="fr-FR"/>
+        </w:rPr>
+        <w:t>des conventions mentionnées</w:t>
+      </w:r>
+      <w:r>
+        <w:rPr>
+          <w:rFonts w:cs="TimesNewRomanPSMT"/>
+          <w:bCs/>
+        </w:rPr>
+        <w:t>{% endif %}</w:t>
+      </w:r>
+      <w:r>
+        <w:rPr>
+          <w:color w:val="000000"/>
+          <w:szCs w:val="22"/>
+          <w:lang w:eastAsia="fr-FR"/>
+        </w:rPr>
+        <w:t xml:space="preserve"> à l’article 1</w:t>
       </w:r>
       <w:r>
         <w:rPr>
@@ -488,27 +654,97 @@
           <w:szCs w:val="22"/>
           <w:lang w:eastAsia="fr-FR"/>
         </w:rPr>
-        <w:t xml:space="preserve">Les conventions expirent le </w:t>
+        <w:t>{% if</w:t>
+      </w:r>
+      <w:r>
+        <w:rPr>
+          <w:color w:val="000000"/>
+          <w:szCs w:val="22"/>
+          <w:lang w:eastAsia="fr-FR"/>
+        </w:rPr>
+        <w:t xml:space="preserve"> convention.</w:t>
+      </w:r>
+      <w:r>
+        <w:rPr>
+          <w:color w:val="000000"/>
+          <w:szCs w:val="22"/>
+          <w:lang w:eastAsia="fr-FR"/>
+        </w:rPr>
+        <w:t>parents_2nd_vie</w:t>
+      </w:r>
+      <w:r>
+        <w:rPr>
+          <w:color w:val="000000"/>
+          <w:szCs w:val="22"/>
+          <w:lang w:eastAsia="fr-FR"/>
+        </w:rPr>
+        <w:t>.all()</w:t>
+      </w:r>
+      <w:r>
+        <w:rPr>
+          <w:color w:val="000000"/>
+          <w:szCs w:val="22"/>
+          <w:lang w:eastAsia="fr-FR"/>
+        </w:rPr>
+        <w:t>|length == 1 %}La convention expire</w:t>
       </w:r>
       <w:r>
         <w:rPr>
           <w:rFonts w:cs="TimesNewRomanPSMT"/>
-        </w:rPr>
-        <w:t xml:space="preserve">{{ </w:t>
-      </w:r>
-      <w:proofErr w:type="spellStart"/>
+          <w:bCs/>
+        </w:rPr>
+        <w:t>{% else %}</w:t>
+      </w:r>
+      <w:r>
+        <w:rPr>
+          <w:color w:val="000000"/>
+          <w:szCs w:val="22"/>
+          <w:lang w:eastAsia="fr-FR"/>
+        </w:rPr>
+        <w:t xml:space="preserve"> </w:t>
+      </w:r>
+      <w:r>
+        <w:rPr>
+          <w:color w:val="000000"/>
+          <w:szCs w:val="22"/>
+          <w:lang w:eastAsia="fr-FR"/>
+        </w:rPr>
+        <w:t>Les conventions</w:t>
+      </w:r>
       <w:r>
         <w:rPr>
           <w:rFonts w:cs="TimesNewRomanPSMT"/>
-        </w:rPr>
-        <w:t>convention.date_fin_conventionnement|d</w:t>
-      </w:r>
-      <w:proofErr w:type="spellEnd"/>
+          <w:bCs/>
+        </w:rPr>
+        <w:t xml:space="preserve"> </w:t>
+      </w:r>
       <w:r>
         <w:rPr>
           <w:rFonts w:cs="TimesNewRomanPSMT"/>
-        </w:rPr>
-        <w:t xml:space="preserve"> }}</w:t>
+          <w:bCs/>
+        </w:rPr>
+        <w:t>expirent</w:t>
+      </w:r>
+      <w:r>
+        <w:rPr>
+          <w:rFonts w:cs="TimesNewRomanPSMT"/>
+          <w:bCs/>
+        </w:rPr>
+        <w:t>{% endif %}</w:t>
+      </w:r>
+      <w:r>
+        <w:rPr>
+          <w:color w:val="000000"/>
+          <w:szCs w:val="22"/>
+          <w:lang w:eastAsia="fr-FR"/>
+        </w:rPr>
+        <w:t xml:space="preserve"> le </w:t>
+      </w:r>
+      <w:r>
+        <w:rPr>
+          <w:rFonts w:cs="TimesNewRomanPSMT"/>
+        </w:rPr>
+        <w:t>{{ convention.date_fin_conventionnement|d }}</w:t>
       </w:r>
     </w:p>
     <w:p>
@@ -588,7 +824,11 @@
         <w:t xml:space="preserve"> </w:t>
       </w:r>
       <w:r>
-        <w:t>des conventions mentionnées à l’article 1</w:t>
+        <w:t xml:space="preserve">des conventions mentionnées à l’article </w:t>
+      </w:r>
+      <w:r>
+        <w:lastRenderedPageBreak/>
+        <w:t>1</w:t>
       </w:r>
       <w:r>
         <w:rPr>
@@ -620,7 +860,7 @@
           <w:kern w:val="2"/>
           <w:lang w:eastAsia="zh-CN" w:bidi="hi-IN"/>
         </w:rPr>
-        <w:t xml:space="preserve">La part de la redevance mensuelle prise en compte pour le calcul de l'aide personnalisée au logement, assimilable au loyer et aux charges locatives récupérables, acquittée par le résident, hors dépenses liées aux prestations définies à l'article 12, ne doit pas excéder un maximum qui est fixé en euros par type de logement et dont le montant est inscrit </w:t>
+        <w:t xml:space="preserve">La part de la redevance mensuelle prise en compte pour le calcul de l'aide personnalisée au logement, assimilable au loyer et aux charges locatives récupérables, acquittée par le résident, hors dépenses liées aux prestations définies à l'article 12, ne doit pas excéder un maximum qui est fixé en euros par type de logement et dont le montant est inscrit dans le tableau du III de l'annexe </w:t>
       </w:r>
       <w:r>
         <w:rPr>
@@ -628,8 +868,7 @@
           <w:kern w:val="2"/>
           <w:lang w:eastAsia="zh-CN" w:bidi="hi-IN"/>
         </w:rPr>
-        <w:lastRenderedPageBreak/>
-        <w:t xml:space="preserve">dans le tableau du III de l'annexe </w:t>
+        <w:t>au</w:t>
       </w:r>
       <w:r>
         <w:rPr>
@@ -637,7 +876,7 @@
           <w:kern w:val="2"/>
           <w:lang w:eastAsia="zh-CN" w:bidi="hi-IN"/>
         </w:rPr>
-        <w:t>au</w:t>
+        <w:t xml:space="preserve"> présent</w:t>
       </w:r>
       <w:r>
         <w:rPr>
@@ -645,7 +884,7 @@
           <w:kern w:val="2"/>
           <w:lang w:eastAsia="zh-CN" w:bidi="hi-IN"/>
         </w:rPr>
-        <w:t xml:space="preserve"> présent</w:t>
+        <w:t xml:space="preserve"> avenant</w:t>
       </w:r>
       <w:r>
         <w:rPr>
@@ -653,7 +892,7 @@
           <w:kern w:val="2"/>
           <w:lang w:eastAsia="zh-CN" w:bidi="hi-IN"/>
         </w:rPr>
-        <w:t xml:space="preserve"> avenant</w:t>
+        <w:t xml:space="preserve"> applicable au logement concerné selon le type de prêt locatif aidé ayant permis sa  rénovation</w:t>
       </w:r>
       <w:r>
         <w:rPr>
@@ -661,35 +900,35 @@
           <w:kern w:val="2"/>
           <w:lang w:eastAsia="zh-CN" w:bidi="hi-IN"/>
         </w:rPr>
-        <w:t xml:space="preserve"> applicable au logement concerné selon le type de prêt locatif aidé ayant permis sa  rénovation</w:t>
-      </w:r>
-      <w:r>
+        <w:t>.</w:t>
+      </w:r>
+    </w:p>
+    <w:p>
+      <w:pPr>
+        <w:widowControl w:val="0"/>
+        <w:spacing w:after="140" w:line="288" w:lineRule="auto"/>
+        <w:jc w:val="both"/>
         <w:rPr>
           <w:rFonts w:eastAsia="SimSun;宋体"/>
           <w:kern w:val="2"/>
           <w:lang w:eastAsia="zh-CN" w:bidi="hi-IN"/>
         </w:rPr>
-        <w:t>.</w:t>
-      </w:r>
-    </w:p>
-    <w:p>
-      <w:pPr>
-        <w:widowControl w:val="0"/>
-        <w:spacing w:after="140" w:line="288" w:lineRule="auto"/>
-        <w:jc w:val="both"/>
+      </w:pPr>
+      <w:r>
         <w:rPr>
           <w:rFonts w:eastAsia="SimSun;宋体"/>
           <w:kern w:val="2"/>
           <w:lang w:eastAsia="zh-CN" w:bidi="hi-IN"/>
         </w:rPr>
-      </w:pPr>
+        <w:t>Lorsque l</w:t>
+      </w:r>
       <w:r>
         <w:rPr>
           <w:rFonts w:eastAsia="SimSun;宋体"/>
           <w:kern w:val="2"/>
           <w:lang w:eastAsia="zh-CN" w:bidi="hi-IN"/>
         </w:rPr>
-        <w:t>Lorsque l</w:t>
+        <w:t>a rénovation du</w:t>
       </w:r>
       <w:r>
         <w:rPr>
@@ -697,33 +936,7 @@
           <w:kern w:val="2"/>
           <w:lang w:eastAsia="zh-CN" w:bidi="hi-IN"/>
         </w:rPr>
-        <w:t>a rénovation du</w:t>
-      </w:r>
-      <w:r>
-        <w:rPr>
-          <w:rFonts w:eastAsia="SimSun;宋体"/>
-          <w:kern w:val="2"/>
-          <w:lang w:eastAsia="zh-CN" w:bidi="hi-IN"/>
-        </w:rPr>
-        <w:t xml:space="preserve"> logement-foyer a bénéficié de plus d’un prêt locatif aidé (</w:t>
-      </w:r>
-      <w:proofErr w:type="spellStart"/>
-      <w:r>
-        <w:rPr>
-          <w:rFonts w:eastAsia="SimSun;宋体"/>
-          <w:kern w:val="2"/>
-          <w:lang w:eastAsia="zh-CN" w:bidi="hi-IN"/>
-        </w:rPr>
-        <w:t>PLAi</w:t>
-      </w:r>
-      <w:proofErr w:type="spellEnd"/>
-      <w:r>
-        <w:rPr>
-          <w:rFonts w:eastAsia="SimSun;宋体"/>
-          <w:kern w:val="2"/>
-          <w:lang w:eastAsia="zh-CN" w:bidi="hi-IN"/>
-        </w:rPr>
-        <w:t xml:space="preserve">, PLUS, PLS), une redevance maximale est déterminée pour chacun des prêts obtenus et le tableau III de l’annexe </w:t>
+        <w:t xml:space="preserve"> logement-foyer a bénéficié de plus d’un prêt locatif aidé (PLAi, PLUS, PLS), une redevance maximale est déterminée pour chacun des prêts obtenus et le tableau III de l’annexe </w:t>
       </w:r>
       <w:r>
         <w:rPr>
@@ -962,21 +1175,7 @@
         <w:rPr>
           <w:color w:val="000000"/>
         </w:rPr>
-        <w:t>Fait à {{</w:t>
-      </w:r>
-      <w:proofErr w:type="spellStart"/>
-      <w:r>
-        <w:rPr>
-          <w:color w:val="000000"/>
-        </w:rPr>
-        <w:t>administration.get_ville_signature_or_empty</w:t>
-      </w:r>
-      <w:proofErr w:type="spellEnd"/>
-      <w:r>
-        <w:rPr>
-          <w:color w:val="000000"/>
-        </w:rPr>
-        <w:t>() }}, le</w:t>
+        <w:t>Fait à {{administration.get_ville_signature_or_empty() }}, le</w:t>
       </w:r>
     </w:p>
     <w:p>
@@ -1000,77 +1199,7 @@
         <w:rPr>
           <w:color w:val="000000"/>
         </w:rPr>
-        <w:t xml:space="preserve">Le propriétaire (6), {%  if </w:t>
-      </w:r>
-      <w:proofErr w:type="spellStart"/>
-      <w:r>
-        <w:rPr>
-          <w:color w:val="000000"/>
-        </w:rPr>
-        <w:t>convention.signataire_bloc_signature</w:t>
-      </w:r>
-      <w:proofErr w:type="spellEnd"/>
-      <w:r>
-        <w:rPr>
-          <w:color w:val="000000"/>
-        </w:rPr>
-        <w:t xml:space="preserve"> %}{{ </w:t>
-      </w:r>
-      <w:proofErr w:type="spellStart"/>
-      <w:r>
-        <w:rPr>
-          <w:color w:val="000000"/>
-        </w:rPr>
-        <w:t>convention.signataire_bloc_signature|default_empty_if_none</w:t>
-      </w:r>
-      <w:proofErr w:type="spellEnd"/>
-      <w:r>
-        <w:rPr>
-          <w:color w:val="000000"/>
-        </w:rPr>
-        <w:t xml:space="preserve"> }}{% </w:t>
-      </w:r>
-      <w:proofErr w:type="spellStart"/>
-      <w:r>
-        <w:rPr>
-          <w:color w:val="000000"/>
-        </w:rPr>
-        <w:t>else</w:t>
-      </w:r>
-      <w:proofErr w:type="spellEnd"/>
-      <w:r>
-        <w:rPr>
-          <w:color w:val="000000"/>
-        </w:rPr>
-        <w:t xml:space="preserve"> %} {{ </w:t>
-      </w:r>
-      <w:proofErr w:type="spellStart"/>
-      <w:r>
-        <w:rPr>
-          <w:color w:val="000000"/>
-        </w:rPr>
-        <w:t>bailleur.signataire_bloc_signature|default_empty_if_none</w:t>
-      </w:r>
-      <w:proofErr w:type="spellEnd"/>
-      <w:r>
-        <w:rPr>
-          <w:color w:val="000000"/>
-        </w:rPr>
-        <w:t xml:space="preserve"> }}{% </w:t>
-      </w:r>
-      <w:proofErr w:type="spellStart"/>
-      <w:r>
-        <w:rPr>
-          <w:color w:val="000000"/>
-        </w:rPr>
-        <w:t>endif</w:t>
-      </w:r>
-      <w:proofErr w:type="spellEnd"/>
-      <w:r>
-        <w:rPr>
-          <w:color w:val="000000"/>
-        </w:rPr>
-        <w:t xml:space="preserve"> %}</w:t>
+        <w:t>Le propriétaire (6), {%  if convention.signataire_bloc_signature %}{{ convention.signataire_bloc_signature|default_empty_if_none }}{% else %} {{ bailleur.signataire_bloc_signature|default_empty_if_none }}{% endif %}</w:t>
       </w:r>
     </w:p>
     <w:p>
@@ -1121,6 +1250,7 @@
         <w:rPr>
           <w:color w:val="000000"/>
         </w:rPr>
+        <w:lastRenderedPageBreak/>
         <w:t>Le gestionnaire (6), {{ convention.gestionnaire_signataire_bloc_signature|default_empty_if_none }}</w:t>
       </w:r>
     </w:p>
@@ -1178,69 +1308,13 @@
         <w:rPr>
           <w:shd w:val="clear" w:color="auto" w:fill="FFFFFF"/>
         </w:rPr>
-        <w:t xml:space="preserve">Le préfet, le président de l'établissement public de coopération intercommunale, {% if </w:t>
-      </w:r>
-      <w:proofErr w:type="spellStart"/>
-      <w:r>
-        <w:rPr>
-          <w:shd w:val="clear" w:color="auto" w:fill="FFFFFF"/>
-        </w:rPr>
-        <w:t>outre_mer</w:t>
-      </w:r>
-      <w:proofErr w:type="spellEnd"/>
-      <w:r>
-        <w:rPr>
-          <w:shd w:val="clear" w:color="auto" w:fill="FFFFFF"/>
-        </w:rPr>
-        <w:t xml:space="preserve"> %}le président du conseil départemental de Guadeloupe, de La Réunion, de Mayotte, de l'assemblée de Guyane, du conseil exécutif de Martinique{% </w:t>
-      </w:r>
-      <w:proofErr w:type="spellStart"/>
-      <w:r>
-        <w:rPr>
-          <w:shd w:val="clear" w:color="auto" w:fill="FFFFFF"/>
-        </w:rPr>
-        <w:t>else</w:t>
-      </w:r>
-      <w:proofErr w:type="spellEnd"/>
-      <w:r>
-        <w:rPr>
-          <w:shd w:val="clear" w:color="auto" w:fill="FFFFFF"/>
-        </w:rPr>
-        <w:t xml:space="preserve"> %}du conseil départemental, de la métropole de Lyon, de la métropole du Grand Paris, de la métropole d’Aix-Marseille-Provence, ou du conseil exécutif de Corse,{% </w:t>
-      </w:r>
-      <w:proofErr w:type="spellStart"/>
-      <w:r>
-        <w:rPr>
-          <w:shd w:val="clear" w:color="auto" w:fill="FFFFFF"/>
-        </w:rPr>
-        <w:t>endif</w:t>
-      </w:r>
-      <w:proofErr w:type="spellEnd"/>
-      <w:r>
-        <w:rPr>
-          <w:shd w:val="clear" w:color="auto" w:fill="FFFFFF"/>
-        </w:rPr>
-        <w:t xml:space="preserve">  %}</w:t>
-      </w:r>
-      <w:r>
-        <w:rPr>
-          <w:color w:val="000000"/>
-        </w:rPr>
-        <w:t xml:space="preserve"> {{ </w:t>
-      </w:r>
-      <w:proofErr w:type="spellStart"/>
-      <w:r>
-        <w:rPr>
-          <w:color w:val="000000"/>
-        </w:rPr>
-        <w:t>administration.signataire_bloc_signature|default_empty_if_none</w:t>
-      </w:r>
-      <w:proofErr w:type="spellEnd"/>
-      <w:r>
-        <w:rPr>
-          <w:color w:val="000000"/>
-        </w:rPr>
-        <w:t xml:space="preserve"> }}</w:t>
+        <w:t>Le préfet, le président de l'établissement public de coopération intercommunale, {% if outre_mer %}le président du conseil départemental de Guadeloupe, de La Réunion, de Mayotte, de l'assemblée de Guyane, du conseil exécutif de Martinique{% else %}du conseil départemental, de la métropole de Lyon, de la métropole du Grand Paris, de la métropole d’Aix-Marseille-Provence, ou du conseil exécutif de Corse,{% endif  %}</w:t>
+      </w:r>
+      <w:r>
+        <w:rPr>
+          <w:color w:val="000000"/>
+        </w:rPr>
+        <w:t xml:space="preserve"> {{ administration.signataire_bloc_signature|default_empty_if_none }}</w:t>
       </w:r>
     </w:p>
     <w:p>
@@ -1308,29 +1382,7 @@
           <w:szCs w:val="22"/>
           <w:lang w:eastAsia="fr-FR"/>
         </w:rPr>
-        <w:t xml:space="preserve"> %}{{ </w:t>
-      </w:r>
-      <w:proofErr w:type="spellStart"/>
-      <w:r>
-        <w:rPr>
-          <w:b/>
-          <w:bCs/>
-          <w:color w:val="000000"/>
-          <w:szCs w:val="22"/>
-          <w:lang w:eastAsia="fr-FR"/>
-        </w:rPr>
-        <w:t>parent.numero</w:t>
-      </w:r>
-      <w:proofErr w:type="spellEnd"/>
-      <w:r>
-        <w:rPr>
-          <w:b/>
-          <w:bCs/>
-          <w:color w:val="000000"/>
-          <w:szCs w:val="22"/>
-          <w:lang w:eastAsia="fr-FR"/>
-        </w:rPr>
-        <w:t>}}</w:t>
+        <w:t xml:space="preserve"> %}{{ parent.numero}}</w:t>
       </w:r>
       <w:r>
         <w:rPr>
@@ -1338,61 +1390,7 @@
           <w:b/>
           <w:bCs/>
         </w:rPr>
-        <w:t xml:space="preserve">{% if not </w:t>
-      </w:r>
-      <w:proofErr w:type="spellStart"/>
-      <w:r>
-        <w:rPr>
-          <w:rFonts w:cs="TimesNewRomanPSMT"/>
-          <w:b/>
-          <w:bCs/>
-        </w:rPr>
-        <w:t>loop.last</w:t>
-      </w:r>
-      <w:proofErr w:type="spellEnd"/>
-      <w:r>
-        <w:rPr>
-          <w:rFonts w:cs="TimesNewRomanPSMT"/>
-          <w:b/>
-          <w:bCs/>
-        </w:rPr>
-        <w:t xml:space="preserve"> %}, {% </w:t>
-      </w:r>
-      <w:proofErr w:type="spellStart"/>
-      <w:r>
-        <w:rPr>
-          <w:rFonts w:cs="TimesNewRomanPSMT"/>
-          <w:b/>
-          <w:bCs/>
-        </w:rPr>
-        <w:t>endif</w:t>
-      </w:r>
-      <w:proofErr w:type="spellEnd"/>
-      <w:r>
-        <w:rPr>
-          <w:rFonts w:cs="TimesNewRomanPSMT"/>
-          <w:b/>
-          <w:bCs/>
-        </w:rPr>
-        <w:t xml:space="preserve"> %}{% </w:t>
-      </w:r>
-      <w:proofErr w:type="spellStart"/>
-      <w:r>
-        <w:rPr>
-          <w:rFonts w:cs="TimesNewRomanPSMT"/>
-          <w:b/>
-          <w:bCs/>
-        </w:rPr>
-        <w:t>endfor</w:t>
-      </w:r>
-      <w:proofErr w:type="spellEnd"/>
-      <w:r>
-        <w:rPr>
-          <w:rFonts w:cs="TimesNewRomanPSMT"/>
-          <w:b/>
-          <w:bCs/>
-        </w:rPr>
-        <w:t xml:space="preserve"> %}</w:t>
+        <w:t>{% if not loop.last %}, {% endif %}{% endfor %}</w:t>
       </w:r>
     </w:p>
     <w:p>
@@ -1529,14 +1527,12 @@
         </w:rPr>
         <w:t xml:space="preserve"> </w:t>
       </w:r>
-      <w:proofErr w:type="spellStart"/>
       <w:r>
         <w:rPr>
           <w:color w:val="000000"/>
         </w:rPr>
         <w:t>surface_habitable_totale</w:t>
       </w:r>
-      <w:proofErr w:type="spellEnd"/>
     </w:p>
     <w:p>
       <w:pPr>
@@ -1574,15 +1570,7 @@
         <w:t xml:space="preserve">* Surface habitable totale des parties privatives : </w:t>
       </w:r>
       <w:r>
-        <w:t xml:space="preserve">{{ </w:t>
-      </w:r>
-      <w:proofErr w:type="spellStart"/>
-      <w:r>
-        <w:t>sh_totale|f</w:t>
-      </w:r>
-      <w:proofErr w:type="spellEnd"/>
-      <w:r>
-        <w:t xml:space="preserve"> }} </w:t>
+        <w:t xml:space="preserve">{{ sh_totale|f }} </w:t>
       </w:r>
       <w:r>
         <w:rPr>
@@ -1621,21 +1609,7 @@
         <w:rPr>
           <w:color w:val="000000"/>
         </w:rPr>
-        <w:t xml:space="preserve">Nombre total de logements : {{ </w:t>
-      </w:r>
-      <w:proofErr w:type="spellStart"/>
-      <w:r>
-        <w:rPr>
-          <w:color w:val="000000"/>
-        </w:rPr>
-        <w:t>convention.nb_logements</w:t>
-      </w:r>
-      <w:proofErr w:type="spellEnd"/>
-      <w:r>
-        <w:rPr>
-          <w:color w:val="000000"/>
-        </w:rPr>
-        <w:t xml:space="preserve"> }}</w:t>
+        <w:t>Nombre total de logements : {{ convention.nb_logements }}</w:t>
       </w:r>
     </w:p>
     <w:p>
@@ -1651,25 +1625,7 @@
           <w:sz w:val="20"/>
           <w:lang w:val="en-US"/>
         </w:rPr>
-        <w:t xml:space="preserve">{% if </w:t>
-      </w:r>
-      <w:proofErr w:type="spellStart"/>
-      <w:r>
-        <w:rPr>
-          <w:rFonts w:cs="TimesNewRomanPSMT"/>
-          <w:sz w:val="20"/>
-          <w:lang w:val="en-US"/>
-        </w:rPr>
-        <w:t>convention.get_lot_with_financement</w:t>
-      </w:r>
-      <w:proofErr w:type="spellEnd"/>
-      <w:r>
-        <w:rPr>
-          <w:rFonts w:cs="TimesNewRomanPSMT"/>
-          <w:sz w:val="20"/>
-          <w:lang w:val="en-US"/>
-        </w:rPr>
-        <w:t>(‘PLAI’)%}</w:t>
+        <w:t>{% if convention.get_lot_with_financement(‘PLAI’)%}</w:t>
       </w:r>
       <w:r>
         <w:rPr>
@@ -1695,16 +1651,8 @@
         <w:rPr>
           <w:color w:val="000000"/>
         </w:rPr>
-        <w:t xml:space="preserve">Logements financés via un </w:t>
-      </w:r>
-      <w:proofErr w:type="spellStart"/>
-      <w:r>
-        <w:rPr>
-          <w:color w:val="000000"/>
-        </w:rPr>
-        <w:t>PLAi</w:t>
-      </w:r>
-      <w:proofErr w:type="spellEnd"/>
+        <w:t>Logements financés via un PLAi</w:t>
+      </w:r>
       <w:r>
         <w:rPr>
           <w:color w:val="000000"/>
@@ -1994,97 +1942,7 @@
                 <w:sz w:val="20"/>
                 <w:szCs w:val="20"/>
               </w:rPr>
-              <w:t xml:space="preserve">{% if </w:t>
-            </w:r>
-            <w:proofErr w:type="spellStart"/>
-            <w:r>
-              <w:rPr>
-                <w:color w:val="000000"/>
-                <w:sz w:val="20"/>
-                <w:szCs w:val="20"/>
-              </w:rPr>
-              <w:t>outre_mer</w:t>
-            </w:r>
-            <w:proofErr w:type="spellEnd"/>
-            <w:r>
-              <w:rPr>
-                <w:color w:val="000000"/>
-                <w:sz w:val="20"/>
-                <w:szCs w:val="20"/>
-              </w:rPr>
-              <w:t xml:space="preserve"> %}%}{{</w:t>
-            </w:r>
-            <w:proofErr w:type="spellStart"/>
-            <w:r>
-              <w:rPr>
-                <w:color w:val="000000"/>
-                <w:sz w:val="20"/>
-                <w:szCs w:val="20"/>
-              </w:rPr>
-              <w:t>l.typologie</w:t>
-            </w:r>
-            <w:proofErr w:type="spellEnd"/>
-            <w:r>
-              <w:rPr>
-                <w:color w:val="000000"/>
-                <w:sz w:val="20"/>
-                <w:szCs w:val="20"/>
-              </w:rPr>
-              <w:t xml:space="preserve">}}{% </w:t>
-            </w:r>
-            <w:proofErr w:type="spellStart"/>
-            <w:r>
-              <w:rPr>
-                <w:color w:val="000000"/>
-                <w:sz w:val="20"/>
-                <w:szCs w:val="20"/>
-              </w:rPr>
-              <w:t>else</w:t>
-            </w:r>
-            <w:proofErr w:type="spellEnd"/>
-            <w:r>
-              <w:rPr>
-                <w:color w:val="000000"/>
-                <w:sz w:val="20"/>
-                <w:szCs w:val="20"/>
-              </w:rPr>
-              <w:t xml:space="preserve"> %}{{</w:t>
-            </w:r>
-            <w:proofErr w:type="spellStart"/>
-            <w:r>
-              <w:rPr>
-                <w:color w:val="000000"/>
-                <w:sz w:val="20"/>
-                <w:szCs w:val="20"/>
-              </w:rPr>
-              <w:t>l.typologie|tl</w:t>
-            </w:r>
-            <w:proofErr w:type="spellEnd"/>
-            <w:r>
-              <w:rPr>
-                <w:color w:val="000000"/>
-                <w:sz w:val="20"/>
-                <w:szCs w:val="20"/>
-              </w:rPr>
-              <w:t xml:space="preserve">}}{% </w:t>
-            </w:r>
-            <w:proofErr w:type="spellStart"/>
-            <w:r>
-              <w:rPr>
-                <w:color w:val="000000"/>
-                <w:sz w:val="20"/>
-                <w:szCs w:val="20"/>
-              </w:rPr>
-              <w:t>endif</w:t>
-            </w:r>
-            <w:proofErr w:type="spellEnd"/>
-            <w:r>
-              <w:rPr>
-                <w:color w:val="000000"/>
-                <w:sz w:val="20"/>
-                <w:szCs w:val="20"/>
-              </w:rPr>
-              <w:t xml:space="preserve"> %}</w:t>
+              <w:t>{% if outre_mer %}%}{{l.typologie}}{% else %}{{l.typologie|tl}}{% endif %}</w:t>
             </w:r>
           </w:p>
         </w:tc>
@@ -2112,25 +1970,7 @@
                 <w:sz w:val="20"/>
                 <w:szCs w:val="20"/>
               </w:rPr>
-              <w:t>{{</w:t>
-            </w:r>
-            <w:proofErr w:type="spellStart"/>
-            <w:r>
-              <w:rPr>
-                <w:color w:val="000000"/>
-                <w:sz w:val="20"/>
-                <w:szCs w:val="20"/>
-              </w:rPr>
-              <w:t>l.surface_habitable|f</w:t>
-            </w:r>
-            <w:proofErr w:type="spellEnd"/>
-            <w:r>
-              <w:rPr>
-                <w:color w:val="000000"/>
-                <w:sz w:val="20"/>
-                <w:szCs w:val="20"/>
-              </w:rPr>
-              <w:t>}}</w:t>
+              <w:t>{{l.surface_habitable|f}}</w:t>
             </w:r>
           </w:p>
         </w:tc>
@@ -2158,25 +1998,7 @@
                 <w:sz w:val="20"/>
                 <w:szCs w:val="20"/>
               </w:rPr>
-              <w:t>{{</w:t>
-            </w:r>
-            <w:proofErr w:type="spellStart"/>
-            <w:r>
-              <w:rPr>
-                <w:color w:val="000000"/>
-                <w:sz w:val="20"/>
-                <w:szCs w:val="20"/>
-              </w:rPr>
-              <w:t>l.designation</w:t>
-            </w:r>
-            <w:proofErr w:type="spellEnd"/>
-            <w:r>
-              <w:rPr>
-                <w:color w:val="000000"/>
-                <w:sz w:val="20"/>
-                <w:szCs w:val="20"/>
-              </w:rPr>
-              <w:t>}}</w:t>
+              <w:t>{{l.designation}}</w:t>
             </w:r>
           </w:p>
         </w:tc>
@@ -2204,25 +2026,7 @@
                 <w:sz w:val="20"/>
                 <w:szCs w:val="20"/>
               </w:rPr>
-              <w:t>{{</w:t>
-            </w:r>
-            <w:proofErr w:type="spellStart"/>
-            <w:r>
-              <w:rPr>
-                <w:color w:val="000000"/>
-                <w:sz w:val="20"/>
-                <w:szCs w:val="20"/>
-              </w:rPr>
-              <w:t>l.loyer|f</w:t>
-            </w:r>
-            <w:proofErr w:type="spellEnd"/>
-            <w:r>
-              <w:rPr>
-                <w:color w:val="000000"/>
-                <w:sz w:val="20"/>
-                <w:szCs w:val="20"/>
-              </w:rPr>
-              <w:t>}}</w:t>
+              <w:t>{{l.loyer|f}}</w:t>
             </w:r>
           </w:p>
         </w:tc>
@@ -2257,25 +2061,7 @@
                 <w:sz w:val="16"/>
                 <w:szCs w:val="16"/>
               </w:rPr>
-              <w:t xml:space="preserve">{%tr </w:t>
-            </w:r>
-            <w:proofErr w:type="spellStart"/>
-            <w:r>
-              <w:rPr>
-                <w:color w:val="000000"/>
-                <w:sz w:val="16"/>
-                <w:szCs w:val="16"/>
-              </w:rPr>
-              <w:t>endfor</w:t>
-            </w:r>
-            <w:proofErr w:type="spellEnd"/>
-            <w:r>
-              <w:rPr>
-                <w:color w:val="000000"/>
-                <w:sz w:val="16"/>
-                <w:szCs w:val="16"/>
-              </w:rPr>
-              <w:t xml:space="preserve"> %}</w:t>
+              <w:t>{%tr endfor %}</w:t>
             </w:r>
           </w:p>
         </w:tc>
@@ -2306,21 +2092,7 @@
               <w:rPr>
                 <w:color w:val="000000"/>
               </w:rPr>
-              <w:t xml:space="preserve">(*) Normes des typologies définies par l'arrêté du {% if </w:t>
-            </w:r>
-            <w:proofErr w:type="spellStart"/>
-            <w:r>
-              <w:rPr>
-                <w:color w:val="000000"/>
-              </w:rPr>
-              <w:t>outre_mer</w:t>
-            </w:r>
-            <w:proofErr w:type="spellEnd"/>
-            <w:r>
-              <w:rPr>
-                <w:color w:val="000000"/>
-              </w:rPr>
-              <w:t xml:space="preserve"> %}3 avril 2023 relatif aux caractéristiques techniques, aux plafonds de ressources et aux plafonds de redevance des opérations de construction, d'acquisition-amélioration ou d'amélioration des logements-foyers en Guadeloupe,</w:t>
+              <w:t>(*) Normes des typologies définies par l'arrêté du {% if outre_mer %}3 avril 2023 relatif aux caractéristiques techniques, aux plafonds de ressources et aux plafonds de redevance des opérations de construction, d'acquisition-amélioration ou d'amélioration des logements-foyers en Guadeloupe,</w:t>
             </w:r>
             <w:r>
               <w:rPr>
@@ -2334,35 +2106,7 @@
               <w:rPr>
                 <w:color w:val="000000"/>
               </w:rPr>
-              <w:t xml:space="preserve">en Guyane, en Martinique, à La Réunion, à Mayotte{% </w:t>
-            </w:r>
-            <w:proofErr w:type="spellStart"/>
-            <w:r>
-              <w:rPr>
-                <w:color w:val="000000"/>
-              </w:rPr>
-              <w:t>else</w:t>
-            </w:r>
-            <w:proofErr w:type="spellEnd"/>
-            <w:r>
-              <w:rPr>
-                <w:color w:val="000000"/>
-              </w:rPr>
-              <w:t xml:space="preserve"> %}17 octobre 2011. A prendre en compte dans la liste déroulante{% </w:t>
-            </w:r>
-            <w:proofErr w:type="spellStart"/>
-            <w:r>
-              <w:rPr>
-                <w:color w:val="000000"/>
-              </w:rPr>
-              <w:t>endif</w:t>
-            </w:r>
-            <w:proofErr w:type="spellEnd"/>
-            <w:r>
-              <w:rPr>
-                <w:color w:val="000000"/>
-              </w:rPr>
-              <w:t xml:space="preserve"> %}</w:t>
+              <w:t>en Guyane, en Martinique, à La Réunion, à Mayotte{% else %}17 octobre 2011. A prendre en compte dans la liste déroulante{% endif %}</w:t>
             </w:r>
           </w:p>
         </w:tc>
@@ -2381,23 +2125,7 @@
           <w:rFonts w:cs="TimesNewRomanPSMT"/>
           <w:sz w:val="20"/>
         </w:rPr>
-        <w:t xml:space="preserve">{% </w:t>
-      </w:r>
-      <w:proofErr w:type="spellStart"/>
-      <w:r>
-        <w:rPr>
-          <w:rFonts w:cs="TimesNewRomanPSMT"/>
-          <w:sz w:val="20"/>
-        </w:rPr>
-        <w:t>endif</w:t>
-      </w:r>
-      <w:proofErr w:type="spellEnd"/>
-      <w:r>
-        <w:rPr>
-          <w:rFonts w:cs="TimesNewRomanPSMT"/>
-          <w:sz w:val="20"/>
-        </w:rPr>
-        <w:t xml:space="preserve"> %}</w:t>
+        <w:t>{% endif %}</w:t>
       </w:r>
     </w:p>
     <w:p>
@@ -2420,25 +2148,7 @@
           <w:sz w:val="20"/>
           <w:lang w:val="en-US"/>
         </w:rPr>
-        <w:t xml:space="preserve">{% if </w:t>
-      </w:r>
-      <w:proofErr w:type="spellStart"/>
-      <w:r>
-        <w:rPr>
-          <w:rFonts w:cs="TimesNewRomanPSMT"/>
-          <w:sz w:val="20"/>
-          <w:lang w:val="en-US"/>
-        </w:rPr>
-        <w:t>convention.get_lot_with_financement</w:t>
-      </w:r>
-      <w:proofErr w:type="spellEnd"/>
-      <w:r>
-        <w:rPr>
-          <w:rFonts w:cs="TimesNewRomanPSMT"/>
-          <w:sz w:val="20"/>
-          <w:lang w:val="en-US"/>
-        </w:rPr>
-        <w:t>(‘PLUS’)%}</w:t>
+        <w:t>{% if convention.get_lot_with_financement(‘PLUS’)%}</w:t>
       </w:r>
     </w:p>
     <w:p>
@@ -2754,97 +2464,7 @@
                 <w:sz w:val="20"/>
                 <w:szCs w:val="20"/>
               </w:rPr>
-              <w:t xml:space="preserve">{% if </w:t>
-            </w:r>
-            <w:proofErr w:type="spellStart"/>
-            <w:r>
-              <w:rPr>
-                <w:color w:val="000000"/>
-                <w:sz w:val="20"/>
-                <w:szCs w:val="20"/>
-              </w:rPr>
-              <w:t>outre_mer</w:t>
-            </w:r>
-            <w:proofErr w:type="spellEnd"/>
-            <w:r>
-              <w:rPr>
-                <w:color w:val="000000"/>
-                <w:sz w:val="20"/>
-                <w:szCs w:val="20"/>
-              </w:rPr>
-              <w:t xml:space="preserve"> %}%}{{</w:t>
-            </w:r>
-            <w:proofErr w:type="spellStart"/>
-            <w:r>
-              <w:rPr>
-                <w:color w:val="000000"/>
-                <w:sz w:val="20"/>
-                <w:szCs w:val="20"/>
-              </w:rPr>
-              <w:t>l.typologie</w:t>
-            </w:r>
-            <w:proofErr w:type="spellEnd"/>
-            <w:r>
-              <w:rPr>
-                <w:color w:val="000000"/>
-                <w:sz w:val="20"/>
-                <w:szCs w:val="20"/>
-              </w:rPr>
-              <w:t xml:space="preserve">}}{% </w:t>
-            </w:r>
-            <w:proofErr w:type="spellStart"/>
-            <w:r>
-              <w:rPr>
-                <w:color w:val="000000"/>
-                <w:sz w:val="20"/>
-                <w:szCs w:val="20"/>
-              </w:rPr>
-              <w:t>else</w:t>
-            </w:r>
-            <w:proofErr w:type="spellEnd"/>
-            <w:r>
-              <w:rPr>
-                <w:color w:val="000000"/>
-                <w:sz w:val="20"/>
-                <w:szCs w:val="20"/>
-              </w:rPr>
-              <w:t xml:space="preserve"> %}{{</w:t>
-            </w:r>
-            <w:proofErr w:type="spellStart"/>
-            <w:r>
-              <w:rPr>
-                <w:color w:val="000000"/>
-                <w:sz w:val="20"/>
-                <w:szCs w:val="20"/>
-              </w:rPr>
-              <w:t>l.typologie|tl</w:t>
-            </w:r>
-            <w:proofErr w:type="spellEnd"/>
-            <w:r>
-              <w:rPr>
-                <w:color w:val="000000"/>
-                <w:sz w:val="20"/>
-                <w:szCs w:val="20"/>
-              </w:rPr>
-              <w:t xml:space="preserve">}}{% </w:t>
-            </w:r>
-            <w:proofErr w:type="spellStart"/>
-            <w:r>
-              <w:rPr>
-                <w:color w:val="000000"/>
-                <w:sz w:val="20"/>
-                <w:szCs w:val="20"/>
-              </w:rPr>
-              <w:t>endif</w:t>
-            </w:r>
-            <w:proofErr w:type="spellEnd"/>
-            <w:r>
-              <w:rPr>
-                <w:color w:val="000000"/>
-                <w:sz w:val="20"/>
-                <w:szCs w:val="20"/>
-              </w:rPr>
-              <w:t xml:space="preserve"> %}</w:t>
+              <w:t>{% if outre_mer %}%}{{l.typologie}}{% else %}{{l.typologie|tl}}{% endif %}</w:t>
             </w:r>
           </w:p>
         </w:tc>
@@ -2872,25 +2492,7 @@
                 <w:sz w:val="20"/>
                 <w:szCs w:val="20"/>
               </w:rPr>
-              <w:t>{{</w:t>
-            </w:r>
-            <w:proofErr w:type="spellStart"/>
-            <w:r>
-              <w:rPr>
-                <w:color w:val="000000"/>
-                <w:sz w:val="20"/>
-                <w:szCs w:val="20"/>
-              </w:rPr>
-              <w:t>l.surface_habitable|f</w:t>
-            </w:r>
-            <w:proofErr w:type="spellEnd"/>
-            <w:r>
-              <w:rPr>
-                <w:color w:val="000000"/>
-                <w:sz w:val="20"/>
-                <w:szCs w:val="20"/>
-              </w:rPr>
-              <w:t>}}</w:t>
+              <w:t>{{l.surface_habitable|f}}</w:t>
             </w:r>
           </w:p>
         </w:tc>
@@ -2918,25 +2520,7 @@
                 <w:sz w:val="20"/>
                 <w:szCs w:val="20"/>
               </w:rPr>
-              <w:t>{{</w:t>
-            </w:r>
-            <w:proofErr w:type="spellStart"/>
-            <w:r>
-              <w:rPr>
-                <w:color w:val="000000"/>
-                <w:sz w:val="20"/>
-                <w:szCs w:val="20"/>
-              </w:rPr>
-              <w:t>l.designation</w:t>
-            </w:r>
-            <w:proofErr w:type="spellEnd"/>
-            <w:r>
-              <w:rPr>
-                <w:color w:val="000000"/>
-                <w:sz w:val="20"/>
-                <w:szCs w:val="20"/>
-              </w:rPr>
-              <w:t>}}</w:t>
+              <w:t>{{l.designation}}</w:t>
             </w:r>
           </w:p>
         </w:tc>
@@ -2964,25 +2548,7 @@
                 <w:sz w:val="20"/>
                 <w:szCs w:val="20"/>
               </w:rPr>
-              <w:t>{{</w:t>
-            </w:r>
-            <w:proofErr w:type="spellStart"/>
-            <w:r>
-              <w:rPr>
-                <w:color w:val="000000"/>
-                <w:sz w:val="20"/>
-                <w:szCs w:val="20"/>
-              </w:rPr>
-              <w:t>l.loyer|f</w:t>
-            </w:r>
-            <w:proofErr w:type="spellEnd"/>
-            <w:r>
-              <w:rPr>
-                <w:color w:val="000000"/>
-                <w:sz w:val="20"/>
-                <w:szCs w:val="20"/>
-              </w:rPr>
-              <w:t>}}</w:t>
+              <w:t>{{l.loyer|f}}</w:t>
             </w:r>
           </w:p>
         </w:tc>
@@ -3017,25 +2583,7 @@
                 <w:sz w:val="16"/>
                 <w:szCs w:val="16"/>
               </w:rPr>
-              <w:t xml:space="preserve">{%tr </w:t>
-            </w:r>
-            <w:proofErr w:type="spellStart"/>
-            <w:r>
-              <w:rPr>
-                <w:color w:val="000000"/>
-                <w:sz w:val="16"/>
-                <w:szCs w:val="16"/>
-              </w:rPr>
-              <w:t>endfor</w:t>
-            </w:r>
-            <w:proofErr w:type="spellEnd"/>
-            <w:r>
-              <w:rPr>
-                <w:color w:val="000000"/>
-                <w:sz w:val="16"/>
-                <w:szCs w:val="16"/>
-              </w:rPr>
-              <w:t xml:space="preserve"> %}</w:t>
+              <w:t>{%tr endfor %}</w:t>
             </w:r>
           </w:p>
         </w:tc>
@@ -3066,21 +2614,7 @@
               <w:rPr>
                 <w:color w:val="000000"/>
               </w:rPr>
-              <w:t xml:space="preserve">(*) Normes des typologies définies par l'arrêté du {% if </w:t>
-            </w:r>
-            <w:proofErr w:type="spellStart"/>
-            <w:r>
-              <w:rPr>
-                <w:color w:val="000000"/>
-              </w:rPr>
-              <w:t>outre_mer</w:t>
-            </w:r>
-            <w:proofErr w:type="spellEnd"/>
-            <w:r>
-              <w:rPr>
-                <w:color w:val="000000"/>
-              </w:rPr>
-              <w:t xml:space="preserve"> %}3 avril 2023 relatif aux caractéristiques techniques, aux plafonds de ressources et aux plafonds de redevance des opérations de construction, d'acquisition-amélioration ou d'amélioration des logements-foyers en Guadeloupe,</w:t>
+              <w:t>(*) Normes des typologies définies par l'arrêté du {% if outre_mer %}3 avril 2023 relatif aux caractéristiques techniques, aux plafonds de ressources et aux plafonds de redevance des opérations de construction, d'acquisition-amélioration ou d'amélioration des logements-foyers en Guadeloupe,</w:t>
             </w:r>
             <w:r>
               <w:rPr>
@@ -3094,35 +2628,7 @@
               <w:rPr>
                 <w:color w:val="000000"/>
               </w:rPr>
-              <w:t xml:space="preserve">en Guyane, en Martinique, à La Réunion, à Mayotte{% </w:t>
-            </w:r>
-            <w:proofErr w:type="spellStart"/>
-            <w:r>
-              <w:rPr>
-                <w:color w:val="000000"/>
-              </w:rPr>
-              <w:t>else</w:t>
-            </w:r>
-            <w:proofErr w:type="spellEnd"/>
-            <w:r>
-              <w:rPr>
-                <w:color w:val="000000"/>
-              </w:rPr>
-              <w:t xml:space="preserve"> %}17 octobre 2011. A prendre en compte dans la liste déroulante{% </w:t>
-            </w:r>
-            <w:proofErr w:type="spellStart"/>
-            <w:r>
-              <w:rPr>
-                <w:color w:val="000000"/>
-              </w:rPr>
-              <w:t>endif</w:t>
-            </w:r>
-            <w:proofErr w:type="spellEnd"/>
-            <w:r>
-              <w:rPr>
-                <w:color w:val="000000"/>
-              </w:rPr>
-              <w:t xml:space="preserve"> %}</w:t>
+              <w:t>en Guyane, en Martinique, à La Réunion, à Mayotte{% else %}17 octobre 2011. A prendre en compte dans la liste déroulante{% endif %}</w:t>
             </w:r>
           </w:p>
         </w:tc>
@@ -3141,23 +2647,7 @@
           <w:rFonts w:cs="TimesNewRomanPSMT"/>
           <w:sz w:val="20"/>
         </w:rPr>
-        <w:t xml:space="preserve">{% </w:t>
-      </w:r>
-      <w:proofErr w:type="spellStart"/>
-      <w:r>
-        <w:rPr>
-          <w:rFonts w:cs="TimesNewRomanPSMT"/>
-          <w:sz w:val="20"/>
-        </w:rPr>
-        <w:t>endif</w:t>
-      </w:r>
-      <w:proofErr w:type="spellEnd"/>
-      <w:r>
-        <w:rPr>
-          <w:rFonts w:cs="TimesNewRomanPSMT"/>
-          <w:sz w:val="20"/>
-        </w:rPr>
-        <w:t xml:space="preserve"> %}</w:t>
+        <w:t>{% endif %}</w:t>
       </w:r>
     </w:p>
     <w:p>
@@ -3187,25 +2677,7 @@
           <w:sz w:val="20"/>
           <w:lang w:val="en-US"/>
         </w:rPr>
-        <w:t xml:space="preserve">{% if </w:t>
-      </w:r>
-      <w:proofErr w:type="spellStart"/>
-      <w:r>
-        <w:rPr>
-          <w:rFonts w:cs="TimesNewRomanPSMT"/>
-          <w:sz w:val="20"/>
-          <w:lang w:val="en-US"/>
-        </w:rPr>
-        <w:t>convention.get_lot_with_financement</w:t>
-      </w:r>
-      <w:proofErr w:type="spellEnd"/>
-      <w:r>
-        <w:rPr>
-          <w:rFonts w:cs="TimesNewRomanPSMT"/>
-          <w:sz w:val="20"/>
-          <w:lang w:val="en-US"/>
-        </w:rPr>
-        <w:t>(‘PLS’)%}</w:t>
+        <w:t>{% if convention.get_lot_with_financement(‘PLS’)%}</w:t>
       </w:r>
     </w:p>
     <w:p>
@@ -3465,43 +2937,7 @@
                 <w:szCs w:val="16"/>
                 <w:lang w:val="en-US"/>
               </w:rPr>
-              <w:t xml:space="preserve">{%tr for l in </w:t>
-            </w:r>
-            <w:proofErr w:type="spellStart"/>
-            <w:r>
-              <w:rPr>
-                <w:sz w:val="16"/>
-                <w:szCs w:val="16"/>
-                <w:lang w:val="en-US"/>
-              </w:rPr>
-              <w:t>convention.get_lot_with_financement</w:t>
-            </w:r>
-            <w:proofErr w:type="spellEnd"/>
-            <w:r>
-              <w:rPr>
-                <w:sz w:val="16"/>
-                <w:szCs w:val="16"/>
-                <w:lang w:val="en-US"/>
-              </w:rPr>
-              <w:t>(‘PLS’) .</w:t>
-            </w:r>
-            <w:proofErr w:type="spellStart"/>
-            <w:r>
-              <w:rPr>
-                <w:sz w:val="16"/>
-                <w:szCs w:val="16"/>
-                <w:lang w:val="en-US"/>
-              </w:rPr>
-              <w:t>logements_import_ordered</w:t>
-            </w:r>
-            <w:proofErr w:type="spellEnd"/>
-            <w:r>
-              <w:rPr>
-                <w:sz w:val="16"/>
-                <w:szCs w:val="16"/>
-                <w:lang w:val="en-US"/>
-              </w:rPr>
-              <w:t xml:space="preserve"> %}</w:t>
+              <w:t>{%tr for l in convention.get_lot_with_financement(‘PLS’) .logements_import_ordered %}</w:t>
             </w:r>
           </w:p>
         </w:tc>
@@ -3537,67 +2973,7 @@
                 <w:szCs w:val="20"/>
                 <w:lang w:val="en-US"/>
               </w:rPr>
-              <w:t xml:space="preserve">{% if </w:t>
-            </w:r>
-            <w:proofErr w:type="spellStart"/>
-            <w:r>
-              <w:rPr>
-                <w:color w:val="000000"/>
-                <w:sz w:val="20"/>
-                <w:szCs w:val="20"/>
-                <w:lang w:val="en-US"/>
-              </w:rPr>
-              <w:t>outre_mer</w:t>
-            </w:r>
-            <w:proofErr w:type="spellEnd"/>
-            <w:r>
-              <w:rPr>
-                <w:color w:val="000000"/>
-                <w:sz w:val="20"/>
-                <w:szCs w:val="20"/>
-                <w:lang w:val="en-US"/>
-              </w:rPr>
-              <w:t xml:space="preserve"> %}%}{{</w:t>
-            </w:r>
-            <w:proofErr w:type="spellStart"/>
-            <w:r>
-              <w:rPr>
-                <w:color w:val="000000"/>
-                <w:sz w:val="20"/>
-                <w:szCs w:val="20"/>
-                <w:lang w:val="en-US"/>
-              </w:rPr>
-              <w:t>l.typologie</w:t>
-            </w:r>
-            <w:proofErr w:type="spellEnd"/>
-            <w:r>
-              <w:rPr>
-                <w:color w:val="000000"/>
-                <w:sz w:val="20"/>
-                <w:szCs w:val="20"/>
-                <w:lang w:val="en-US"/>
-              </w:rPr>
-              <w:t>}}{% else %}{{</w:t>
-            </w:r>
-            <w:proofErr w:type="spellStart"/>
-            <w:r>
-              <w:rPr>
-                <w:color w:val="000000"/>
-                <w:sz w:val="20"/>
-                <w:szCs w:val="20"/>
-                <w:lang w:val="en-US"/>
-              </w:rPr>
-              <w:t>l.typologie|tl</w:t>
-            </w:r>
-            <w:proofErr w:type="spellEnd"/>
-            <w:r>
-              <w:rPr>
-                <w:color w:val="000000"/>
-                <w:sz w:val="20"/>
-                <w:szCs w:val="20"/>
-                <w:lang w:val="en-US"/>
-              </w:rPr>
-              <w:t>}}{% endif %}</w:t>
+              <w:t>{% if outre_mer %}%}{{l.typologie}}{% else %}{{l.typologie|tl}}{% endif %}</w:t>
             </w:r>
           </w:p>
         </w:tc>
@@ -3625,25 +3001,7 @@
                 <w:sz w:val="20"/>
                 <w:szCs w:val="20"/>
               </w:rPr>
-              <w:t>{{</w:t>
-            </w:r>
-            <w:proofErr w:type="spellStart"/>
-            <w:r>
-              <w:rPr>
-                <w:color w:val="000000"/>
-                <w:sz w:val="20"/>
-                <w:szCs w:val="20"/>
-              </w:rPr>
-              <w:t>l.surface_habitable|f</w:t>
-            </w:r>
-            <w:proofErr w:type="spellEnd"/>
-            <w:r>
-              <w:rPr>
-                <w:color w:val="000000"/>
-                <w:sz w:val="20"/>
-                <w:szCs w:val="20"/>
-              </w:rPr>
-              <w:t>}}</w:t>
+              <w:t>{{l.surface_habitable|f}}</w:t>
             </w:r>
           </w:p>
         </w:tc>
@@ -3671,25 +3029,7 @@
                 <w:sz w:val="20"/>
                 <w:szCs w:val="20"/>
               </w:rPr>
-              <w:t>{{</w:t>
-            </w:r>
-            <w:proofErr w:type="spellStart"/>
-            <w:r>
-              <w:rPr>
-                <w:color w:val="000000"/>
-                <w:sz w:val="20"/>
-                <w:szCs w:val="20"/>
-              </w:rPr>
-              <w:t>l.designation</w:t>
-            </w:r>
-            <w:proofErr w:type="spellEnd"/>
-            <w:r>
-              <w:rPr>
-                <w:color w:val="000000"/>
-                <w:sz w:val="20"/>
-                <w:szCs w:val="20"/>
-              </w:rPr>
-              <w:t>}}</w:t>
+              <w:t>{{l.designation}}</w:t>
             </w:r>
           </w:p>
         </w:tc>
@@ -3717,25 +3057,7 @@
                 <w:sz w:val="20"/>
                 <w:szCs w:val="20"/>
               </w:rPr>
-              <w:t>{{</w:t>
-            </w:r>
-            <w:proofErr w:type="spellStart"/>
-            <w:r>
-              <w:rPr>
-                <w:color w:val="000000"/>
-                <w:sz w:val="20"/>
-                <w:szCs w:val="20"/>
-              </w:rPr>
-              <w:t>l.loyer|f</w:t>
-            </w:r>
-            <w:proofErr w:type="spellEnd"/>
-            <w:r>
-              <w:rPr>
-                <w:color w:val="000000"/>
-                <w:sz w:val="20"/>
-                <w:szCs w:val="20"/>
-              </w:rPr>
-              <w:t>}}</w:t>
+              <w:t>{{l.loyer|f}}</w:t>
             </w:r>
           </w:p>
         </w:tc>
@@ -3770,25 +3092,7 @@
                 <w:sz w:val="16"/>
                 <w:szCs w:val="16"/>
               </w:rPr>
-              <w:t xml:space="preserve">{%tr </w:t>
-            </w:r>
-            <w:proofErr w:type="spellStart"/>
-            <w:r>
-              <w:rPr>
-                <w:color w:val="000000"/>
-                <w:sz w:val="16"/>
-                <w:szCs w:val="16"/>
-              </w:rPr>
-              <w:t>endfor</w:t>
-            </w:r>
-            <w:proofErr w:type="spellEnd"/>
-            <w:r>
-              <w:rPr>
-                <w:color w:val="000000"/>
-                <w:sz w:val="16"/>
-                <w:szCs w:val="16"/>
-              </w:rPr>
-              <w:t xml:space="preserve"> %}</w:t>
+              <w:t>{%tr endfor %}</w:t>
             </w:r>
           </w:p>
         </w:tc>
@@ -3819,21 +3123,7 @@
               <w:rPr>
                 <w:color w:val="000000"/>
               </w:rPr>
-              <w:t xml:space="preserve">(*) Normes des typologies définies par l'arrêté du {% if </w:t>
-            </w:r>
-            <w:proofErr w:type="spellStart"/>
-            <w:r>
-              <w:rPr>
-                <w:color w:val="000000"/>
-              </w:rPr>
-              <w:t>outre_mer</w:t>
-            </w:r>
-            <w:proofErr w:type="spellEnd"/>
-            <w:r>
-              <w:rPr>
-                <w:color w:val="000000"/>
-              </w:rPr>
-              <w:t xml:space="preserve"> %}3 avril 2023 relatif aux caractéristiques techniques, aux plafonds de ressources et aux plafonds de redevance des opérations de construction, d'acquisition-amélioration ou d'amélioration des logements-foyers en Guadeloupe,</w:t>
+              <w:t>(*) Normes des typologies définies par l'arrêté du {% if outre_mer %}3 avril 2023 relatif aux caractéristiques techniques, aux plafonds de ressources et aux plafonds de redevance des opérations de construction, d'acquisition-amélioration ou d'amélioration des logements-foyers en Guadeloupe,</w:t>
             </w:r>
             <w:r>
               <w:rPr>
@@ -3847,35 +3137,7 @@
               <w:rPr>
                 <w:color w:val="000000"/>
               </w:rPr>
-              <w:t xml:space="preserve">en Guyane, en Martinique, à La Réunion, à Mayotte{% </w:t>
-            </w:r>
-            <w:proofErr w:type="spellStart"/>
-            <w:r>
-              <w:rPr>
-                <w:color w:val="000000"/>
-              </w:rPr>
-              <w:t>else</w:t>
-            </w:r>
-            <w:proofErr w:type="spellEnd"/>
-            <w:r>
-              <w:rPr>
-                <w:color w:val="000000"/>
-              </w:rPr>
-              <w:t xml:space="preserve"> %}17 octobre 2011. A prendre en compte dans la liste déroulante{% </w:t>
-            </w:r>
-            <w:proofErr w:type="spellStart"/>
-            <w:r>
-              <w:rPr>
-                <w:color w:val="000000"/>
-              </w:rPr>
-              <w:t>endif</w:t>
-            </w:r>
-            <w:proofErr w:type="spellEnd"/>
-            <w:r>
-              <w:rPr>
-                <w:color w:val="000000"/>
-              </w:rPr>
-              <w:t xml:space="preserve"> %}</w:t>
+              <w:t>en Guyane, en Martinique, à La Réunion, à Mayotte{% else %}17 octobre 2011. A prendre en compte dans la liste déroulante{% endif %}</w:t>
             </w:r>
           </w:p>
         </w:tc>
@@ -3894,23 +3156,7 @@
           <w:rFonts w:cs="TimesNewRomanPSMT"/>
           <w:sz w:val="20"/>
         </w:rPr>
-        <w:t xml:space="preserve">{% </w:t>
-      </w:r>
-      <w:proofErr w:type="spellStart"/>
-      <w:r>
-        <w:rPr>
-          <w:rFonts w:cs="TimesNewRomanPSMT"/>
-          <w:sz w:val="20"/>
-        </w:rPr>
-        <w:t>endif</w:t>
-      </w:r>
-      <w:proofErr w:type="spellEnd"/>
-      <w:r>
-        <w:rPr>
-          <w:rFonts w:cs="TimesNewRomanPSMT"/>
-          <w:sz w:val="20"/>
-        </w:rPr>
-        <w:t xml:space="preserve"> %}</w:t>
+        <w:t>{% endif %}</w:t>
       </w:r>
     </w:p>
     <w:p>
@@ -3937,21 +3183,7 @@
         <w:rPr>
           <w:color w:val="000000"/>
         </w:rPr>
-        <w:t xml:space="preserve">* Surface totale des locaux à usage collectif : {{ </w:t>
-      </w:r>
-      <w:proofErr w:type="spellStart"/>
-      <w:r>
-        <w:rPr>
-          <w:color w:val="000000"/>
-        </w:rPr>
-        <w:t>lc_sh_totale|f</w:t>
-      </w:r>
-      <w:proofErr w:type="spellEnd"/>
-      <w:r>
-        <w:rPr>
-          <w:color w:val="000000"/>
-        </w:rPr>
-        <w:t xml:space="preserve"> }} mètres carrés de surface habitable : </w:t>
+        <w:t xml:space="preserve">* Surface totale des locaux à usage collectif : {{ lc_sh_totale|f }} mètres carrés de surface habitable : </w:t>
       </w:r>
     </w:p>
     <w:p>
@@ -4102,39 +3334,7 @@
                 <w:szCs w:val="16"/>
               </w:rPr>
               <w:lastRenderedPageBreak/>
-              <w:t xml:space="preserve">{%tr for </w:t>
-            </w:r>
-            <w:proofErr w:type="spellStart"/>
-            <w:r>
-              <w:rPr>
-                <w:sz w:val="16"/>
-                <w:szCs w:val="16"/>
-              </w:rPr>
-              <w:t>lc</w:t>
-            </w:r>
-            <w:proofErr w:type="spellEnd"/>
-            <w:r>
-              <w:rPr>
-                <w:sz w:val="16"/>
-                <w:szCs w:val="16"/>
-              </w:rPr>
-              <w:t xml:space="preserve"> in </w:t>
-            </w:r>
-            <w:proofErr w:type="spellStart"/>
-            <w:r>
-              <w:rPr>
-                <w:sz w:val="16"/>
-                <w:szCs w:val="16"/>
-              </w:rPr>
-              <w:t>locaux_collectifs</w:t>
-            </w:r>
-            <w:proofErr w:type="spellEnd"/>
-            <w:r>
-              <w:rPr>
-                <w:sz w:val="16"/>
-                <w:szCs w:val="16"/>
-              </w:rPr>
-              <w:t xml:space="preserve"> %}</w:t>
+              <w:t>{%tr for lc in locaux_collectifs %}</w:t>
             </w:r>
           </w:p>
         </w:tc>
@@ -4169,25 +3369,7 @@
                 <w:sz w:val="20"/>
                 <w:szCs w:val="20"/>
               </w:rPr>
-              <w:t xml:space="preserve">{{ </w:t>
-            </w:r>
-            <w:proofErr w:type="spellStart"/>
-            <w:r>
-              <w:rPr>
-                <w:color w:val="000000"/>
-                <w:sz w:val="20"/>
-                <w:szCs w:val="20"/>
-              </w:rPr>
-              <w:t>lc.type_local</w:t>
-            </w:r>
-            <w:proofErr w:type="spellEnd"/>
-            <w:r>
-              <w:rPr>
-                <w:color w:val="000000"/>
-                <w:sz w:val="20"/>
-                <w:szCs w:val="20"/>
-              </w:rPr>
-              <w:t xml:space="preserve"> }}</w:t>
+              <w:t>{{ lc.type_local }}</w:t>
             </w:r>
           </w:p>
         </w:tc>
@@ -4216,25 +3398,7 @@
                 <w:sz w:val="20"/>
                 <w:szCs w:val="20"/>
               </w:rPr>
-              <w:t xml:space="preserve">{{ </w:t>
-            </w:r>
-            <w:proofErr w:type="spellStart"/>
-            <w:r>
-              <w:rPr>
-                <w:color w:val="000000"/>
-                <w:sz w:val="20"/>
-                <w:szCs w:val="20"/>
-              </w:rPr>
-              <w:t>lc.surface_habitable</w:t>
-            </w:r>
-            <w:proofErr w:type="spellEnd"/>
-            <w:r>
-              <w:rPr>
-                <w:color w:val="000000"/>
-                <w:sz w:val="20"/>
-                <w:szCs w:val="20"/>
-              </w:rPr>
-              <w:t xml:space="preserve"> }}</w:t>
+              <w:t>{{ lc.surface_habitable }}</w:t>
             </w:r>
           </w:p>
         </w:tc>
@@ -4263,25 +3427,7 @@
                 <w:sz w:val="20"/>
                 <w:szCs w:val="20"/>
               </w:rPr>
-              <w:t xml:space="preserve">{{ </w:t>
-            </w:r>
-            <w:proofErr w:type="spellStart"/>
-            <w:r>
-              <w:rPr>
-                <w:color w:val="000000"/>
-                <w:sz w:val="20"/>
-                <w:szCs w:val="20"/>
-              </w:rPr>
-              <w:t>lc.nombre</w:t>
-            </w:r>
-            <w:proofErr w:type="spellEnd"/>
-            <w:r>
-              <w:rPr>
-                <w:color w:val="000000"/>
-                <w:sz w:val="20"/>
-                <w:szCs w:val="20"/>
-              </w:rPr>
-              <w:t xml:space="preserve"> }}</w:t>
+              <w:t>{{ lc.nombre }}</w:t>
             </w:r>
           </w:p>
         </w:tc>
@@ -4315,25 +3461,7 @@
                 <w:sz w:val="16"/>
                 <w:szCs w:val="16"/>
               </w:rPr>
-              <w:t xml:space="preserve">{%tr </w:t>
-            </w:r>
-            <w:proofErr w:type="spellStart"/>
-            <w:r>
-              <w:rPr>
-                <w:color w:val="000000"/>
-                <w:sz w:val="16"/>
-                <w:szCs w:val="16"/>
-              </w:rPr>
-              <w:t>endfor</w:t>
-            </w:r>
-            <w:proofErr w:type="spellEnd"/>
-            <w:r>
-              <w:rPr>
-                <w:color w:val="000000"/>
-                <w:sz w:val="16"/>
-                <w:szCs w:val="16"/>
-              </w:rPr>
-              <w:t xml:space="preserve"> %}</w:t>
+              <w:t>{%tr endfor %}</w:t>
             </w:r>
           </w:p>
         </w:tc>
@@ -4374,21 +3502,7 @@
         <w:rPr>
           <w:color w:val="000000"/>
         </w:rPr>
-        <w:t xml:space="preserve">{% if </w:t>
-      </w:r>
-      <w:proofErr w:type="spellStart"/>
-      <w:r>
-        <w:rPr>
-          <w:color w:val="000000"/>
-        </w:rPr>
-        <w:t>lot.foyer_residence_dependance</w:t>
-      </w:r>
-      <w:proofErr w:type="spellEnd"/>
-      <w:r>
-        <w:rPr>
-          <w:color w:val="000000"/>
-        </w:rPr>
-        <w:t xml:space="preserve"> %}</w:t>
+        <w:t>{% if lot.foyer_residence_dependance %}</w:t>
       </w:r>
     </w:p>
     <w:p>
@@ -4409,21 +3523,7 @@
         <w:rPr>
           <w:color w:val="000000"/>
         </w:rPr>
-        <w:t xml:space="preserve">{{ </w:t>
-      </w:r>
-      <w:proofErr w:type="spellStart"/>
-      <w:r>
-        <w:rPr>
-          <w:color w:val="000000"/>
-        </w:rPr>
-        <w:t>lot.foyer_residence_dependance</w:t>
-      </w:r>
-      <w:proofErr w:type="spellEnd"/>
-      <w:r>
-        <w:rPr>
-          <w:color w:val="000000"/>
-        </w:rPr>
-        <w:t xml:space="preserve"> }}</w:t>
+        <w:t>{{ lot.foyer_residence_dependance }}</w:t>
       </w:r>
     </w:p>
     <w:p>
@@ -4436,41 +3536,13 @@
         <w:rPr>
           <w:color w:val="000000"/>
         </w:rPr>
-        <w:t xml:space="preserve">{%- </w:t>
-      </w:r>
-      <w:proofErr w:type="spellStart"/>
-      <w:r>
-        <w:rPr>
-          <w:color w:val="000000"/>
-        </w:rPr>
-        <w:t>endif</w:t>
-      </w:r>
-      <w:proofErr w:type="spellEnd"/>
-      <w:r>
-        <w:rPr>
-          <w:color w:val="000000"/>
-        </w:rPr>
-        <w:t xml:space="preserve"> %}</w:t>
+        <w:t>{%- endif %}</w:t>
       </w:r>
       <w:r>
         <w:rPr>
           <w:rFonts w:cs="TimesNewRomanPSMT"/>
         </w:rPr>
-        <w:t xml:space="preserve">{% </w:t>
-      </w:r>
-      <w:proofErr w:type="spellStart"/>
-      <w:r>
-        <w:rPr>
-          <w:rFonts w:cs="TimesNewRomanPSMT"/>
-        </w:rPr>
-        <w:t>endfor</w:t>
-      </w:r>
-      <w:proofErr w:type="spellEnd"/>
-      <w:r>
-        <w:rPr>
-          <w:rFonts w:cs="TimesNewRomanPSMT"/>
-        </w:rPr>
-        <w:t xml:space="preserve"> %}</w:t>
+        <w:t>{% endfor %}</w:t>
       </w:r>
     </w:p>
     <w:p>
@@ -4492,14 +3564,12 @@
         </w:rPr>
         <w:t>Garages et/ ou parking (nombre) : {{</w:t>
       </w:r>
-      <w:proofErr w:type="spellStart"/>
       <w:r>
         <w:rPr>
           <w:color w:val="000000"/>
         </w:rPr>
         <w:t>nombre_garage</w:t>
       </w:r>
-      <w:proofErr w:type="spellEnd"/>
       <w:r>
         <w:rPr>
           <w:color w:val="000000"/>
@@ -4546,21 +3616,12 @@
         </w:rPr>
         <w:t xml:space="preserve">{% for line in </w:t>
       </w:r>
-      <w:proofErr w:type="spellStart"/>
       <w:r>
         <w:rPr>
           <w:color w:val="000000"/>
           <w:lang w:val="en-US"/>
         </w:rPr>
-        <w:t>lot.foyer_residence_locaux_hors_convention|get_text_as_list</w:t>
-      </w:r>
-      <w:proofErr w:type="spellEnd"/>
-      <w:r>
-        <w:rPr>
-          <w:color w:val="000000"/>
-          <w:lang w:val="en-US"/>
-        </w:rPr>
-        <w:t xml:space="preserve"> </w:t>
+        <w:t xml:space="preserve">lot.foyer_residence_locaux_hors_convention|get_text_as_list </w:t>
       </w:r>
       <w:r>
         <w:rPr>
@@ -4599,35 +3660,7 @@
         <w:rPr>
           <w:color w:val="000000"/>
         </w:rPr>
-        <w:t xml:space="preserve">{%- </w:t>
-      </w:r>
-      <w:proofErr w:type="spellStart"/>
-      <w:r>
-        <w:rPr>
-          <w:color w:val="000000"/>
-        </w:rPr>
-        <w:t>endfor</w:t>
-      </w:r>
-      <w:proofErr w:type="spellEnd"/>
-      <w:r>
-        <w:rPr>
-          <w:color w:val="000000"/>
-        </w:rPr>
-        <w:t xml:space="preserve"> %}{%- </w:t>
-      </w:r>
-      <w:proofErr w:type="spellStart"/>
-      <w:r>
-        <w:rPr>
-          <w:color w:val="000000"/>
-        </w:rPr>
-        <w:t>endfor</w:t>
-      </w:r>
-      <w:proofErr w:type="spellEnd"/>
-      <w:r>
-        <w:rPr>
-          <w:color w:val="000000"/>
-        </w:rPr>
-        <w:t xml:space="preserve"> %}</w:t>
+        <w:t>{%- endfor %}{%- endfor %}</w:t>
       </w:r>
     </w:p>
     <w:p>
@@ -5231,37 +4264,7 @@
                                 <w14:round/>
                               </w14:textOutline>
                             </w:rPr>
-                            <w:t xml:space="preserve">{{ </w:t>
-                          </w:r>
-                          <w:proofErr w:type="spellStart"/>
-                          <w:r>
-                            <w:rPr>
-                              <w:color w:val="7F7F7F"/>
-                              <w:sz w:val="2"/>
-                              <w:szCs w:val="20"/>
-                              <w:lang w:val="en-US"/>
-                              <w14:textOutline w14:w="0" w14:cap="flat" w14:cmpd="sng" w14:algn="ctr">
-                                <w14:noFill/>
-                                <w14:prstDash w14:val="solid"/>
-                                <w14:round/>
-                              </w14:textOutline>
-                            </w:rPr>
-                            <w:t>convention.display_not_validated_status</w:t>
-                          </w:r>
-                          <w:proofErr w:type="spellEnd"/>
-                          <w:r>
-                            <w:rPr>
-                              <w:color w:val="7F7F7F"/>
-                              <w:sz w:val="2"/>
-                              <w:szCs w:val="20"/>
-                              <w:lang w:val="en-US"/>
-                              <w14:textOutline w14:w="0" w14:cap="flat" w14:cmpd="sng" w14:algn="ctr">
-                                <w14:noFill/>
-                                <w14:prstDash w14:val="solid"/>
-                                <w14:round/>
-                              </w14:textOutline>
-                            </w:rPr>
-                            <w:t>() }}</w:t>
+                            <w:t>{{ convention.display_not_validated_status() }}</w:t>
                           </w:r>
                         </w:p>
                       </w:txbxContent>
@@ -5308,37 +4311,7 @@
                           <w14:round/>
                         </w14:textOutline>
                       </w:rPr>
-                      <w:t xml:space="preserve">{{ </w:t>
-                    </w:r>
-                    <w:proofErr w:type="spellStart"/>
-                    <w:r>
-                      <w:rPr>
-                        <w:color w:val="7F7F7F"/>
-                        <w:sz w:val="2"/>
-                        <w:szCs w:val="20"/>
-                        <w:lang w:val="en-US"/>
-                        <w14:textOutline w14:w="0" w14:cap="flat" w14:cmpd="sng" w14:algn="ctr">
-                          <w14:noFill/>
-                          <w14:prstDash w14:val="solid"/>
-                          <w14:round/>
-                        </w14:textOutline>
-                      </w:rPr>
-                      <w:t>convention.display_not_validated_status</w:t>
-                    </w:r>
-                    <w:proofErr w:type="spellEnd"/>
-                    <w:r>
-                      <w:rPr>
-                        <w:color w:val="7F7F7F"/>
-                        <w:sz w:val="2"/>
-                        <w:szCs w:val="20"/>
-                        <w:lang w:val="en-US"/>
-                        <w14:textOutline w14:w="0" w14:cap="flat" w14:cmpd="sng" w14:algn="ctr">
-                          <w14:noFill/>
-                          <w14:prstDash w14:val="solid"/>
-                          <w14:round/>
-                        </w14:textOutline>
-                      </w:rPr>
-                      <w:t>() }}</w:t>
+                      <w:t>{{ convention.display_not_validated_status() }}</w:t>
                     </w:r>
                   </w:p>
                 </w:txbxContent>
@@ -6413,37 +5386,7 @@
                                 <w14:round/>
                               </w14:textOutline>
                             </w:rPr>
-                            <w:t xml:space="preserve">{{ </w:t>
-                          </w:r>
-                          <w:proofErr w:type="spellStart"/>
-                          <w:r>
-                            <w:rPr>
-                              <w:color w:val="7F7F7F"/>
-                              <w:sz w:val="2"/>
-                              <w:szCs w:val="20"/>
-                              <w:lang w:val="en-US"/>
-                              <w14:textOutline w14:w="0" w14:cap="flat" w14:cmpd="sng" w14:algn="ctr">
-                                <w14:noFill/>
-                                <w14:prstDash w14:val="solid"/>
-                                <w14:round/>
-                              </w14:textOutline>
-                            </w:rPr>
-                            <w:t>convention.display_not_validated_status</w:t>
-                          </w:r>
-                          <w:proofErr w:type="spellEnd"/>
-                          <w:r>
-                            <w:rPr>
-                              <w:color w:val="7F7F7F"/>
-                              <w:sz w:val="2"/>
-                              <w:szCs w:val="20"/>
-                              <w:lang w:val="en-US"/>
-                              <w14:textOutline w14:w="0" w14:cap="flat" w14:cmpd="sng" w14:algn="ctr">
-                                <w14:noFill/>
-                                <w14:prstDash w14:val="solid"/>
-                                <w14:round/>
-                              </w14:textOutline>
-                            </w:rPr>
-                            <w:t>() }}</w:t>
+                            <w:t>{{ convention.display_not_validated_status() }}</w:t>
                           </w:r>
                         </w:p>
                       </w:txbxContent>
@@ -6490,37 +5433,7 @@
                           <w14:round/>
                         </w14:textOutline>
                       </w:rPr>
-                      <w:t xml:space="preserve">{{ </w:t>
-                    </w:r>
-                    <w:proofErr w:type="spellStart"/>
-                    <w:r>
-                      <w:rPr>
-                        <w:color w:val="7F7F7F"/>
-                        <w:sz w:val="2"/>
-                        <w:szCs w:val="20"/>
-                        <w:lang w:val="en-US"/>
-                        <w14:textOutline w14:w="0" w14:cap="flat" w14:cmpd="sng" w14:algn="ctr">
-                          <w14:noFill/>
-                          <w14:prstDash w14:val="solid"/>
-                          <w14:round/>
-                        </w14:textOutline>
-                      </w:rPr>
-                      <w:t>convention.display_not_validated_status</w:t>
-                    </w:r>
-                    <w:proofErr w:type="spellEnd"/>
-                    <w:r>
-                      <w:rPr>
-                        <w:color w:val="7F7F7F"/>
-                        <w:sz w:val="2"/>
-                        <w:szCs w:val="20"/>
-                        <w:lang w:val="en-US"/>
-                        <w14:textOutline w14:w="0" w14:cap="flat" w14:cmpd="sng" w14:algn="ctr">
-                          <w14:noFill/>
-                          <w14:prstDash w14:val="solid"/>
-                          <w14:round/>
-                        </w14:textOutline>
-                      </w:rPr>
-                      <w:t>() }}</w:t>
+                      <w:t>{{ convention.display_not_validated_status() }}</w:t>
                     </w:r>
                   </w:p>
                 </w:txbxContent>
@@ -7981,6 +6894,7 @@
   <w:style w:type="character" w:default="1" w:styleId="Policepardfaut">
     <w:name w:val="Default Paragraph Font"/>
     <w:uiPriority w:val="1"/>
+    <w:semiHidden/>
     <w:unhideWhenUsed/>
   </w:style>
   <w:style w:type="table" w:default="1" w:styleId="TableauNormal">

</xml_diff>